<commit_message>
Simplify submission files and update IEEE paper
</commit_message>
<xml_diff>
--- a/reports/manuscript/early_cvd_ieee_lab_report.docx
+++ b/reports/manuscript/early_cvd_ieee_lab_report.docx
@@ -4,89 +4,104 @@
   <w:body>
     <w:p>
       <w:pPr>
-        <w:spacing w:after="60" w:line="240" w:lineRule="auto"/>
+        <w:spacing w:after="40" w:line="240" w:lineRule="auto"/>
         <w:jc w:val="center"/>
       </w:pPr>
       <w:r>
         <w:rPr>
-          <w:rFonts w:ascii="Times New Roman" w:hAnsi="Times New Roman"/>
+          <w:rFonts w:ascii="Times New Roman" w:hAnsi="Times New Roman" w:eastAsia="Times New Roman"/>
           <w:b/>
           <w:i w:val="0"/>
-          <w:sz w:val="36"/>
+          <w:sz w:val="30"/>
         </w:rPr>
-        <w:t>Early CVD Prediction: A Leakage-Audited and Site-Aware Machine Learning Study on Public Heart Disease Data</w:t>
+        <w:t>Early CVD Prediction: A Leakage-Audited Machine Learning Project for Heart Disease Prediction</w:t>
       </w:r>
     </w:p>
     <w:p>
       <w:pPr>
-        <w:spacing w:after="60" w:line="240" w:lineRule="auto"/>
+        <w:spacing w:after="40" w:line="240" w:lineRule="auto"/>
         <w:jc w:val="center"/>
       </w:pPr>
       <w:r>
         <w:rPr>
-          <w:rFonts w:ascii="Times New Roman" w:hAnsi="Times New Roman"/>
+          <w:rFonts w:ascii="Times New Roman" w:hAnsi="Times New Roman" w:eastAsia="Times New Roman"/>
           <w:b w:val="0"/>
           <w:i w:val="0"/>
           <w:sz w:val="20"/>
         </w:rPr>
         <w:t>Mahmud Rashik</w:t>
-        <w:br/>
-        <w:t>Department of Computer Science and Engineering</w:t>
-        <w:br/>
-        <w:t>Bangladesh University of Professionals</w:t>
-        <w:br/>
-        <w:t>Dhaka, Bangladesh</w:t>
       </w:r>
     </w:p>
     <w:p>
       <w:pPr>
-        <w:spacing w:before="120" w:after="60"/>
+        <w:spacing w:after="40" w:line="240" w:lineRule="auto"/>
+        <w:jc w:val="center"/>
       </w:pPr>
       <w:r>
         <w:rPr>
-          <w:rFonts w:ascii="Times New Roman" w:hAnsi="Times New Roman"/>
-          <w:b/>
+          <w:rFonts w:ascii="Times New Roman" w:hAnsi="Times New Roman" w:eastAsia="Times New Roman"/>
+          <w:b w:val="0"/>
           <w:i w:val="0"/>
-          <w:sz w:val="20"/>
+          <w:sz w:val="18"/>
         </w:rPr>
-        <w:t>ABSTRACT</w:t>
+        <w:t>Department of Computer Science and Engineering, Bangladesh University of Professionals, Dhaka, Bangladesh</w:t>
       </w:r>
     </w:p>
     <w:p>
       <w:pPr>
-        <w:spacing w:after="60" w:line="240" w:lineRule="auto"/>
+        <w:spacing w:after="40" w:line="240" w:lineRule="auto"/>
       </w:pPr>
       <w:r>
         <w:rPr>
-          <w:rFonts w:ascii="Times New Roman" w:hAnsi="Times New Roman"/>
-          <w:b w:val="0"/>
-          <w:i w:val="0"/>
-          <w:sz w:val="20"/>
+          <w:rFonts w:ascii="Times New Roman" w:hAnsi="Times New Roman" w:eastAsia="Times New Roman"/>
+          <w:b/>
         </w:rPr>
-        <w:t>Cardiovascular disease prediction is a common machine-learning laboratory problem, but many public-dataset studies rely on random train-test splits, duplicate-prone benchmark files, and limited calibration assessment. This project develops a reproducible early cardiovascular disease prediction system using public heart disease data while preserving and improving an existing neural-network notebook. The primary dataset was the UCI-style heart_disease_uci.csv file containing 920 records from four centers. The binary target was defined as absence of disease for num = 0 and presence of disease for num &gt; 0. The supplementary heart.csv file was audited separately and found to contain 1,025 rows with 723 exact duplicates, leaving 302 unique rows. The selected model was penalized logistic regression, which achieved mean held-out-center AUROC of 0.799, AUPRC of 0.880, Brier score of 0.168, and balanced accuracy of 0.745. The system is intended as a reproducible research and educational prototype, not as a clinically deployable diagnostic device.</w:t>
+        <w:t>Abstract?</w:t>
+      </w:r>
+      <w:r>
+        <w:rPr>
+          <w:rFonts w:ascii="Times New Roman" w:hAnsi="Times New Roman" w:eastAsia="Times New Roman"/>
+        </w:rPr>
+        <w:t xml:space="preserve"> Heart disease prediction is a common machine-learning laboratory problem, but public benchmark datasets can produce misleading results when duplicates, leakage, validation design, and calibration are not handled carefully. This project develops a reproducible early cardiovascular disease prediction workflow using the supplied UCI-style heart disease dataset and a secondary heart.csv benchmark. The primary dataset contained 920 records from 4 centers. The secondary heart.csv file contained 1025 rows but only 302 unique rows after exact deduplication. Candidate models included penalized logistic regression, random forest, gradient boosting, calibrated gradient boosting, and an MLP baseline. Penalized logistic regression was selected because it provided the best balance of calibration, interpretability, and site-aware validation performance, with mean AUROC 0.799, AUPRC 0.880, Brier score 0.168, and balanced accuracy 0.745. The project includes a notebook, figures, tables, tests, and a FastAPI localhost app. It is not a clinical diagnostic device.</w:t>
       </w:r>
     </w:p>
     <w:p>
       <w:pPr>
-        <w:spacing w:after="60" w:line="240" w:lineRule="auto"/>
+        <w:spacing w:after="40" w:line="240" w:lineRule="auto"/>
       </w:pPr>
       <w:r>
         <w:rPr>
-          <w:rFonts w:ascii="Times New Roman" w:hAnsi="Times New Roman"/>
-          <w:b w:val="0"/>
-          <w:i w:val="0"/>
-          <w:sz w:val="20"/>
+          <w:rFonts w:ascii="Times New Roman" w:hAnsi="Times New Roman" w:eastAsia="Times New Roman"/>
+          <w:b/>
         </w:rPr>
-        <w:t>Keywords: cardiovascular disease prediction, heart disease, machine learning, calibration, explainable AI, site-aware validation</w:t>
+        <w:t>Keywords?</w:t>
+      </w:r>
+      <w:r>
+        <w:rPr>
+          <w:rFonts w:ascii="Times New Roman" w:hAnsi="Times New Roman" w:eastAsia="Times New Roman"/>
+        </w:rPr>
+        <w:t xml:space="preserve"> cardiovascular disease prediction, heart disease, machine learning, calibration, explainable AI, site-aware validation</w:t>
       </w:r>
     </w:p>
     <w:p>
       <w:pPr>
-        <w:spacing w:before="120" w:after="60"/>
+        <w:spacing w:after="40" w:line="240" w:lineRule="auto"/>
+        <w:sectPr>
+          <w:pgSz w:w="11909" w:h="16834"/>
+          <w:pgMar w:top="936" w:right="936" w:bottom="936" w:left="936" w:header="720" w:footer="720" w:gutter="0"/>
+          <w:cols w:space="720"/>
+          <w:docGrid w:linePitch="360"/>
+        </w:sectPr>
+      </w:pPr>
+    </w:p>
+    <w:p>
+      <w:pPr>
+        <w:spacing w:after="40" w:line="240" w:lineRule="auto"/>
+        <w:jc w:val="center"/>
       </w:pPr>
       <w:r>
         <w:rPr>
-          <w:rFonts w:ascii="Times New Roman" w:hAnsi="Times New Roman"/>
+          <w:rFonts w:ascii="Times New Roman" w:hAnsi="Times New Roman" w:eastAsia="Times New Roman"/>
           <w:b/>
           <w:i w:val="0"/>
           <w:sz w:val="20"/>
@@ -96,39 +111,40 @@
     </w:p>
     <w:p>
       <w:pPr>
-        <w:spacing w:after="60" w:line="240" w:lineRule="auto"/>
+        <w:spacing w:after="40" w:line="240" w:lineRule="auto"/>
       </w:pPr>
       <w:r>
         <w:rPr>
-          <w:rFonts w:ascii="Times New Roman" w:hAnsi="Times New Roman"/>
+          <w:rFonts w:ascii="Times New Roman" w:hAnsi="Times New Roman" w:eastAsia="Times New Roman"/>
           <w:b w:val="0"/>
           <w:i w:val="0"/>
-          <w:sz w:val="20"/>
+          <w:sz w:val="18"/>
         </w:rPr>
-        <w:t>Early identification of cardiovascular disease risk is an important healthcare problem and a useful applied machine-learning task. Public heart disease datasets contain interpretable clinical variables such as age, chest pain type, resting blood pressure, cholesterol, exercise-induced angina, ST depression, and thalassemia-related findings. However, simple analyses can overstate performance if duplication, preprocessing leakage, target definition, and validation design are not handled carefully.</w:t>
+        <w:t>Early recognition of cardiovascular disease risk is clinically important and is also a practical machine-learning task because the available features are understandable: age, chest pain type, resting blood pressure, cholesterol, exercise-induced angina, ST depression, ST slope, major vessels, and thalassemia/stress-test category. The starting point of this work was an exploratory neural-network notebook. After auditing the notebook and datasets, the project was rebuilt as a reproducible prediction pipeline because the original workflow used a single random split and a different small heart.csv file.</w:t>
       </w:r>
     </w:p>
     <w:p>
       <w:pPr>
-        <w:spacing w:after="60" w:line="240" w:lineRule="auto"/>
+        <w:spacing w:after="40" w:line="240" w:lineRule="auto"/>
       </w:pPr>
       <w:r>
         <w:rPr>
-          <w:rFonts w:ascii="Times New Roman" w:hAnsi="Times New Roman"/>
+          <w:rFonts w:ascii="Times New Roman" w:hAnsi="Times New Roman" w:eastAsia="Times New Roman"/>
           <w:b w:val="0"/>
           <w:i w:val="0"/>
-          <w:sz w:val="20"/>
+          <w:sz w:val="18"/>
         </w:rPr>
-        <w:t>The starting point was an existing Jupyter notebook that trained feedforward neural networks. The notebook was useful as exploratory work, but it depended on a local 303-row heart.csv file and used a single random train-test split. The final project therefore reframed the work as a reproducible prediction-model study rather than a neural-network-only exercise.</w:t>
+        <w:t>The contribution of this project is a compact but complete ML workflow: data audit, duplicate analysis, leakage control, fold-contained preprocessing, site-aware validation, model comparison, calibration-aware model selection, explainability, and localhost deployment.</w:t>
       </w:r>
     </w:p>
     <w:p>
       <w:pPr>
-        <w:spacing w:before="120" w:after="60"/>
+        <w:spacing w:after="40" w:line="240" w:lineRule="auto"/>
+        <w:jc w:val="center"/>
       </w:pPr>
       <w:r>
         <w:rPr>
-          <w:rFonts w:ascii="Times New Roman" w:hAnsi="Times New Roman"/>
+          <w:rFonts w:ascii="Times New Roman" w:hAnsi="Times New Roman" w:eastAsia="Times New Roman"/>
           <w:b/>
           <w:i w:val="0"/>
           <w:sz w:val="20"/>
@@ -138,39 +154,26 @@
     </w:p>
     <w:p>
       <w:pPr>
-        <w:spacing w:after="60" w:line="240" w:lineRule="auto"/>
+        <w:spacing w:after="40" w:line="240" w:lineRule="auto"/>
       </w:pPr>
       <w:r>
         <w:rPr>
-          <w:rFonts w:ascii="Times New Roman" w:hAnsi="Times New Roman"/>
+          <w:rFonts w:ascii="Times New Roman" w:hAnsi="Times New Roman" w:eastAsia="Times New Roman"/>
           <w:b w:val="0"/>
           <w:i w:val="0"/>
-          <w:sz w:val="20"/>
+          <w:sz w:val="18"/>
         </w:rPr>
-        <w:t>Clinical prediction models should be evaluated not only by accuracy but also by discrimination, calibration, stability, and applicability. Reporting guidance such as TRIPOD+AI emphasizes transparent reporting of data sources, preprocessing, validation, model development, and limitations [1]. PROBAST+AI highlights the need to assess risk of bias and applicability in artificial-intelligence prediction-model studies [2].</w:t>
+        <w:t>Clinical prediction models should be judged by discrimination, calibration, stability, and interpretability rather than accuracy alone. TRIPOD+AI emphasizes transparent reporting of data sources, preprocessing, validation, and limitations for prediction models [1]. PROBAST+AI highlights risk of bias and applicability concerns in AI prediction studies [2]. Public UCI-style heart disease data are useful for reproducible learning, but they are small, historical, and not enough to claim clinical deployment readiness [3]. Explainability methods such as coefficient-based importance and SHAP-style summaries help check whether model behavior is plausible [5].</w:t>
       </w:r>
     </w:p>
     <w:p>
       <w:pPr>
-        <w:spacing w:after="60" w:line="240" w:lineRule="auto"/>
+        <w:spacing w:after="40" w:line="240" w:lineRule="auto"/>
+        <w:jc w:val="center"/>
       </w:pPr>
       <w:r>
         <w:rPr>
-          <w:rFonts w:ascii="Times New Roman" w:hAnsi="Times New Roman"/>
-          <w:b w:val="0"/>
-          <w:i w:val="0"/>
-          <w:sz w:val="20"/>
-        </w:rPr>
-        <w:t>The UCI heart disease data originate from historical coronary artery disease prediction research and have become common in machine-learning education [3]. Scikit-learn was used because it provides consistent APIs for preprocessing pipelines, cross-validation, model development, and evaluation [4]. Explainability was supported through model coefficients, global importance, and SHAP-style summaries [5].</w:t>
-      </w:r>
-    </w:p>
-    <w:p>
-      <w:pPr>
-        <w:spacing w:before="120" w:after="60"/>
-      </w:pPr>
-      <w:r>
-        <w:rPr>
-          <w:rFonts w:ascii="Times New Roman" w:hAnsi="Times New Roman"/>
+          <w:rFonts w:ascii="Times New Roman" w:hAnsi="Times New Roman" w:eastAsia="Times New Roman"/>
           <w:b/>
           <w:i w:val="0"/>
           <w:sz w:val="20"/>
@@ -180,109 +183,305 @@
     </w:p>
     <w:p>
       <w:pPr>
-        <w:spacing w:before="80" w:after="40"/>
+        <w:spacing w:after="40" w:line="240" w:lineRule="auto"/>
       </w:pPr>
       <w:r>
         <w:rPr>
-          <w:rFonts w:ascii="Times New Roman" w:hAnsi="Times New Roman"/>
-          <w:b/>
+          <w:rFonts w:ascii="Times New Roman" w:hAnsi="Times New Roman" w:eastAsia="Times New Roman"/>
+          <w:b w:val="0"/>
           <w:i w:val="0"/>
-          <w:sz w:val="20"/>
+          <w:sz w:val="18"/>
         </w:rPr>
-        <w:t>A. Data Sources and Target</w:t>
+        <w:t>The primary dataset was heart_disease_uci.csv. The target was converted to a binary label: 0 for no recorded disease and 1 for disease when num &gt; 0. The center/source variable was used for validation grouping and was not used as a predictor. The secondary heart.csv file was treated as supplementary only because it contained exact duplicate rows.</w:t>
       </w:r>
     </w:p>
     <w:p>
       <w:pPr>
-        <w:spacing w:after="60" w:line="240" w:lineRule="auto"/>
+        <w:spacing w:after="40" w:line="240" w:lineRule="auto"/>
       </w:pPr>
       <w:r>
         <w:rPr>
-          <w:rFonts w:ascii="Times New Roman" w:hAnsi="Times New Roman"/>
+          <w:rFonts w:ascii="Times New Roman" w:hAnsi="Times New Roman" w:eastAsia="Times New Roman"/>
           <w:b w:val="0"/>
           <w:i w:val="0"/>
-          <w:sz w:val="20"/>
+          <w:sz w:val="18"/>
         </w:rPr>
-        <w:t>Three source materials were audited: the original neural-network notebook, heart_disease_uci.csv, and heart.csv. The primary research dataset was heart_disease_uci.csv, containing 920 records from Cleveland, Hungary, Switzerland, and VA Long Beach. The binary target was target_binary = 0 for num = 0 and target_binary = 1 for num &gt; 0. The secondary heart.csv file was used only for supplementary sensitivity analysis because it contained 723 exact duplicate rows.</w:t>
+        <w:t>Numeric predictors were median-imputed and standardized. Categorical predictors were most-frequent-imputed and one-hot encoded. All preprocessing was placed inside scikit-learn pipelines. The main validation was leave-one-center-out internal-external validation: one center was held out, models were selected using the remaining centers, and performance was measured on the held-out center.</w:t>
       </w:r>
     </w:p>
     <w:p>
       <w:pPr>
-        <w:spacing w:before="80" w:after="40"/>
+        <w:spacing w:after="40" w:line="240" w:lineRule="auto"/>
+        <w:jc w:val="center"/>
       </w:pPr>
       <w:r>
         <w:rPr>
-          <w:rFonts w:ascii="Times New Roman" w:hAnsi="Times New Roman"/>
-          <w:b/>
+          <w:rFonts w:ascii="Times New Roman" w:hAnsi="Times New Roman" w:eastAsia="Times New Roman"/>
+          <w:b w:val="0"/>
+          <w:i/>
+          <w:sz w:val="16"/>
+        </w:rPr>
+        <w:t>Table I. Dataset Audit Summary</w:t>
+      </w:r>
+    </w:p>
+    <w:tbl>
+      <w:tblPr>
+        <w:tblStyle w:val="TableGrid"/>
+        <w:tblW w:type="auto" w:w="0"/>
+        <w:jc w:val="center"/>
+        <w:tblLook w:firstColumn="1" w:firstRow="1" w:lastColumn="0" w:lastRow="0" w:noHBand="0" w:noVBand="1" w:val="04A0"/>
+      </w:tblPr>
+      <w:tblGrid>
+        <w:gridCol w:w="2509"/>
+        <w:gridCol w:w="2509"/>
+        <w:gridCol w:w="2509"/>
+        <w:gridCol w:w="2509"/>
+      </w:tblGrid>
+      <w:tr>
+        <w:tc>
+          <w:tcPr>
+            <w:tcW w:type="dxa" w:w="2509"/>
+            <w:vAlign w:val="center"/>
+          </w:tcPr>
+          <w:p>
+            <w:pPr>
+              <w:jc w:val="center"/>
+            </w:pPr>
+            <w:r>
+              <w:rPr>
+                <w:rFonts w:ascii="Times New Roman" w:hAnsi="Times New Roman"/>
+                <w:sz w:val="14"/>
+              </w:rPr>
+              <w:t>Dataset</w:t>
+            </w:r>
+          </w:p>
+        </w:tc>
+        <w:tc>
+          <w:tcPr>
+            <w:tcW w:type="dxa" w:w="2509"/>
+            <w:vAlign w:val="center"/>
+          </w:tcPr>
+          <w:p>
+            <w:pPr>
+              <w:jc w:val="center"/>
+            </w:pPr>
+            <w:r>
+              <w:rPr>
+                <w:rFonts w:ascii="Times New Roman" w:hAnsi="Times New Roman"/>
+                <w:sz w:val="14"/>
+              </w:rPr>
+              <w:t>Role</w:t>
+            </w:r>
+          </w:p>
+        </w:tc>
+        <w:tc>
+          <w:tcPr>
+            <w:tcW w:type="dxa" w:w="2509"/>
+            <w:vAlign w:val="center"/>
+          </w:tcPr>
+          <w:p>
+            <w:pPr>
+              <w:jc w:val="center"/>
+            </w:pPr>
+            <w:r>
+              <w:rPr>
+                <w:rFonts w:ascii="Times New Roman" w:hAnsi="Times New Roman"/>
+                <w:sz w:val="14"/>
+              </w:rPr>
+              <w:t>Rows</w:t>
+            </w:r>
+          </w:p>
+        </w:tc>
+        <w:tc>
+          <w:tcPr>
+            <w:tcW w:type="dxa" w:w="2509"/>
+            <w:vAlign w:val="center"/>
+          </w:tcPr>
+          <w:p>
+            <w:pPr>
+              <w:jc w:val="center"/>
+            </w:pPr>
+            <w:r>
+              <w:rPr>
+                <w:rFonts w:ascii="Times New Roman" w:hAnsi="Times New Roman"/>
+                <w:sz w:val="14"/>
+              </w:rPr>
+              <w:t>Key finding</w:t>
+            </w:r>
+          </w:p>
+        </w:tc>
+      </w:tr>
+      <w:tr>
+        <w:tc>
+          <w:tcPr>
+            <w:tcW w:type="dxa" w:w="2509"/>
+            <w:vAlign w:val="center"/>
+          </w:tcPr>
+          <w:p>
+            <w:pPr>
+              <w:jc w:val="center"/>
+            </w:pPr>
+            <w:r>
+              <w:rPr>
+                <w:rFonts w:ascii="Times New Roman" w:hAnsi="Times New Roman"/>
+                <w:sz w:val="14"/>
+              </w:rPr>
+              <w:t>heart_disease_uci.csv</w:t>
+            </w:r>
+          </w:p>
+        </w:tc>
+        <w:tc>
+          <w:tcPr>
+            <w:tcW w:type="dxa" w:w="2509"/>
+            <w:vAlign w:val="center"/>
+          </w:tcPr>
+          <w:p>
+            <w:pPr>
+              <w:jc w:val="center"/>
+            </w:pPr>
+            <w:r>
+              <w:rPr>
+                <w:rFonts w:ascii="Times New Roman" w:hAnsi="Times New Roman"/>
+                <w:sz w:val="14"/>
+              </w:rPr>
+              <w:t>Primary</w:t>
+            </w:r>
+          </w:p>
+        </w:tc>
+        <w:tc>
+          <w:tcPr>
+            <w:tcW w:type="dxa" w:w="2509"/>
+            <w:vAlign w:val="center"/>
+          </w:tcPr>
+          <w:p>
+            <w:pPr>
+              <w:jc w:val="center"/>
+            </w:pPr>
+            <w:r>
+              <w:rPr>
+                <w:rFonts w:ascii="Times New Roman" w:hAnsi="Times New Roman"/>
+                <w:sz w:val="14"/>
+              </w:rPr>
+              <w:t>920</w:t>
+            </w:r>
+          </w:p>
+        </w:tc>
+        <w:tc>
+          <w:tcPr>
+            <w:tcW w:type="dxa" w:w="2509"/>
+            <w:vAlign w:val="center"/>
+          </w:tcPr>
+          <w:p>
+            <w:pPr>
+              <w:jc w:val="center"/>
+            </w:pPr>
+            <w:r>
+              <w:rPr>
+                <w:rFonts w:ascii="Times New Roman" w:hAnsi="Times New Roman"/>
+                <w:sz w:val="14"/>
+              </w:rPr>
+              <w:t>4 centers; 411 absent, 509 present</w:t>
+            </w:r>
+          </w:p>
+        </w:tc>
+      </w:tr>
+      <w:tr>
+        <w:tc>
+          <w:tcPr>
+            <w:tcW w:type="dxa" w:w="2509"/>
+            <w:vAlign w:val="center"/>
+          </w:tcPr>
+          <w:p>
+            <w:pPr>
+              <w:jc w:val="center"/>
+            </w:pPr>
+            <w:r>
+              <w:rPr>
+                <w:rFonts w:ascii="Times New Roman" w:hAnsi="Times New Roman"/>
+                <w:sz w:val="14"/>
+              </w:rPr>
+              <w:t>heart.csv</w:t>
+            </w:r>
+          </w:p>
+        </w:tc>
+        <w:tc>
+          <w:tcPr>
+            <w:tcW w:type="dxa" w:w="2509"/>
+            <w:vAlign w:val="center"/>
+          </w:tcPr>
+          <w:p>
+            <w:pPr>
+              <w:jc w:val="center"/>
+            </w:pPr>
+            <w:r>
+              <w:rPr>
+                <w:rFonts w:ascii="Times New Roman" w:hAnsi="Times New Roman"/>
+                <w:sz w:val="14"/>
+              </w:rPr>
+              <w:t>Supplementary</w:t>
+            </w:r>
+          </w:p>
+        </w:tc>
+        <w:tc>
+          <w:tcPr>
+            <w:tcW w:type="dxa" w:w="2509"/>
+            <w:vAlign w:val="center"/>
+          </w:tcPr>
+          <w:p>
+            <w:pPr>
+              <w:jc w:val="center"/>
+            </w:pPr>
+            <w:r>
+              <w:rPr>
+                <w:rFonts w:ascii="Times New Roman" w:hAnsi="Times New Roman"/>
+                <w:sz w:val="14"/>
+              </w:rPr>
+              <w:t>1025</w:t>
+            </w:r>
+          </w:p>
+        </w:tc>
+        <w:tc>
+          <w:tcPr>
+            <w:tcW w:type="dxa" w:w="2509"/>
+            <w:vAlign w:val="center"/>
+          </w:tcPr>
+          <w:p>
+            <w:pPr>
+              <w:jc w:val="center"/>
+            </w:pPr>
+            <w:r>
+              <w:rPr>
+                <w:rFonts w:ascii="Times New Roman" w:hAnsi="Times New Roman"/>
+                <w:sz w:val="14"/>
+              </w:rPr>
+              <w:t>723 duplicates; 302 unique rows</w:t>
+            </w:r>
+          </w:p>
+        </w:tc>
+      </w:tr>
+    </w:tbl>
+    <w:p>
+      <w:pPr>
+        <w:spacing w:after="40" w:line="240" w:lineRule="auto"/>
+      </w:pPr>
+      <w:r>
+        <w:rPr>
+          <w:rFonts w:ascii="Times New Roman" w:hAnsi="Times New Roman" w:eastAsia="Times New Roman"/>
+          <w:b w:val="0"/>
           <w:i w:val="0"/>
-          <w:sz w:val="20"/>
+          <w:sz w:val="18"/>
         </w:rPr>
-        <w:t>B. Preprocessing and Validation</w:t>
+        <w:t>Missingness was substantial for several predictors, especially ca 66.4%, thal 52.8%, slope 33.6%, fbs 9.8%, oldpeak 6.7%. This supported fold-contained imputation.</w:t>
       </w:r>
     </w:p>
     <w:p>
       <w:pPr>
-        <w:spacing w:after="60" w:line="240" w:lineRule="auto"/>
+        <w:spacing w:after="40" w:line="240" w:lineRule="auto"/>
+        <w:jc w:val="center"/>
       </w:pPr>
       <w:r>
         <w:rPr>
-          <w:rFonts w:ascii="Times New Roman" w:hAnsi="Times New Roman"/>
-          <w:b w:val="0"/>
-          <w:i w:val="0"/>
-          <w:sz w:val="20"/>
-        </w:rPr>
-        <w:t>The canonical features included age, sex, chest pain type, resting blood pressure, cholesterol, fasting blood sugar, resting ECG, maximum heart rate, exercise-induced angina, oldpeak, ST slope, number of major vessels, and thalassemia/stress-test defect category. The center variable was used only for validation grouping and was not used as a predictor. Numeric features were median-imputed and standardized. Categorical features were imputed using the most frequent value and one-hot encoded. All preprocessing was fitted inside training folds only.</w:t>
-      </w:r>
-    </w:p>
-    <w:p>
-      <w:pPr>
-        <w:spacing w:after="60" w:line="240" w:lineRule="auto"/>
-      </w:pPr>
-      <w:r>
-        <w:rPr>
-          <w:rFonts w:ascii="Times New Roman" w:hAnsi="Times New Roman"/>
-          <w:b w:val="0"/>
-          <w:i w:val="0"/>
-          <w:sz w:val="20"/>
-        </w:rPr>
-        <w:t>The main validation used leave-one-center-out internal-external validation. In each outer fold, one center was held out for testing while the remaining centers were used for model development and hyperparameter selection.</w:t>
-      </w:r>
-    </w:p>
-    <w:p>
-      <w:pPr>
-        <w:spacing w:before="80" w:after="40"/>
-      </w:pPr>
-      <w:r>
-        <w:rPr>
-          <w:rFonts w:ascii="Times New Roman" w:hAnsi="Times New Roman"/>
-          <w:b/>
-          <w:i w:val="0"/>
-          <w:sz w:val="20"/>
-        </w:rPr>
-        <w:t>C. Candidate Models</w:t>
-      </w:r>
-    </w:p>
-    <w:p>
-      <w:pPr>
-        <w:spacing w:after="60" w:line="240" w:lineRule="auto"/>
-      </w:pPr>
-      <w:r>
-        <w:rPr>
-          <w:rFonts w:ascii="Times New Roman" w:hAnsi="Times New Roman"/>
-          <w:b w:val="0"/>
-          <w:i w:val="0"/>
-          <w:sz w:val="20"/>
-        </w:rPr>
-        <w:t>The compared models were penalized logistic regression, random forest, gradient boosting, calibrated gradient boosting, and a multilayer perceptron baseline preserving the original notebook idea. Final selection considered AUROC, AUPRC, Brier score, calibration slope, MCC, stability, and interpretability.</w:t>
-      </w:r>
-    </w:p>
-    <w:p>
-      <w:pPr>
-        <w:spacing w:before="120" w:after="60"/>
-      </w:pPr>
-      <w:r>
-        <w:rPr>
-          <w:rFonts w:ascii="Times New Roman" w:hAnsi="Times New Roman"/>
+          <w:rFonts w:ascii="Times New Roman" w:hAnsi="Times New Roman" w:eastAsia="Times New Roman"/>
           <w:b/>
           <w:i w:val="0"/>
           <w:sz w:val="20"/>
@@ -292,25 +491,26 @@
     </w:p>
     <w:p>
       <w:pPr>
-        <w:spacing w:after="60" w:line="240" w:lineRule="auto"/>
+        <w:spacing w:after="40" w:line="240" w:lineRule="auto"/>
       </w:pPr>
       <w:r>
         <w:rPr>
-          <w:rFonts w:ascii="Times New Roman" w:hAnsi="Times New Roman"/>
+          <w:rFonts w:ascii="Times New Roman" w:hAnsi="Times New Roman" w:eastAsia="Times New Roman"/>
           <w:b w:val="0"/>
           <w:i w:val="0"/>
-          <w:sz w:val="20"/>
+          <w:sz w:val="18"/>
         </w:rPr>
-        <w:t>The experiment pipeline generated data audits, model comparison tables, center-wise metrics, threshold analysis, bootstrap confidence intervals, plots, model metadata, and a serialized model bundle. The primary dataset contained 411 records without heart disease and 509 with heart disease. Missingness was substantial for ca (66.4%), thal (52.8%), and slope (33.6%), supporting fold-contained imputation and cautious interpretation.</w:t>
+        <w:t>Five model families were compared: penalized logistic regression, random forest, gradient boosting, calibrated gradient boosting, and an MLP baseline. Hyperparameter selection was performed only within development centers for each outer fold. Evaluation included AUROC, AUPRC, balanced accuracy, sensitivity, specificity, PPV, NPV, F1, MCC, Brier score, calibration slope/intercept, bootstrap confidence intervals, ROC curves, PR curves, calibration plots, threshold analysis, and explanation outputs.</w:t>
       </w:r>
     </w:p>
     <w:p>
       <w:pPr>
-        <w:spacing w:before="120" w:after="60"/>
+        <w:spacing w:after="40" w:line="240" w:lineRule="auto"/>
+        <w:jc w:val="center"/>
       </w:pPr>
       <w:r>
         <w:rPr>
-          <w:rFonts w:ascii="Times New Roman" w:hAnsi="Times New Roman"/>
+          <w:rFonts w:ascii="Times New Roman" w:hAnsi="Times New Roman" w:eastAsia="Times New Roman"/>
           <w:b/>
           <w:i w:val="0"/>
           <w:sz w:val="20"/>
@@ -320,45 +520,48 @@
     </w:p>
     <w:p>
       <w:pPr>
-        <w:spacing w:after="80"/>
+        <w:spacing w:after="40" w:line="240" w:lineRule="auto"/>
         <w:jc w:val="center"/>
       </w:pPr>
       <w:r>
         <w:rPr>
-          <w:rFonts w:ascii="Times New Roman" w:hAnsi="Times New Roman"/>
-          <w:b/>
-          <w:i w:val="0"/>
-          <w:sz w:val="18"/>
+          <w:rFonts w:ascii="Times New Roman" w:hAnsi="Times New Roman" w:eastAsia="Times New Roman"/>
+          <w:b w:val="0"/>
+          <w:i/>
+          <w:sz w:val="16"/>
         </w:rPr>
-        <w:t>TABLE I. Primary Model Comparison</w:t>
+        <w:t>Table II. Primary Model Comparison</w:t>
       </w:r>
     </w:p>
     <w:tbl>
       <w:tblPr>
         <w:tblStyle w:val="TableGrid"/>
         <w:tblW w:type="auto" w:w="0"/>
+        <w:jc w:val="center"/>
         <w:tblLook w:firstColumn="1" w:firstRow="1" w:lastColumn="0" w:lastRow="0" w:noHBand="0" w:noVBand="1" w:val="04A0"/>
       </w:tblPr>
       <w:tblGrid>
-        <w:gridCol w:w="1738"/>
-        <w:gridCol w:w="1738"/>
-        <w:gridCol w:w="1738"/>
-        <w:gridCol w:w="1738"/>
-        <w:gridCol w:w="1738"/>
-        <w:gridCol w:w="1738"/>
+        <w:gridCol w:w="1673"/>
+        <w:gridCol w:w="1673"/>
+        <w:gridCol w:w="1673"/>
+        <w:gridCol w:w="1673"/>
+        <w:gridCol w:w="1673"/>
+        <w:gridCol w:w="1673"/>
       </w:tblGrid>
       <w:tr>
         <w:tc>
           <w:tcPr>
-            <w:tcW w:type="dxa" w:w="1738"/>
+            <w:tcW w:type="dxa" w:w="1673"/>
+            <w:vAlign w:val="center"/>
           </w:tcPr>
           <w:p>
+            <w:pPr>
+              <w:jc w:val="center"/>
+            </w:pPr>
             <w:r>
               <w:rPr>
                 <w:rFonts w:ascii="Times New Roman" w:hAnsi="Times New Roman"/>
-                <w:b w:val="0"/>
-                <w:i w:val="0"/>
-                <w:sz w:val="16"/>
+                <w:sz w:val="14"/>
               </w:rPr>
               <w:t>Model</w:t>
             </w:r>
@@ -366,15 +569,17 @@
         </w:tc>
         <w:tc>
           <w:tcPr>
-            <w:tcW w:type="dxa" w:w="1738"/>
+            <w:tcW w:type="dxa" w:w="1673"/>
+            <w:vAlign w:val="center"/>
           </w:tcPr>
           <w:p>
+            <w:pPr>
+              <w:jc w:val="center"/>
+            </w:pPr>
             <w:r>
               <w:rPr>
                 <w:rFonts w:ascii="Times New Roman" w:hAnsi="Times New Roman"/>
-                <w:b w:val="0"/>
-                <w:i w:val="0"/>
-                <w:sz w:val="16"/>
+                <w:sz w:val="14"/>
               </w:rPr>
               <w:t>AUROC</w:t>
             </w:r>
@@ -382,15 +587,17 @@
         </w:tc>
         <w:tc>
           <w:tcPr>
-            <w:tcW w:type="dxa" w:w="1738"/>
+            <w:tcW w:type="dxa" w:w="1673"/>
+            <w:vAlign w:val="center"/>
           </w:tcPr>
           <w:p>
+            <w:pPr>
+              <w:jc w:val="center"/>
+            </w:pPr>
             <w:r>
               <w:rPr>
                 <w:rFonts w:ascii="Times New Roman" w:hAnsi="Times New Roman"/>
-                <w:b w:val="0"/>
-                <w:i w:val="0"/>
-                <w:sz w:val="16"/>
+                <w:sz w:val="14"/>
               </w:rPr>
               <w:t>AUPRC</w:t>
             </w:r>
@@ -398,15 +605,17 @@
         </w:tc>
         <w:tc>
           <w:tcPr>
-            <w:tcW w:type="dxa" w:w="1738"/>
+            <w:tcW w:type="dxa" w:w="1673"/>
+            <w:vAlign w:val="center"/>
           </w:tcPr>
           <w:p>
+            <w:pPr>
+              <w:jc w:val="center"/>
+            </w:pPr>
             <w:r>
               <w:rPr>
                 <w:rFonts w:ascii="Times New Roman" w:hAnsi="Times New Roman"/>
-                <w:b w:val="0"/>
-                <w:i w:val="0"/>
-                <w:sz w:val="16"/>
+                <w:sz w:val="14"/>
               </w:rPr>
               <w:t>Brier</w:t>
             </w:r>
@@ -414,15 +623,17 @@
         </w:tc>
         <w:tc>
           <w:tcPr>
-            <w:tcW w:type="dxa" w:w="1738"/>
+            <w:tcW w:type="dxa" w:w="1673"/>
+            <w:vAlign w:val="center"/>
           </w:tcPr>
           <w:p>
+            <w:pPr>
+              <w:jc w:val="center"/>
+            </w:pPr>
             <w:r>
               <w:rPr>
                 <w:rFonts w:ascii="Times New Roman" w:hAnsi="Times New Roman"/>
-                <w:b w:val="0"/>
-                <w:i w:val="0"/>
-                <w:sz w:val="16"/>
+                <w:sz w:val="14"/>
               </w:rPr>
               <w:t>Bal. Acc.</w:t>
             </w:r>
@@ -430,15 +641,17 @@
         </w:tc>
         <w:tc>
           <w:tcPr>
-            <w:tcW w:type="dxa" w:w="1738"/>
+            <w:tcW w:type="dxa" w:w="1673"/>
+            <w:vAlign w:val="center"/>
           </w:tcPr>
           <w:p>
+            <w:pPr>
+              <w:jc w:val="center"/>
+            </w:pPr>
             <w:r>
               <w:rPr>
                 <w:rFonts w:ascii="Times New Roman" w:hAnsi="Times New Roman"/>
-                <w:b w:val="0"/>
-                <w:i w:val="0"/>
-                <w:sz w:val="16"/>
+                <w:sz w:val="14"/>
               </w:rPr>
               <w:t>MCC</w:t>
             </w:r>
@@ -448,15 +661,17 @@
       <w:tr>
         <w:tc>
           <w:tcPr>
-            <w:tcW w:type="dxa" w:w="1738"/>
+            <w:tcW w:type="dxa" w:w="1673"/>
+            <w:vAlign w:val="center"/>
           </w:tcPr>
           <w:p>
+            <w:pPr>
+              <w:jc w:val="center"/>
+            </w:pPr>
             <w:r>
               <w:rPr>
                 <w:rFonts w:ascii="Times New Roman" w:hAnsi="Times New Roman"/>
-                <w:b w:val="0"/>
-                <w:i w:val="0"/>
-                <w:sz w:val="16"/>
+                <w:sz w:val="14"/>
               </w:rPr>
               <w:t>Logistic regression</w:t>
             </w:r>
@@ -464,15 +679,17 @@
         </w:tc>
         <w:tc>
           <w:tcPr>
-            <w:tcW w:type="dxa" w:w="1738"/>
+            <w:tcW w:type="dxa" w:w="1673"/>
+            <w:vAlign w:val="center"/>
           </w:tcPr>
           <w:p>
+            <w:pPr>
+              <w:jc w:val="center"/>
+            </w:pPr>
             <w:r>
               <w:rPr>
                 <w:rFonts w:ascii="Times New Roman" w:hAnsi="Times New Roman"/>
-                <w:b w:val="0"/>
-                <w:i w:val="0"/>
-                <w:sz w:val="16"/>
+                <w:sz w:val="14"/>
               </w:rPr>
               <w:t>0.799</w:t>
             </w:r>
@@ -480,15 +697,17 @@
         </w:tc>
         <w:tc>
           <w:tcPr>
-            <w:tcW w:type="dxa" w:w="1738"/>
+            <w:tcW w:type="dxa" w:w="1673"/>
+            <w:vAlign w:val="center"/>
           </w:tcPr>
           <w:p>
+            <w:pPr>
+              <w:jc w:val="center"/>
+            </w:pPr>
             <w:r>
               <w:rPr>
                 <w:rFonts w:ascii="Times New Roman" w:hAnsi="Times New Roman"/>
-                <w:b w:val="0"/>
-                <w:i w:val="0"/>
-                <w:sz w:val="16"/>
+                <w:sz w:val="14"/>
               </w:rPr>
               <w:t>0.880</w:t>
             </w:r>
@@ -496,15 +715,17 @@
         </w:tc>
         <w:tc>
           <w:tcPr>
-            <w:tcW w:type="dxa" w:w="1738"/>
+            <w:tcW w:type="dxa" w:w="1673"/>
+            <w:vAlign w:val="center"/>
           </w:tcPr>
           <w:p>
+            <w:pPr>
+              <w:jc w:val="center"/>
+            </w:pPr>
             <w:r>
               <w:rPr>
                 <w:rFonts w:ascii="Times New Roman" w:hAnsi="Times New Roman"/>
-                <w:b w:val="0"/>
-                <w:i w:val="0"/>
-                <w:sz w:val="16"/>
+                <w:sz w:val="14"/>
               </w:rPr>
               <w:t>0.168</w:t>
             </w:r>
@@ -512,15 +733,17 @@
         </w:tc>
         <w:tc>
           <w:tcPr>
-            <w:tcW w:type="dxa" w:w="1738"/>
+            <w:tcW w:type="dxa" w:w="1673"/>
+            <w:vAlign w:val="center"/>
           </w:tcPr>
           <w:p>
+            <w:pPr>
+              <w:jc w:val="center"/>
+            </w:pPr>
             <w:r>
               <w:rPr>
                 <w:rFonts w:ascii="Times New Roman" w:hAnsi="Times New Roman"/>
-                <w:b w:val="0"/>
-                <w:i w:val="0"/>
-                <w:sz w:val="16"/>
+                <w:sz w:val="14"/>
               </w:rPr>
               <w:t>0.745</w:t>
             </w:r>
@@ -528,15 +751,17 @@
         </w:tc>
         <w:tc>
           <w:tcPr>
-            <w:tcW w:type="dxa" w:w="1738"/>
+            <w:tcW w:type="dxa" w:w="1673"/>
+            <w:vAlign w:val="center"/>
           </w:tcPr>
           <w:p>
+            <w:pPr>
+              <w:jc w:val="center"/>
+            </w:pPr>
             <w:r>
               <w:rPr>
                 <w:rFonts w:ascii="Times New Roman" w:hAnsi="Times New Roman"/>
-                <w:b w:val="0"/>
-                <w:i w:val="0"/>
-                <w:sz w:val="16"/>
+                <w:sz w:val="14"/>
               </w:rPr>
               <w:t>0.441</w:t>
             </w:r>
@@ -546,31 +771,35 @@
       <w:tr>
         <w:tc>
           <w:tcPr>
-            <w:tcW w:type="dxa" w:w="1738"/>
+            <w:tcW w:type="dxa" w:w="1673"/>
+            <w:vAlign w:val="center"/>
           </w:tcPr>
           <w:p>
+            <w:pPr>
+              <w:jc w:val="center"/>
+            </w:pPr>
             <w:r>
               <w:rPr>
                 <w:rFonts w:ascii="Times New Roman" w:hAnsi="Times New Roman"/>
-                <w:b w:val="0"/>
-                <w:i w:val="0"/>
-                <w:sz w:val="16"/>
+                <w:sz w:val="14"/>
               </w:rPr>
-              <w:t>Calibrated boosting</w:t>
+              <w:t>Calibrated gradient boosting</w:t>
             </w:r>
           </w:p>
         </w:tc>
         <w:tc>
           <w:tcPr>
-            <w:tcW w:type="dxa" w:w="1738"/>
+            <w:tcW w:type="dxa" w:w="1673"/>
+            <w:vAlign w:val="center"/>
           </w:tcPr>
           <w:p>
+            <w:pPr>
+              <w:jc w:val="center"/>
+            </w:pPr>
             <w:r>
               <w:rPr>
                 <w:rFonts w:ascii="Times New Roman" w:hAnsi="Times New Roman"/>
-                <w:b w:val="0"/>
-                <w:i w:val="0"/>
-                <w:sz w:val="16"/>
+                <w:sz w:val="14"/>
               </w:rPr>
               <w:t>0.809</w:t>
             </w:r>
@@ -578,15 +807,17 @@
         </w:tc>
         <w:tc>
           <w:tcPr>
-            <w:tcW w:type="dxa" w:w="1738"/>
+            <w:tcW w:type="dxa" w:w="1673"/>
+            <w:vAlign w:val="center"/>
           </w:tcPr>
           <w:p>
+            <w:pPr>
+              <w:jc w:val="center"/>
+            </w:pPr>
             <w:r>
               <w:rPr>
                 <w:rFonts w:ascii="Times New Roman" w:hAnsi="Times New Roman"/>
-                <w:b w:val="0"/>
-                <w:i w:val="0"/>
-                <w:sz w:val="16"/>
+                <w:sz w:val="14"/>
               </w:rPr>
               <w:t>0.877</w:t>
             </w:r>
@@ -594,15 +825,17 @@
         </w:tc>
         <w:tc>
           <w:tcPr>
-            <w:tcW w:type="dxa" w:w="1738"/>
+            <w:tcW w:type="dxa" w:w="1673"/>
+            <w:vAlign w:val="center"/>
           </w:tcPr>
           <w:p>
+            <w:pPr>
+              <w:jc w:val="center"/>
+            </w:pPr>
             <w:r>
               <w:rPr>
                 <w:rFonts w:ascii="Times New Roman" w:hAnsi="Times New Roman"/>
-                <w:b w:val="0"/>
-                <w:i w:val="0"/>
-                <w:sz w:val="16"/>
+                <w:sz w:val="14"/>
               </w:rPr>
               <w:t>0.174</w:t>
             </w:r>
@@ -610,15 +843,17 @@
         </w:tc>
         <w:tc>
           <w:tcPr>
-            <w:tcW w:type="dxa" w:w="1738"/>
+            <w:tcW w:type="dxa" w:w="1673"/>
+            <w:vAlign w:val="center"/>
           </w:tcPr>
           <w:p>
+            <w:pPr>
+              <w:jc w:val="center"/>
+            </w:pPr>
             <w:r>
               <w:rPr>
                 <w:rFonts w:ascii="Times New Roman" w:hAnsi="Times New Roman"/>
-                <w:b w:val="0"/>
-                <w:i w:val="0"/>
-                <w:sz w:val="16"/>
+                <w:sz w:val="14"/>
               </w:rPr>
               <w:t>0.714</w:t>
             </w:r>
@@ -626,15 +861,17 @@
         </w:tc>
         <w:tc>
           <w:tcPr>
-            <w:tcW w:type="dxa" w:w="1738"/>
+            <w:tcW w:type="dxa" w:w="1673"/>
+            <w:vAlign w:val="center"/>
           </w:tcPr>
           <w:p>
+            <w:pPr>
+              <w:jc w:val="center"/>
+            </w:pPr>
             <w:r>
               <w:rPr>
                 <w:rFonts w:ascii="Times New Roman" w:hAnsi="Times New Roman"/>
-                <w:b w:val="0"/>
-                <w:i w:val="0"/>
-                <w:sz w:val="16"/>
+                <w:sz w:val="14"/>
               </w:rPr>
               <w:t>0.385</w:t>
             </w:r>
@@ -644,15 +881,17 @@
       <w:tr>
         <w:tc>
           <w:tcPr>
-            <w:tcW w:type="dxa" w:w="1738"/>
+            <w:tcW w:type="dxa" w:w="1673"/>
+            <w:vAlign w:val="center"/>
           </w:tcPr>
           <w:p>
+            <w:pPr>
+              <w:jc w:val="center"/>
+            </w:pPr>
             <w:r>
               <w:rPr>
                 <w:rFonts w:ascii="Times New Roman" w:hAnsi="Times New Roman"/>
-                <w:b w:val="0"/>
-                <w:i w:val="0"/>
-                <w:sz w:val="16"/>
+                <w:sz w:val="14"/>
               </w:rPr>
               <w:t>Random forest</w:t>
             </w:r>
@@ -660,15 +899,17 @@
         </w:tc>
         <w:tc>
           <w:tcPr>
-            <w:tcW w:type="dxa" w:w="1738"/>
+            <w:tcW w:type="dxa" w:w="1673"/>
+            <w:vAlign w:val="center"/>
           </w:tcPr>
           <w:p>
+            <w:pPr>
+              <w:jc w:val="center"/>
+            </w:pPr>
             <w:r>
               <w:rPr>
                 <w:rFonts w:ascii="Times New Roman" w:hAnsi="Times New Roman"/>
-                <w:b w:val="0"/>
-                <w:i w:val="0"/>
-                <w:sz w:val="16"/>
+                <w:sz w:val="14"/>
               </w:rPr>
               <w:t>0.800</w:t>
             </w:r>
@@ -676,15 +917,17 @@
         </w:tc>
         <w:tc>
           <w:tcPr>
-            <w:tcW w:type="dxa" w:w="1738"/>
+            <w:tcW w:type="dxa" w:w="1673"/>
+            <w:vAlign w:val="center"/>
           </w:tcPr>
           <w:p>
+            <w:pPr>
+              <w:jc w:val="center"/>
+            </w:pPr>
             <w:r>
               <w:rPr>
                 <w:rFonts w:ascii="Times New Roman" w:hAnsi="Times New Roman"/>
-                <w:b w:val="0"/>
-                <w:i w:val="0"/>
-                <w:sz w:val="16"/>
+                <w:sz w:val="14"/>
               </w:rPr>
               <w:t>0.873</w:t>
             </w:r>
@@ -692,15 +935,17 @@
         </w:tc>
         <w:tc>
           <w:tcPr>
-            <w:tcW w:type="dxa" w:w="1738"/>
+            <w:tcW w:type="dxa" w:w="1673"/>
+            <w:vAlign w:val="center"/>
           </w:tcPr>
           <w:p>
+            <w:pPr>
+              <w:jc w:val="center"/>
+            </w:pPr>
             <w:r>
               <w:rPr>
                 <w:rFonts w:ascii="Times New Roman" w:hAnsi="Times New Roman"/>
-                <w:b w:val="0"/>
-                <w:i w:val="0"/>
-                <w:sz w:val="16"/>
+                <w:sz w:val="14"/>
               </w:rPr>
               <w:t>0.170</w:t>
             </w:r>
@@ -708,15 +953,17 @@
         </w:tc>
         <w:tc>
           <w:tcPr>
-            <w:tcW w:type="dxa" w:w="1738"/>
+            <w:tcW w:type="dxa" w:w="1673"/>
+            <w:vAlign w:val="center"/>
           </w:tcPr>
           <w:p>
+            <w:pPr>
+              <w:jc w:val="center"/>
+            </w:pPr>
             <w:r>
               <w:rPr>
                 <w:rFonts w:ascii="Times New Roman" w:hAnsi="Times New Roman"/>
-                <w:b w:val="0"/>
-                <w:i w:val="0"/>
-                <w:sz w:val="16"/>
+                <w:sz w:val="14"/>
               </w:rPr>
               <w:t>0.716</w:t>
             </w:r>
@@ -724,15 +971,17 @@
         </w:tc>
         <w:tc>
           <w:tcPr>
-            <w:tcW w:type="dxa" w:w="1738"/>
+            <w:tcW w:type="dxa" w:w="1673"/>
+            <w:vAlign w:val="center"/>
           </w:tcPr>
           <w:p>
+            <w:pPr>
+              <w:jc w:val="center"/>
+            </w:pPr>
             <w:r>
               <w:rPr>
                 <w:rFonts w:ascii="Times New Roman" w:hAnsi="Times New Roman"/>
-                <w:b w:val="0"/>
-                <w:i w:val="0"/>
-                <w:sz w:val="16"/>
+                <w:sz w:val="14"/>
               </w:rPr>
               <w:t>0.387</w:t>
             </w:r>
@@ -742,15 +991,17 @@
       <w:tr>
         <w:tc>
           <w:tcPr>
-            <w:tcW w:type="dxa" w:w="1738"/>
+            <w:tcW w:type="dxa" w:w="1673"/>
+            <w:vAlign w:val="center"/>
           </w:tcPr>
           <w:p>
+            <w:pPr>
+              <w:jc w:val="center"/>
+            </w:pPr>
             <w:r>
               <w:rPr>
                 <w:rFonts w:ascii="Times New Roman" w:hAnsi="Times New Roman"/>
-                <w:b w:val="0"/>
-                <w:i w:val="0"/>
-                <w:sz w:val="16"/>
+                <w:sz w:val="14"/>
               </w:rPr>
               <w:t>Gradient boosting</w:t>
             </w:r>
@@ -758,15 +1009,17 @@
         </w:tc>
         <w:tc>
           <w:tcPr>
-            <w:tcW w:type="dxa" w:w="1738"/>
+            <w:tcW w:type="dxa" w:w="1673"/>
+            <w:vAlign w:val="center"/>
           </w:tcPr>
           <w:p>
+            <w:pPr>
+              <w:jc w:val="center"/>
+            </w:pPr>
             <w:r>
               <w:rPr>
                 <w:rFonts w:ascii="Times New Roman" w:hAnsi="Times New Roman"/>
-                <w:b w:val="0"/>
-                <w:i w:val="0"/>
-                <w:sz w:val="16"/>
+                <w:sz w:val="14"/>
               </w:rPr>
               <w:t>0.793</w:t>
             </w:r>
@@ -774,15 +1027,17 @@
         </w:tc>
         <w:tc>
           <w:tcPr>
-            <w:tcW w:type="dxa" w:w="1738"/>
+            <w:tcW w:type="dxa" w:w="1673"/>
+            <w:vAlign w:val="center"/>
           </w:tcPr>
           <w:p>
+            <w:pPr>
+              <w:jc w:val="center"/>
+            </w:pPr>
             <w:r>
               <w:rPr>
                 <w:rFonts w:ascii="Times New Roman" w:hAnsi="Times New Roman"/>
-                <w:b w:val="0"/>
-                <w:i w:val="0"/>
-                <w:sz w:val="16"/>
+                <w:sz w:val="14"/>
               </w:rPr>
               <w:t>0.861</w:t>
             </w:r>
@@ -790,15 +1045,17 @@
         </w:tc>
         <w:tc>
           <w:tcPr>
-            <w:tcW w:type="dxa" w:w="1738"/>
+            <w:tcW w:type="dxa" w:w="1673"/>
+            <w:vAlign w:val="center"/>
           </w:tcPr>
           <w:p>
+            <w:pPr>
+              <w:jc w:val="center"/>
+            </w:pPr>
             <w:r>
               <w:rPr>
                 <w:rFonts w:ascii="Times New Roman" w:hAnsi="Times New Roman"/>
-                <w:b w:val="0"/>
-                <w:i w:val="0"/>
-                <w:sz w:val="16"/>
+                <w:sz w:val="14"/>
               </w:rPr>
               <w:t>0.180</w:t>
             </w:r>
@@ -806,15 +1063,17 @@
         </w:tc>
         <w:tc>
           <w:tcPr>
-            <w:tcW w:type="dxa" w:w="1738"/>
+            <w:tcW w:type="dxa" w:w="1673"/>
+            <w:vAlign w:val="center"/>
           </w:tcPr>
           <w:p>
+            <w:pPr>
+              <w:jc w:val="center"/>
+            </w:pPr>
             <w:r>
               <w:rPr>
                 <w:rFonts w:ascii="Times New Roman" w:hAnsi="Times New Roman"/>
-                <w:b w:val="0"/>
-                <w:i w:val="0"/>
-                <w:sz w:val="16"/>
+                <w:sz w:val="14"/>
               </w:rPr>
               <w:t>0.732</w:t>
             </w:r>
@@ -822,15 +1081,17 @@
         </w:tc>
         <w:tc>
           <w:tcPr>
-            <w:tcW w:type="dxa" w:w="1738"/>
+            <w:tcW w:type="dxa" w:w="1673"/>
+            <w:vAlign w:val="center"/>
           </w:tcPr>
           <w:p>
+            <w:pPr>
+              <w:jc w:val="center"/>
+            </w:pPr>
             <w:r>
               <w:rPr>
                 <w:rFonts w:ascii="Times New Roman" w:hAnsi="Times New Roman"/>
-                <w:b w:val="0"/>
-                <w:i w:val="0"/>
-                <w:sz w:val="16"/>
+                <w:sz w:val="14"/>
               </w:rPr>
               <w:t>0.410</w:t>
             </w:r>
@@ -840,15 +1101,17 @@
       <w:tr>
         <w:tc>
           <w:tcPr>
-            <w:tcW w:type="dxa" w:w="1738"/>
+            <w:tcW w:type="dxa" w:w="1673"/>
+            <w:vAlign w:val="center"/>
           </w:tcPr>
           <w:p>
+            <w:pPr>
+              <w:jc w:val="center"/>
+            </w:pPr>
             <w:r>
               <w:rPr>
                 <w:rFonts w:ascii="Times New Roman" w:hAnsi="Times New Roman"/>
-                <w:b w:val="0"/>
-                <w:i w:val="0"/>
-                <w:sz w:val="16"/>
+                <w:sz w:val="14"/>
               </w:rPr>
               <w:t>MLP baseline</w:t>
             </w:r>
@@ -856,15 +1119,17 @@
         </w:tc>
         <w:tc>
           <w:tcPr>
-            <w:tcW w:type="dxa" w:w="1738"/>
+            <w:tcW w:type="dxa" w:w="1673"/>
+            <w:vAlign w:val="center"/>
           </w:tcPr>
           <w:p>
+            <w:pPr>
+              <w:jc w:val="center"/>
+            </w:pPr>
             <w:r>
               <w:rPr>
                 <w:rFonts w:ascii="Times New Roman" w:hAnsi="Times New Roman"/>
-                <w:b w:val="0"/>
-                <w:i w:val="0"/>
-                <w:sz w:val="16"/>
+                <w:sz w:val="14"/>
               </w:rPr>
               <w:t>0.779</w:t>
             </w:r>
@@ -872,15 +1137,17 @@
         </w:tc>
         <w:tc>
           <w:tcPr>
-            <w:tcW w:type="dxa" w:w="1738"/>
+            <w:tcW w:type="dxa" w:w="1673"/>
+            <w:vAlign w:val="center"/>
           </w:tcPr>
           <w:p>
+            <w:pPr>
+              <w:jc w:val="center"/>
+            </w:pPr>
             <w:r>
               <w:rPr>
                 <w:rFonts w:ascii="Times New Roman" w:hAnsi="Times New Roman"/>
-                <w:b w:val="0"/>
-                <w:i w:val="0"/>
-                <w:sz w:val="16"/>
+                <w:sz w:val="14"/>
               </w:rPr>
               <w:t>0.858</w:t>
             </w:r>
@@ -888,15 +1155,17 @@
         </w:tc>
         <w:tc>
           <w:tcPr>
-            <w:tcW w:type="dxa" w:w="1738"/>
+            <w:tcW w:type="dxa" w:w="1673"/>
+            <w:vAlign w:val="center"/>
           </w:tcPr>
           <w:p>
+            <w:pPr>
+              <w:jc w:val="center"/>
+            </w:pPr>
             <w:r>
               <w:rPr>
                 <w:rFonts w:ascii="Times New Roman" w:hAnsi="Times New Roman"/>
-                <w:b w:val="0"/>
-                <w:i w:val="0"/>
-                <w:sz w:val="16"/>
+                <w:sz w:val="14"/>
               </w:rPr>
               <w:t>0.187</w:t>
             </w:r>
@@ -904,15 +1173,17 @@
         </w:tc>
         <w:tc>
           <w:tcPr>
-            <w:tcW w:type="dxa" w:w="1738"/>
+            <w:tcW w:type="dxa" w:w="1673"/>
+            <w:vAlign w:val="center"/>
           </w:tcPr>
           <w:p>
+            <w:pPr>
+              <w:jc w:val="center"/>
+            </w:pPr>
             <w:r>
               <w:rPr>
                 <w:rFonts w:ascii="Times New Roman" w:hAnsi="Times New Roman"/>
-                <w:b w:val="0"/>
-                <w:i w:val="0"/>
-                <w:sz w:val="16"/>
+                <w:sz w:val="14"/>
               </w:rPr>
               <w:t>0.678</w:t>
             </w:r>
@@ -920,15 +1191,17 @@
         </w:tc>
         <w:tc>
           <w:tcPr>
-            <w:tcW w:type="dxa" w:w="1738"/>
+            <w:tcW w:type="dxa" w:w="1673"/>
+            <w:vAlign w:val="center"/>
           </w:tcPr>
           <w:p>
+            <w:pPr>
+              <w:jc w:val="center"/>
+            </w:pPr>
             <w:r>
               <w:rPr>
                 <w:rFonts w:ascii="Times New Roman" w:hAnsi="Times New Roman"/>
-                <w:b w:val="0"/>
-                <w:i w:val="0"/>
-                <w:sz w:val="16"/>
+                <w:sz w:val="14"/>
               </w:rPr>
               <w:t>0.342</w:t>
             </w:r>
@@ -938,37 +1211,30 @@
     </w:tbl>
     <w:p>
       <w:pPr>
-        <w:spacing w:after="60" w:line="240" w:lineRule="auto"/>
+        <w:spacing w:after="40" w:line="240" w:lineRule="auto"/>
       </w:pPr>
       <w:r>
         <w:rPr>
-          <w:rFonts w:ascii="Times New Roman" w:hAnsi="Times New Roman"/>
+          <w:rFonts w:ascii="Times New Roman" w:hAnsi="Times New Roman" w:eastAsia="Times New Roman"/>
           <w:b w:val="0"/>
           <w:i w:val="0"/>
-          <w:sz w:val="20"/>
+          <w:sz w:val="18"/>
         </w:rPr>
-        <w:t>Calibrated gradient boosting had the highest mean AUROC, but penalized logistic regression was selected because it had the best overall balance of calibration, Brier score, MCC, stability, and interpretability. At the pooled outer-fold level, the selected model achieved AUROC of 0.855 with 95% bootstrap confidence interval 0.828 to 0.878, AUPRC of 0.864, Brier score of 0.159, sensitivity of 0.729, and specificity of 0.842 at threshold 0.50.</w:t>
+        <w:t>Calibrated gradient boosting had the highest mean AUROC, but penalized logistic regression was selected because it had the best overall ranking after considering AUPRC, Brier score, MCC, calibration slope, stability, and interpretability. For pooled held-out-center predictions, logistic regression achieved AUROC 0.855 (95% bootstrap CI 0.828-0.878), AUPRC 0.864 (0.825-0.893), Brier score 0.159 (0.145-0.173), and balanced accuracy 0.785 (0.756-0.811).</w:t>
       </w:r>
     </w:p>
     <w:p>
       <w:pPr>
-        <w:spacing w:after="60" w:line="240" w:lineRule="auto"/>
+        <w:spacing w:after="40" w:line="240" w:lineRule="auto"/>
+        <w:jc w:val="center"/>
       </w:pPr>
       <w:r>
         <w:rPr>
-          <w:rFonts w:ascii="Times New Roman" w:hAnsi="Times New Roman"/>
-          <w:b w:val="0"/>
-          <w:i w:val="0"/>
-          <w:sz w:val="20"/>
+          <w:rFonts w:ascii="Times New Roman" w:hAnsi="Times New Roman" w:eastAsia="Times New Roman"/>
         </w:rPr>
-        <w:t>Center-wise performance showed that the model performed better on Cleveland and Hungary than on VA Long Beach. Switzerland had very high disease prevalence, making negative predictive value unstable. These differences show that random-split-only evaluation would be misleading.</w:t>
-      </w:r>
-    </w:p>
-    <w:p>
-      <w:r>
         <w:drawing>
           <wp:inline xmlns:a="http://schemas.openxmlformats.org/drawingml/2006/main" xmlns:pic="http://schemas.openxmlformats.org/drawingml/2006/picture">
-            <wp:extent cx="2743200" cy="1446714"/>
+            <wp:extent cx="2880360" cy="1519050"/>
             <wp:docPr id="1" name="Picture 1"/>
             <wp:cNvGraphicFramePr>
               <a:graphicFrameLocks noChangeAspect="1"/>
@@ -989,7 +1255,7 @@
                   <pic:spPr>
                     <a:xfrm>
                       <a:off x="0" y="0"/>
-                      <a:ext cx="2743200" cy="1446714"/>
+                      <a:ext cx="2880360" cy="1519050"/>
                     </a:xfrm>
                     <a:prstGeom prst="rect"/>
                   </pic:spPr>
@@ -1002,24 +1268,31 @@
     </w:p>
     <w:p>
       <w:pPr>
-        <w:spacing w:after="80"/>
+        <w:spacing w:after="40" w:line="240" w:lineRule="auto"/>
         <w:jc w:val="center"/>
       </w:pPr>
       <w:r>
         <w:rPr>
-          <w:rFonts w:ascii="Times New Roman" w:hAnsi="Times New Roman"/>
-          <w:b/>
-          <w:i w:val="0"/>
-          <w:sz w:val="18"/>
+          <w:rFonts w:ascii="Times New Roman" w:hAnsi="Times New Roman" w:eastAsia="Times New Roman"/>
+          <w:b w:val="0"/>
+          <w:i/>
+          <w:sz w:val="16"/>
         </w:rPr>
-        <w:t>Fig. 1. Mean AUROC comparison across candidate models.</w:t>
+        <w:t>Fig. 1. Model comparison across center-aware validation folds.</w:t>
       </w:r>
     </w:p>
     <w:p>
+      <w:pPr>
+        <w:spacing w:after="40" w:line="240" w:lineRule="auto"/>
+        <w:jc w:val="center"/>
+      </w:pPr>
       <w:r>
+        <w:rPr>
+          <w:rFonts w:ascii="Times New Roman" w:hAnsi="Times New Roman" w:eastAsia="Times New Roman"/>
+        </w:rPr>
         <w:drawing>
           <wp:inline xmlns:a="http://schemas.openxmlformats.org/drawingml/2006/main" xmlns:pic="http://schemas.openxmlformats.org/drawingml/2006/picture">
-            <wp:extent cx="2743200" cy="2272052"/>
+            <wp:extent cx="2880360" cy="2916166"/>
             <wp:docPr id="2" name="Picture 2"/>
             <wp:cNvGraphicFramePr>
               <a:graphicFrameLocks noChangeAspect="1"/>
@@ -1028,7 +1301,7 @@
               <a:graphicData uri="http://schemas.openxmlformats.org/drawingml/2006/picture">
                 <pic:pic>
                   <pic:nvPicPr>
-                    <pic:cNvPr id="0" name="calibration_plots.png"/>
+                    <pic:cNvPr id="0" name="roc_curves.png"/>
                     <pic:cNvPicPr/>
                   </pic:nvPicPr>
                   <pic:blipFill>
@@ -1040,7 +1313,7 @@
                   <pic:spPr>
                     <a:xfrm>
                       <a:off x="0" y="0"/>
-                      <a:ext cx="2743200" cy="2272052"/>
+                      <a:ext cx="2880360" cy="2916166"/>
                     </a:xfrm>
                     <a:prstGeom prst="rect"/>
                   </pic:spPr>
@@ -1053,115 +1326,249 @@
     </w:p>
     <w:p>
       <w:pPr>
-        <w:spacing w:after="80"/>
+        <w:spacing w:after="40" w:line="240" w:lineRule="auto"/>
         <w:jc w:val="center"/>
       </w:pPr>
       <w:r>
         <w:rPr>
-          <w:rFonts w:ascii="Times New Roman" w:hAnsi="Times New Roman"/>
-          <w:b/>
-          <w:i w:val="0"/>
-          <w:sz w:val="18"/>
+          <w:rFonts w:ascii="Times New Roman" w:hAnsi="Times New Roman" w:eastAsia="Times New Roman"/>
+          <w:b w:val="0"/>
+          <w:i/>
+          <w:sz w:val="16"/>
         </w:rPr>
-        <w:t>Fig. 2. Calibration curves from held-out center predictions.</w:t>
+        <w:t>Fig. 2. ROC curves for compared models.</w:t>
       </w:r>
     </w:p>
     <w:p>
       <w:pPr>
-        <w:spacing w:before="120" w:after="60"/>
+        <w:spacing w:after="40" w:line="240" w:lineRule="auto"/>
+        <w:jc w:val="center"/>
       </w:pPr>
       <w:r>
         <w:rPr>
-          <w:rFonts w:ascii="Times New Roman" w:hAnsi="Times New Roman"/>
+          <w:rFonts w:ascii="Times New Roman" w:hAnsi="Times New Roman" w:eastAsia="Times New Roman"/>
+        </w:rPr>
+        <w:drawing>
+          <wp:inline xmlns:a="http://schemas.openxmlformats.org/drawingml/2006/main" xmlns:pic="http://schemas.openxmlformats.org/drawingml/2006/picture">
+            <wp:extent cx="2880360" cy="2385654"/>
+            <wp:docPr id="3" name="Picture 3"/>
+            <wp:cNvGraphicFramePr>
+              <a:graphicFrameLocks noChangeAspect="1"/>
+            </wp:cNvGraphicFramePr>
+            <a:graphic>
+              <a:graphicData uri="http://schemas.openxmlformats.org/drawingml/2006/picture">
+                <pic:pic>
+                  <pic:nvPicPr>
+                    <pic:cNvPr id="0" name="calibration_plots.png"/>
+                    <pic:cNvPicPr/>
+                  </pic:nvPicPr>
+                  <pic:blipFill>
+                    <a:blip r:embed="rId11"/>
+                    <a:stretch>
+                      <a:fillRect/>
+                    </a:stretch>
+                  </pic:blipFill>
+                  <pic:spPr>
+                    <a:xfrm>
+                      <a:off x="0" y="0"/>
+                      <a:ext cx="2880360" cy="2385654"/>
+                    </a:xfrm>
+                    <a:prstGeom prst="rect"/>
+                  </pic:spPr>
+                </pic:pic>
+              </a:graphicData>
+            </a:graphic>
+          </wp:inline>
+        </w:drawing>
+      </w:r>
+    </w:p>
+    <w:p>
+      <w:pPr>
+        <w:spacing w:after="40" w:line="240" w:lineRule="auto"/>
+        <w:jc w:val="center"/>
+      </w:pPr>
+      <w:r>
+        <w:rPr>
+          <w:rFonts w:ascii="Times New Roman" w:hAnsi="Times New Roman" w:eastAsia="Times New Roman"/>
+          <w:b w:val="0"/>
+          <w:i/>
+          <w:sz w:val="16"/>
+        </w:rPr>
+        <w:t>Fig. 3. Calibration curves for compared models.</w:t>
+      </w:r>
+    </w:p>
+    <w:p>
+      <w:pPr>
+        <w:spacing w:after="40" w:line="240" w:lineRule="auto"/>
+      </w:pPr>
+      <w:r>
+        <w:rPr>
+          <w:rFonts w:ascii="Times New Roman" w:hAnsi="Times New Roman" w:eastAsia="Times New Roman"/>
+          <w:b w:val="0"/>
+          <w:i w:val="0"/>
+          <w:sz w:val="18"/>
+        </w:rPr>
+        <w:t>At threshold 0.50, the selected model reached sensitivity 0.729, specificity 0.842, PPV 0.851, NPV 0.715, and MCC 0.568. The app reports probability and risk category rather than claiming one universal clinical threshold.</w:t>
+      </w:r>
+    </w:p>
+    <w:p>
+      <w:pPr>
+        <w:spacing w:after="40" w:line="240" w:lineRule="auto"/>
+      </w:pPr>
+      <w:r>
+        <w:rPr>
+          <w:rFonts w:ascii="Times New Roman" w:hAnsi="Times New Roman" w:eastAsia="Times New Roman"/>
+          <w:b w:val="0"/>
+          <w:i w:val="0"/>
+          <w:sz w:val="18"/>
+        </w:rPr>
+        <w:t>The strongest global predictors included cp, sex, exang, thal, slope, oldpeak. These variables are clinically plausible for a benchmark heart disease task, but the model should not be interpreted causally.</w:t>
+      </w:r>
+    </w:p>
+    <w:p>
+      <w:pPr>
+        <w:spacing w:after="40" w:line="240" w:lineRule="auto"/>
+        <w:jc w:val="center"/>
+      </w:pPr>
+      <w:r>
+        <w:rPr>
+          <w:rFonts w:ascii="Times New Roman" w:hAnsi="Times New Roman" w:eastAsia="Times New Roman"/>
+        </w:rPr>
+        <w:drawing>
+          <wp:inline xmlns:a="http://schemas.openxmlformats.org/drawingml/2006/main" xmlns:pic="http://schemas.openxmlformats.org/drawingml/2006/picture">
+            <wp:extent cx="2880360" cy="2042868"/>
+            <wp:docPr id="4" name="Picture 4"/>
+            <wp:cNvGraphicFramePr>
+              <a:graphicFrameLocks noChangeAspect="1"/>
+            </wp:cNvGraphicFramePr>
+            <a:graphic>
+              <a:graphicData uri="http://schemas.openxmlformats.org/drawingml/2006/picture">
+                <pic:pic>
+                  <pic:nvPicPr>
+                    <pic:cNvPr id="0" name="global_feature_importance.png"/>
+                    <pic:cNvPicPr/>
+                  </pic:nvPicPr>
+                  <pic:blipFill>
+                    <a:blip r:embed="rId12"/>
+                    <a:stretch>
+                      <a:fillRect/>
+                    </a:stretch>
+                  </pic:blipFill>
+                  <pic:spPr>
+                    <a:xfrm>
+                      <a:off x="0" y="0"/>
+                      <a:ext cx="2880360" cy="2042868"/>
+                    </a:xfrm>
+                    <a:prstGeom prst="rect"/>
+                  </pic:spPr>
+                </pic:pic>
+              </a:graphicData>
+            </a:graphic>
+          </wp:inline>
+        </w:drawing>
+      </w:r>
+    </w:p>
+    <w:p>
+      <w:pPr>
+        <w:spacing w:after="40" w:line="240" w:lineRule="auto"/>
+        <w:jc w:val="center"/>
+      </w:pPr>
+      <w:r>
+        <w:rPr>
+          <w:rFonts w:ascii="Times New Roman" w:hAnsi="Times New Roman" w:eastAsia="Times New Roman"/>
+          <w:b w:val="0"/>
+          <w:i/>
+          <w:sz w:val="16"/>
+        </w:rPr>
+        <w:t>Fig. 4. Global feature importance for the selected model.</w:t>
+      </w:r>
+    </w:p>
+    <w:p>
+      <w:pPr>
+        <w:spacing w:after="40" w:line="240" w:lineRule="auto"/>
+        <w:jc w:val="center"/>
+      </w:pPr>
+      <w:r>
+        <w:rPr>
+          <w:rFonts w:ascii="Times New Roman" w:hAnsi="Times New Roman" w:eastAsia="Times New Roman"/>
           <w:b/>
           <w:i w:val="0"/>
           <w:sz w:val="20"/>
         </w:rPr>
-        <w:t>VI. ABLATION AND COMPARATIVE STUDIES</w:t>
+        <w:t>VI. ABLATION STUDIES / COMPARATIVE STUDIES</w:t>
       </w:r>
     </w:p>
     <w:p>
       <w:pPr>
-        <w:spacing w:before="80" w:after="40"/>
+        <w:spacing w:after="40" w:line="240" w:lineRule="auto"/>
       </w:pPr>
       <w:r>
         <w:rPr>
-          <w:rFonts w:ascii="Times New Roman" w:hAnsi="Times New Roman"/>
-          <w:b/>
+          <w:rFonts w:ascii="Times New Roman" w:hAnsi="Times New Roman" w:eastAsia="Times New Roman"/>
+          <w:b w:val="0"/>
           <w:i w:val="0"/>
-          <w:sz w:val="20"/>
+          <w:sz w:val="18"/>
         </w:rPr>
-        <w:t>A. Model Comparison</w:t>
+        <w:t>The main comparative study was the model comparison in Table II. It showed that the MLP baseline was not the strongest choice for this small tabular dataset; the simpler logistic regression model was better calibrated and easier to interpret.</w:t>
       </w:r>
     </w:p>
     <w:p>
       <w:pPr>
-        <w:spacing w:after="60" w:line="240" w:lineRule="auto"/>
+        <w:spacing w:after="40" w:line="240" w:lineRule="auto"/>
       </w:pPr>
       <w:r>
         <w:rPr>
-          <w:rFonts w:ascii="Times New Roman" w:hAnsi="Times New Roman"/>
+          <w:rFonts w:ascii="Times New Roman" w:hAnsi="Times New Roman" w:eastAsia="Times New Roman"/>
           <w:b w:val="0"/>
           <w:i w:val="0"/>
-          <w:sz w:val="20"/>
+          <w:sz w:val="18"/>
         </w:rPr>
-        <w:t>The model comparison is the main comparative study. The MLP notebook baseline was not the final model. It achieved mean AUROC of 0.779 and Brier score of 0.187, while logistic regression achieved mean AUROC of 0.799 and Brier score of 0.168. This supports the use of a simpler and more interpretable model for this dataset.</w:t>
+        <w:t>The duplicate sensitivity study used the secondary heart.csv file. The duplicate-expanded version produced higher apparent performance than the deduplicated version, confirming that duplicate rows can inflate benchmark results.</w:t>
       </w:r>
     </w:p>
     <w:p>
       <w:pPr>
-        <w:spacing w:before="80" w:after="40"/>
-      </w:pPr>
-      <w:r>
-        <w:rPr>
-          <w:rFonts w:ascii="Times New Roman" w:hAnsi="Times New Roman"/>
-          <w:b/>
-          <w:i w:val="0"/>
-          <w:sz w:val="20"/>
-        </w:rPr>
-        <w:t>B. Duplicate Sensitivity</w:t>
-      </w:r>
-    </w:p>
-    <w:p>
-      <w:pPr>
-        <w:spacing w:after="80"/>
+        <w:spacing w:after="40" w:line="240" w:lineRule="auto"/>
         <w:jc w:val="center"/>
       </w:pPr>
       <w:r>
         <w:rPr>
-          <w:rFonts w:ascii="Times New Roman" w:hAnsi="Times New Roman"/>
-          <w:b/>
-          <w:i w:val="0"/>
-          <w:sz w:val="18"/>
+          <w:rFonts w:ascii="Times New Roman" w:hAnsi="Times New Roman" w:eastAsia="Times New Roman"/>
+          <w:b w:val="0"/>
+          <w:i/>
+          <w:sz w:val="16"/>
         </w:rPr>
-        <w:t>TABLE II. Duplicate Sensitivity on Supplementary heart.csv</w:t>
+        <w:t>Table III. Duplicate Sensitivity on Secondary Dataset</w:t>
       </w:r>
     </w:p>
     <w:tbl>
       <w:tblPr>
         <w:tblStyle w:val="TableGrid"/>
         <w:tblW w:type="auto" w:w="0"/>
+        <w:jc w:val="center"/>
         <w:tblLook w:firstColumn="1" w:firstRow="1" w:lastColumn="0" w:lastRow="0" w:noHBand="0" w:noVBand="1" w:val="04A0"/>
       </w:tblPr>
       <w:tblGrid>
-        <w:gridCol w:w="2085"/>
-        <w:gridCol w:w="2085"/>
-        <w:gridCol w:w="2085"/>
-        <w:gridCol w:w="2085"/>
-        <w:gridCol w:w="2085"/>
+        <w:gridCol w:w="2007"/>
+        <w:gridCol w:w="2007"/>
+        <w:gridCol w:w="2007"/>
+        <w:gridCol w:w="2007"/>
+        <w:gridCol w:w="2007"/>
       </w:tblGrid>
       <w:tr>
         <w:tc>
           <w:tcPr>
-            <w:tcW w:type="dxa" w:w="2085"/>
+            <w:tcW w:type="dxa" w:w="2007"/>
+            <w:vAlign w:val="center"/>
           </w:tcPr>
           <w:p>
+            <w:pPr>
+              <w:jc w:val="center"/>
+            </w:pPr>
             <w:r>
               <w:rPr>
                 <w:rFonts w:ascii="Times New Roman" w:hAnsi="Times New Roman"/>
-                <w:b w:val="0"/>
-                <w:i w:val="0"/>
-                <w:sz w:val="16"/>
+                <w:sz w:val="14"/>
               </w:rPr>
               <w:t>Dataset version</w:t>
             </w:r>
@@ -1169,15 +1576,17 @@
         </w:tc>
         <w:tc>
           <w:tcPr>
-            <w:tcW w:type="dxa" w:w="2085"/>
+            <w:tcW w:type="dxa" w:w="2007"/>
+            <w:vAlign w:val="center"/>
           </w:tcPr>
           <w:p>
+            <w:pPr>
+              <w:jc w:val="center"/>
+            </w:pPr>
             <w:r>
               <w:rPr>
                 <w:rFonts w:ascii="Times New Roman" w:hAnsi="Times New Roman"/>
-                <w:b w:val="0"/>
-                <w:i w:val="0"/>
-                <w:sz w:val="16"/>
+                <w:sz w:val="14"/>
               </w:rPr>
               <w:t>AUROC</w:t>
             </w:r>
@@ -1185,15 +1594,17 @@
         </w:tc>
         <w:tc>
           <w:tcPr>
-            <w:tcW w:type="dxa" w:w="2085"/>
+            <w:tcW w:type="dxa" w:w="2007"/>
+            <w:vAlign w:val="center"/>
           </w:tcPr>
           <w:p>
+            <w:pPr>
+              <w:jc w:val="center"/>
+            </w:pPr>
             <w:r>
               <w:rPr>
                 <w:rFonts w:ascii="Times New Roman" w:hAnsi="Times New Roman"/>
-                <w:b w:val="0"/>
-                <w:i w:val="0"/>
-                <w:sz w:val="16"/>
+                <w:sz w:val="14"/>
               </w:rPr>
               <w:t>AUPRC</w:t>
             </w:r>
@@ -1201,15 +1612,17 @@
         </w:tc>
         <w:tc>
           <w:tcPr>
-            <w:tcW w:type="dxa" w:w="2085"/>
+            <w:tcW w:type="dxa" w:w="2007"/>
+            <w:vAlign w:val="center"/>
           </w:tcPr>
           <w:p>
+            <w:pPr>
+              <w:jc w:val="center"/>
+            </w:pPr>
             <w:r>
               <w:rPr>
                 <w:rFonts w:ascii="Times New Roman" w:hAnsi="Times New Roman"/>
-                <w:b w:val="0"/>
-                <w:i w:val="0"/>
-                <w:sz w:val="16"/>
+                <w:sz w:val="14"/>
               </w:rPr>
               <w:t>Bal. Acc.</w:t>
             </w:r>
@@ -1217,15 +1630,17 @@
         </w:tc>
         <w:tc>
           <w:tcPr>
-            <w:tcW w:type="dxa" w:w="2085"/>
+            <w:tcW w:type="dxa" w:w="2007"/>
+            <w:vAlign w:val="center"/>
           </w:tcPr>
           <w:p>
+            <w:pPr>
+              <w:jc w:val="center"/>
+            </w:pPr>
             <w:r>
               <w:rPr>
                 <w:rFonts w:ascii="Times New Roman" w:hAnsi="Times New Roman"/>
-                <w:b w:val="0"/>
-                <w:i w:val="0"/>
-                <w:sz w:val="16"/>
+                <w:sz w:val="14"/>
               </w:rPr>
               <w:t>Brier</w:t>
             </w:r>
@@ -1235,31 +1650,127 @@
       <w:tr>
         <w:tc>
           <w:tcPr>
-            <w:tcW w:type="dxa" w:w="2085"/>
+            <w:tcW w:type="dxa" w:w="2007"/>
+            <w:vAlign w:val="center"/>
           </w:tcPr>
           <w:p>
+            <w:pPr>
+              <w:jc w:val="center"/>
+            </w:pPr>
             <w:r>
               <w:rPr>
                 <w:rFonts w:ascii="Times New Roman" w:hAnsi="Times New Roman"/>
-                <w:b w:val="0"/>
-                <w:i w:val="0"/>
-                <w:sz w:val="16"/>
+                <w:sz w:val="14"/>
               </w:rPr>
-              <w:t>Duplicate-expanded</w:t>
+              <w:t>Deduplicated heart.csv</w:t>
             </w:r>
           </w:p>
         </w:tc>
         <w:tc>
           <w:tcPr>
-            <w:tcW w:type="dxa" w:w="2085"/>
+            <w:tcW w:type="dxa" w:w="2007"/>
+            <w:vAlign w:val="center"/>
           </w:tcPr>
           <w:p>
+            <w:pPr>
+              <w:jc w:val="center"/>
+            </w:pPr>
             <w:r>
               <w:rPr>
                 <w:rFonts w:ascii="Times New Roman" w:hAnsi="Times New Roman"/>
-                <w:b w:val="0"/>
-                <w:i w:val="0"/>
-                <w:sz w:val="16"/>
+                <w:sz w:val="14"/>
+              </w:rPr>
+              <w:t>0.909</w:t>
+            </w:r>
+          </w:p>
+        </w:tc>
+        <w:tc>
+          <w:tcPr>
+            <w:tcW w:type="dxa" w:w="2007"/>
+            <w:vAlign w:val="center"/>
+          </w:tcPr>
+          <w:p>
+            <w:pPr>
+              <w:jc w:val="center"/>
+            </w:pPr>
+            <w:r>
+              <w:rPr>
+                <w:rFonts w:ascii="Times New Roman" w:hAnsi="Times New Roman"/>
+                <w:sz w:val="14"/>
+              </w:rPr>
+              <w:t>0.917</w:t>
+            </w:r>
+          </w:p>
+        </w:tc>
+        <w:tc>
+          <w:tcPr>
+            <w:tcW w:type="dxa" w:w="2007"/>
+            <w:vAlign w:val="center"/>
+          </w:tcPr>
+          <w:p>
+            <w:pPr>
+              <w:jc w:val="center"/>
+            </w:pPr>
+            <w:r>
+              <w:rPr>
+                <w:rFonts w:ascii="Times New Roman" w:hAnsi="Times New Roman"/>
+                <w:sz w:val="14"/>
+              </w:rPr>
+              <w:t>0.832</w:t>
+            </w:r>
+          </w:p>
+        </w:tc>
+        <w:tc>
+          <w:tcPr>
+            <w:tcW w:type="dxa" w:w="2007"/>
+            <w:vAlign w:val="center"/>
+          </w:tcPr>
+          <w:p>
+            <w:pPr>
+              <w:jc w:val="center"/>
+            </w:pPr>
+            <w:r>
+              <w:rPr>
+                <w:rFonts w:ascii="Times New Roman" w:hAnsi="Times New Roman"/>
+                <w:sz w:val="14"/>
+              </w:rPr>
+              <w:t>0.125</w:t>
+            </w:r>
+          </w:p>
+        </w:tc>
+      </w:tr>
+      <w:tr>
+        <w:tc>
+          <w:tcPr>
+            <w:tcW w:type="dxa" w:w="2007"/>
+            <w:vAlign w:val="center"/>
+          </w:tcPr>
+          <w:p>
+            <w:pPr>
+              <w:jc w:val="center"/>
+            </w:pPr>
+            <w:r>
+              <w:rPr>
+                <w:rFonts w:ascii="Times New Roman" w:hAnsi="Times New Roman"/>
+                <w:sz w:val="14"/>
+              </w:rPr>
+              <w:t>Duplicate-expanded heart.csv</w:t>
+            </w:r>
+          </w:p>
+        </w:tc>
+        <w:tc>
+          <w:tcPr>
+            <w:tcW w:type="dxa" w:w="2007"/>
+            <w:vAlign w:val="center"/>
+          </w:tcPr>
+          <w:p>
+            <w:pPr>
+              <w:jc w:val="center"/>
+            </w:pPr>
+            <w:r>
+              <w:rPr>
+                <w:rFonts w:ascii="Times New Roman" w:hAnsi="Times New Roman"/>
+                <w:sz w:val="14"/>
               </w:rPr>
               <w:t>0.924</w:t>
             </w:r>
@@ -1267,15 +1778,17 @@
         </w:tc>
         <w:tc>
           <w:tcPr>
-            <w:tcW w:type="dxa" w:w="2085"/>
+            <w:tcW w:type="dxa" w:w="2007"/>
+            <w:vAlign w:val="center"/>
           </w:tcPr>
           <w:p>
+            <w:pPr>
+              <w:jc w:val="center"/>
+            </w:pPr>
             <w:r>
               <w:rPr>
                 <w:rFonts w:ascii="Times New Roman" w:hAnsi="Times New Roman"/>
-                <w:b w:val="0"/>
-                <w:i w:val="0"/>
-                <w:sz w:val="16"/>
+                <w:sz w:val="14"/>
               </w:rPr>
               <w:t>0.926</w:t>
             </w:r>
@@ -1283,15 +1796,17 @@
         </w:tc>
         <w:tc>
           <w:tcPr>
-            <w:tcW w:type="dxa" w:w="2085"/>
+            <w:tcW w:type="dxa" w:w="2007"/>
+            <w:vAlign w:val="center"/>
           </w:tcPr>
           <w:p>
+            <w:pPr>
+              <w:jc w:val="center"/>
+            </w:pPr>
             <w:r>
               <w:rPr>
                 <w:rFonts w:ascii="Times New Roman" w:hAnsi="Times New Roman"/>
-                <w:b w:val="0"/>
-                <w:i w:val="0"/>
-                <w:sz w:val="16"/>
+                <w:sz w:val="14"/>
               </w:rPr>
               <w:t>0.855</w:t>
             </w:r>
@@ -1299,99 +1814,19 @@
         </w:tc>
         <w:tc>
           <w:tcPr>
-            <w:tcW w:type="dxa" w:w="2085"/>
+            <w:tcW w:type="dxa" w:w="2007"/>
+            <w:vAlign w:val="center"/>
           </w:tcPr>
           <w:p>
+            <w:pPr>
+              <w:jc w:val="center"/>
+            </w:pPr>
             <w:r>
               <w:rPr>
                 <w:rFonts w:ascii="Times New Roman" w:hAnsi="Times New Roman"/>
-                <w:b w:val="0"/>
-                <w:i w:val="0"/>
-                <w:sz w:val="16"/>
+                <w:sz w:val="14"/>
               </w:rPr>
               <w:t>0.110</w:t>
-            </w:r>
-          </w:p>
-        </w:tc>
-      </w:tr>
-      <w:tr>
-        <w:tc>
-          <w:tcPr>
-            <w:tcW w:type="dxa" w:w="2085"/>
-          </w:tcPr>
-          <w:p>
-            <w:r>
-              <w:rPr>
-                <w:rFonts w:ascii="Times New Roman" w:hAnsi="Times New Roman"/>
-                <w:b w:val="0"/>
-                <w:i w:val="0"/>
-                <w:sz w:val="16"/>
-              </w:rPr>
-              <w:t>Deduplicated</w:t>
-            </w:r>
-          </w:p>
-        </w:tc>
-        <w:tc>
-          <w:tcPr>
-            <w:tcW w:type="dxa" w:w="2085"/>
-          </w:tcPr>
-          <w:p>
-            <w:r>
-              <w:rPr>
-                <w:rFonts w:ascii="Times New Roman" w:hAnsi="Times New Roman"/>
-                <w:b w:val="0"/>
-                <w:i w:val="0"/>
-                <w:sz w:val="16"/>
-              </w:rPr>
-              <w:t>0.909</w:t>
-            </w:r>
-          </w:p>
-        </w:tc>
-        <w:tc>
-          <w:tcPr>
-            <w:tcW w:type="dxa" w:w="2085"/>
-          </w:tcPr>
-          <w:p>
-            <w:r>
-              <w:rPr>
-                <w:rFonts w:ascii="Times New Roman" w:hAnsi="Times New Roman"/>
-                <w:b w:val="0"/>
-                <w:i w:val="0"/>
-                <w:sz w:val="16"/>
-              </w:rPr>
-              <w:t>0.917</w:t>
-            </w:r>
-          </w:p>
-        </w:tc>
-        <w:tc>
-          <w:tcPr>
-            <w:tcW w:type="dxa" w:w="2085"/>
-          </w:tcPr>
-          <w:p>
-            <w:r>
-              <w:rPr>
-                <w:rFonts w:ascii="Times New Roman" w:hAnsi="Times New Roman"/>
-                <w:b w:val="0"/>
-                <w:i w:val="0"/>
-                <w:sz w:val="16"/>
-              </w:rPr>
-              <w:t>0.832</w:t>
-            </w:r>
-          </w:p>
-        </w:tc>
-        <w:tc>
-          <w:tcPr>
-            <w:tcW w:type="dxa" w:w="2085"/>
-          </w:tcPr>
-          <w:p>
-            <w:r>
-              <w:rPr>
-                <w:rFonts w:ascii="Times New Roman" w:hAnsi="Times New Roman"/>
-                <w:b w:val="0"/>
-                <w:i w:val="0"/>
-                <w:sz w:val="16"/>
-              </w:rPr>
-              <w:t>0.125</w:t>
             </w:r>
           </w:p>
         </w:tc>
@@ -1399,81 +1834,41 @@
     </w:tbl>
     <w:p>
       <w:pPr>
-        <w:spacing w:after="60" w:line="240" w:lineRule="auto"/>
+        <w:spacing w:after="40" w:line="240" w:lineRule="auto"/>
+        <w:jc w:val="center"/>
       </w:pPr>
       <w:r>
         <w:rPr>
-          <w:rFonts w:ascii="Times New Roman" w:hAnsi="Times New Roman"/>
-          <w:b w:val="0"/>
+          <w:rFonts w:ascii="Times New Roman" w:hAnsi="Times New Roman" w:eastAsia="Times New Roman"/>
+          <w:b/>
           <w:i w:val="0"/>
           <w:sz w:val="20"/>
         </w:rPr>
-        <w:t>The duplicate-expanded benchmark produced higher apparent performance than the deduplicated version. This confirms that duplicate rows can inflate results and should not be used as the primary scientific evidence.</w:t>
+        <w:t>VII. LOCALHOST APPLICATION</w:t>
       </w:r>
     </w:p>
     <w:p>
       <w:pPr>
-        <w:spacing w:before="80" w:after="40"/>
+        <w:spacing w:after="40" w:line="240" w:lineRule="auto"/>
       </w:pPr>
       <w:r>
         <w:rPr>
-          <w:rFonts w:ascii="Times New Roman" w:hAnsi="Times New Roman"/>
-          <w:b/>
+          <w:rFonts w:ascii="Times New Roman" w:hAnsi="Times New Roman" w:eastAsia="Times New Roman"/>
+          <w:b w:val="0"/>
           <w:i w:val="0"/>
-          <w:sz w:val="20"/>
+          <w:sz w:val="18"/>
         </w:rPr>
-        <w:t>C. Threshold Sensitivity</w:t>
+        <w:t>The final model is served through a FastAPI application. The interface has one prediction workflow with a clinical-style input form, probability output, risk category, explanation panel, model metadata, and a research-prototype disclaimer. The app uses the saved preprocessing and model bundle, so predictions in the interface match the trained artifact.</w:t>
       </w:r>
     </w:p>
     <w:p>
       <w:pPr>
-        <w:spacing w:after="60" w:line="240" w:lineRule="auto"/>
+        <w:spacing w:after="40" w:line="240" w:lineRule="auto"/>
+        <w:jc w:val="center"/>
       </w:pPr>
       <w:r>
         <w:rPr>
-          <w:rFonts w:ascii="Times New Roman" w:hAnsi="Times New Roman"/>
-          <w:b w:val="0"/>
-          <w:i w:val="0"/>
-          <w:sz w:val="20"/>
-        </w:rPr>
-        <w:t>Threshold analysis showed a clinically relevant sensitivity-specificity trade-off. At threshold 0.10, sensitivity was 0.988 and specificity was 0.214. At threshold 0.50, sensitivity was 0.729 and specificity was 0.842. Therefore, the app reports probability and risk category rather than claiming a universal clinical decision threshold.</w:t>
-      </w:r>
-    </w:p>
-    <w:p>
-      <w:pPr>
-        <w:spacing w:before="120" w:after="60"/>
-      </w:pPr>
-      <w:r>
-        <w:rPr>
-          <w:rFonts w:ascii="Times New Roman" w:hAnsi="Times New Roman"/>
-          <w:b/>
-          <w:i w:val="0"/>
-          <w:sz w:val="20"/>
-        </w:rPr>
-        <w:t>VII. LOCALHOST PROTOTYPE</w:t>
-      </w:r>
-    </w:p>
-    <w:p>
-      <w:pPr>
-        <w:spacing w:after="60" w:line="240" w:lineRule="auto"/>
-      </w:pPr>
-      <w:r>
-        <w:rPr>
-          <w:rFonts w:ascii="Times New Roman" w:hAnsi="Times New Roman"/>
-          <w:b w:val="0"/>
-          <w:i w:val="0"/>
-          <w:sz w:val="20"/>
-        </w:rPr>
-        <w:t>The final model is served through a FastAPI application. The interface provides one prediction workflow with a clinical-style input form. It returns predicted probability, risk category, important feature explanations, model metadata, and a disclaimer. The app does not use a language model in the prediction path; explanations are generated from the trained model artifact and feature dictionary.</w:t>
-      </w:r>
-    </w:p>
-    <w:p>
-      <w:pPr>
-        <w:spacing w:before="120" w:after="60"/>
-      </w:pPr>
-      <w:r>
-        <w:rPr>
-          <w:rFonts w:ascii="Times New Roman" w:hAnsi="Times New Roman"/>
+          <w:rFonts w:ascii="Times New Roman" w:hAnsi="Times New Roman" w:eastAsia="Times New Roman"/>
           <w:b/>
           <w:i w:val="0"/>
           <w:sz w:val="20"/>
@@ -1483,25 +1878,26 @@
     </w:p>
     <w:p>
       <w:pPr>
-        <w:spacing w:after="60" w:line="240" w:lineRule="auto"/>
+        <w:spacing w:after="40" w:line="240" w:lineRule="auto"/>
       </w:pPr>
       <w:r>
         <w:rPr>
-          <w:rFonts w:ascii="Times New Roman" w:hAnsi="Times New Roman"/>
+          <w:rFonts w:ascii="Times New Roman" w:hAnsi="Times New Roman" w:eastAsia="Times New Roman"/>
           <w:b w:val="0"/>
           <w:i w:val="0"/>
-          <w:sz w:val="20"/>
+          <w:sz w:val="18"/>
         </w:rPr>
-        <w:t>This project converts a notebook-based heart disease experiment into a reproducible machine-learning research system. Penalized logistic regression was selected over more complex models because it provided the best balance of calibration, interpretability, and validation performance. Future work should include prospective validation, larger modern datasets, fairness analysis, external validation on independent cohorts, improved missingness modeling, and clinician-centered usability evaluation.</w:t>
+        <w:t>The project satisfies the ML Lab requirements by combining a clean notebook, reproducible model training, comparative experiments, ablation/sensitivity analysis, figures, tables, and a localhost application. Penalized logistic regression was selected because it had the best balance of calibration, interpretability, and center-aware validation performance. Future work should use larger modern cohorts, independent external validation, fairness analysis, improved missingness modeling, and clinical usability testing. The current project should be presented as a research and educational prototype only.</w:t>
       </w:r>
     </w:p>
     <w:p>
       <w:pPr>
-        <w:spacing w:before="120" w:after="60"/>
+        <w:spacing w:after="40" w:line="240" w:lineRule="auto"/>
+        <w:jc w:val="center"/>
       </w:pPr>
       <w:r>
         <w:rPr>
-          <w:rFonts w:ascii="Times New Roman" w:hAnsi="Times New Roman"/>
+          <w:rFonts w:ascii="Times New Roman" w:hAnsi="Times New Roman" w:eastAsia="Times New Roman"/>
           <w:b/>
           <w:i w:val="0"/>
           <w:sz w:val="20"/>
@@ -1511,77 +1907,78 @@
     </w:p>
     <w:p>
       <w:pPr>
-        <w:spacing w:after="60" w:line="240" w:lineRule="auto"/>
+        <w:spacing w:after="40" w:line="240" w:lineRule="auto"/>
       </w:pPr>
       <w:r>
         <w:rPr>
-          <w:rFonts w:ascii="Times New Roman" w:hAnsi="Times New Roman"/>
+          <w:rFonts w:ascii="Times New Roman" w:hAnsi="Times New Roman" w:eastAsia="Times New Roman"/>
           <w:b w:val="0"/>
           <w:i w:val="0"/>
-          <w:sz w:val="20"/>
+          <w:sz w:val="18"/>
         </w:rPr>
-        <w:t>[1] G. S. Collins et al., "TRIPOD+AI statement: updated guidance for reporting clinical prediction models that use regression or machine learning methods," BMJ, vol. 385, e078378, 2024.</w:t>
+        <w:t>[1] G. S. Collins et al., "TRIPOD+AI statement: updated guidance for reporting clinical prediction models that use regression or machine learning methods," BMJ, 2024.</w:t>
       </w:r>
     </w:p>
     <w:p>
       <w:pPr>
-        <w:spacing w:after="60" w:line="240" w:lineRule="auto"/>
+        <w:spacing w:after="40" w:line="240" w:lineRule="auto"/>
       </w:pPr>
       <w:r>
         <w:rPr>
-          <w:rFonts w:ascii="Times New Roman" w:hAnsi="Times New Roman"/>
+          <w:rFonts w:ascii="Times New Roman" w:hAnsi="Times New Roman" w:eastAsia="Times New Roman"/>
           <w:b w:val="0"/>
           <w:i w:val="0"/>
-          <w:sz w:val="20"/>
+          <w:sz w:val="18"/>
         </w:rPr>
-        <w:t>[2] G. S. Collins et al., "PROBAST+AI: an updated quality, risk of bias, and applicability assessment tool for prediction models using regression or artificial intelligence methods," BMJ, vol. 388, e082505, 2025.</w:t>
+        <w:t>[2] G. S. Collins et al., "PROBAST+AI: an updated quality, risk of bias, and applicability assessment tool for prediction models using regression or artificial intelligence methods," BMJ, 2025.</w:t>
       </w:r>
     </w:p>
     <w:p>
       <w:pPr>
-        <w:spacing w:after="60" w:line="240" w:lineRule="auto"/>
+        <w:spacing w:after="40" w:line="240" w:lineRule="auto"/>
       </w:pPr>
       <w:r>
         <w:rPr>
-          <w:rFonts w:ascii="Times New Roman" w:hAnsi="Times New Roman"/>
+          <w:rFonts w:ascii="Times New Roman" w:hAnsi="Times New Roman" w:eastAsia="Times New Roman"/>
           <w:b w:val="0"/>
           <w:i w:val="0"/>
-          <w:sz w:val="20"/>
+          <w:sz w:val="18"/>
         </w:rPr>
         <w:t>[3] R. Detrano et al., "International application of a new probability algorithm for the diagnosis of coronary artery disease," American Journal of Cardiology, 1989.</w:t>
       </w:r>
     </w:p>
     <w:p>
       <w:pPr>
-        <w:spacing w:after="60" w:line="240" w:lineRule="auto"/>
+        <w:spacing w:after="40" w:line="240" w:lineRule="auto"/>
       </w:pPr>
       <w:r>
         <w:rPr>
-          <w:rFonts w:ascii="Times New Roman" w:hAnsi="Times New Roman"/>
+          <w:rFonts w:ascii="Times New Roman" w:hAnsi="Times New Roman" w:eastAsia="Times New Roman"/>
           <w:b w:val="0"/>
           <w:i w:val="0"/>
-          <w:sz w:val="20"/>
+          <w:sz w:val="18"/>
         </w:rPr>
-        <w:t>[4] F. Pedregosa et al., "Scikit-learn: Machine Learning in Python," Journal of Machine Learning Research, vol. 12, pp. 2825-2830, 2011.</w:t>
+        <w:t>[4] F. Pedregosa et al., "Scikit-learn: Machine Learning in Python," Journal of Machine Learning Research, 2011.</w:t>
       </w:r>
     </w:p>
     <w:p>
       <w:pPr>
-        <w:spacing w:after="60" w:line="240" w:lineRule="auto"/>
+        <w:spacing w:after="40" w:line="240" w:lineRule="auto"/>
       </w:pPr>
       <w:r>
         <w:rPr>
-          <w:rFonts w:ascii="Times New Roman" w:hAnsi="Times New Roman"/>
+          <w:rFonts w:ascii="Times New Roman" w:hAnsi="Times New Roman" w:eastAsia="Times New Roman"/>
           <w:b w:val="0"/>
           <w:i w:val="0"/>
-          <w:sz w:val="20"/>
+          <w:sz w:val="18"/>
         </w:rPr>
-        <w:t>[5] S. M. Lundberg and S.-I. Lee, "A Unified Approach to Interpreting Model Predictions," Advances in Neural Information Processing Systems, 2017.</w:t>
+        <w:t>[5] S. M. Lundberg and S.-I. Lee, "A Unified Approach to Interpreting Model Predictions," NeurIPS, 2017.</w:t>
       </w:r>
     </w:p>
     <w:sectPr>
-      <w:pgSz w:w="12240" w:h="15840"/>
-      <w:pgMar w:top="1080" w:right="907" w:bottom="1080" w:left="907" w:header="720" w:footer="720" w:gutter="0"/>
+      <w:type w:val="continuous"/>
+      <w:pgSz w:w="11909" w:h="16834"/>
+      <w:pgMar w:top="936" w:right="936" w:bottom="936" w:left="936" w:header="720" w:footer="720" w:gutter="0"/>
       <w:cols w:space="360" w:num="2"/>
       <w:docGrid w:linePitch="360"/>
     </w:sectPr>
@@ -1953,8 +2350,8 @@
     <w:qFormat/>
     <w:rsid w:val="00FC693F"/>
     <w:rPr>
-      <w:rFonts w:ascii="Times New Roman" w:hAnsi="Times New Roman"/>
-      <w:sz w:val="20"/>
+      <w:rFonts w:ascii="Times New Roman" w:hAnsi="Times New Roman" w:eastAsia="Times New Roman"/>
+      <w:sz w:val="18"/>
     </w:rPr>
   </w:style>
   <w:style w:type="paragraph" w:styleId="Header">
@@ -2016,11 +2413,11 @@
       <w:outlineLvl w:val="0"/>
     </w:pPr>
     <w:rPr>
-      <w:rFonts w:asciiTheme="majorHAnsi" w:eastAsiaTheme="majorEastAsia" w:hAnsiTheme="majorHAnsi" w:cstheme="majorBidi"/>
+      <w:rFonts w:asciiTheme="majorHAnsi" w:eastAsiaTheme="majorEastAsia" w:hAnsiTheme="majorHAnsi" w:cstheme="majorBidi" w:ascii="Times New Roman" w:hAnsi="Times New Roman" w:eastAsia="Times New Roman"/>
       <w:b/>
       <w:bCs/>
       <w:color w:val="365F91" w:themeColor="accent1" w:themeShade="BF"/>
-      <w:sz w:val="28"/>
+      <w:sz w:val="20"/>
       <w:szCs w:val="28"/>
     </w:rPr>
   </w:style>
@@ -2040,11 +2437,11 @@
       <w:outlineLvl w:val="1"/>
     </w:pPr>
     <w:rPr>
-      <w:rFonts w:asciiTheme="majorHAnsi" w:eastAsiaTheme="majorEastAsia" w:hAnsiTheme="majorHAnsi" w:cstheme="majorBidi"/>
+      <w:rFonts w:asciiTheme="majorHAnsi" w:eastAsiaTheme="majorEastAsia" w:hAnsiTheme="majorHAnsi" w:cstheme="majorBidi" w:ascii="Times New Roman" w:hAnsi="Times New Roman" w:eastAsia="Times New Roman"/>
       <w:b/>
       <w:bCs/>
       <w:color w:val="4F81BD" w:themeColor="accent1"/>
-      <w:sz w:val="26"/>
+      <w:sz w:val="20"/>
       <w:szCs w:val="26"/>
     </w:rPr>
   </w:style>
@@ -2064,10 +2461,11 @@
       <w:outlineLvl w:val="2"/>
     </w:pPr>
     <w:rPr>
-      <w:rFonts w:asciiTheme="majorHAnsi" w:eastAsiaTheme="majorEastAsia" w:hAnsiTheme="majorHAnsi" w:cstheme="majorBidi"/>
+      <w:rFonts w:asciiTheme="majorHAnsi" w:eastAsiaTheme="majorEastAsia" w:hAnsiTheme="majorHAnsi" w:cstheme="majorBidi" w:ascii="Times New Roman" w:hAnsi="Times New Roman" w:eastAsia="Times New Roman"/>
       <w:b/>
       <w:bCs/>
       <w:color w:val="4F81BD" w:themeColor="accent1"/>
+      <w:sz w:val="20"/>
     </w:rPr>
   </w:style>
   <w:style w:type="paragraph" w:styleId="Heading4">

</xml_diff>

<commit_message>
Update CVD models and lab report
</commit_message>
<xml_diff>
--- a/reports/manuscript/early_cvd_ieee_lab_report.docx
+++ b/reports/manuscript/early_cvd_ieee_lab_report.docx
@@ -22,7 +22,7 @@
         </w:rPr>
         <w:sectPr>
           <w:pgSz w:w="11909" w:h="16834"/>
-          <w:pgMar w:top="1008" w:right="1008" w:bottom="1008" w:left="1008" w:header="720" w:footer="720" w:gutter="0"/>
+          <w:pgMar w:top="1080" w:right="907" w:bottom="1440" w:left="907" w:header="720" w:footer="720" w:gutter="0"/>
           <w:cols w:space="240"/>
           <w:docGrid w:linePitch="360"/>
         </w:sectPr>
@@ -75,19 +75,9 @@
       </w:r>
       <w:r>
         <w:br/>
-      </w:r>
-      <w:r>
-        <w:rPr>
-          <w:i/>
-          <w:iCs/>
-        </w:rPr>
         <w:t>Department of Computer Science and Engineering</w:t>
       </w:r>
       <w:r>
-        <w:rPr>
-          <w:i/>
-          <w:iCs/>
-        </w:rPr>
         <w:br/>
         <w:t>Bangladesh University of Professionals</w:t>
       </w:r>
@@ -97,74 +87,22 @@
       </w:r>
       <w:r>
         <w:br/>
-      </w:r>
-      <w:r>
         <w:t>ravian.irtisam007@gmail.com</w:t>
       </w:r>
       <w:r>
-        <w:br w:type="column"/>
+        <w:br/>
+      </w:r>
+      <w:r>
+        <w:br/>
       </w:r>
       <w:r>
         <w:t>Shahariar Hossain</w:t>
       </w:r>
       <w:r>
         <w:br/>
-      </w:r>
-      <w:r>
-        <w:rPr>
-          <w:i/>
-          <w:iCs/>
-        </w:rPr>
         <w:t>Department of Computer Science and Engineering</w:t>
       </w:r>
       <w:r>
-        <w:rPr>
-          <w:i/>
-          <w:iCs/>
-        </w:rPr>
-        <w:br/>
-        <w:t>Bangladesh University of Professionals</w:t>
-      </w:r>
-      <w:r>
-        <w:rPr>
-          <w:i/>
-          <w:iCs/>
-        </w:rPr>
-        <w:br/>
-      </w:r>
-      <w:r>
-        <w:t>Dhaka, Bangladesh</w:t>
-      </w:r>
-      <w:r>
-        <w:br/>
-      </w:r>
-      <w:r>
-        <w:t>shahariar044@gmail.com</w:t>
-      </w:r>
-    </w:p>
-    <w:p>
-      <w:pPr>
-        <w:pStyle w:val="Author"/>
-        <w:spacing w:before="0" w:after="120"/>
-      </w:pPr>
-      <w:r>
-        <w:t>Rumana Yasmin</w:t>
-      </w:r>
-      <w:r>
-        <w:br/>
-      </w:r>
-      <w:r>
-        <w:rPr>
-          <w:i/>
-          <w:iCs/>
-        </w:rPr>
-        <w:t>Department of Computer Science and Engineering</w:t>
-      </w:r>
-      <w:r>
-        <w:rPr>
-          <w:i/>
-          <w:iCs/>
-        </w:rPr>
         <w:br/>
         <w:t>Bangladesh University of Professionals</w:t>
       </w:r>
@@ -174,29 +112,22 @@
       </w:r>
       <w:r>
         <w:br/>
-        <w:t xml:space="preserve">rumana.yasmin@bup.edu.bd </w:t>
+        <w:t>shahariar044@gmail.com</w:t>
       </w:r>
+    </w:p>
+    <w:p>
+      <w:pPr>
+        <w:pStyle w:val="Author"/>
+        <w:spacing w:before="0" w:after="120"/>
+      </w:pPr>
       <w:r>
-        <w:br w:type="column"/>
-      </w:r>
-      <w:r>
-        <w:t>Md. Sakib Hasan</w:t>
+        <w:t>Rumana Yasmin</w:t>
       </w:r>
       <w:r>
         <w:br/>
-      </w:r>
-      <w:r>
-        <w:rPr>
-          <w:i/>
-          <w:iCs/>
-        </w:rPr>
         <w:t>Department of Computer Science and Engineering</w:t>
       </w:r>
       <w:r>
-        <w:rPr>
-          <w:i/>
-          <w:iCs/>
-        </w:rPr>
         <w:br/>
         <w:t>Bangladesh University of Professionals</w:t>
       </w:r>
@@ -206,8 +137,31 @@
       </w:r>
       <w:r>
         <w:br/>
+        <w:t>rumana.yasmin@bup.edu.bd</w:t>
       </w:r>
       <w:r>
+        <w:br/>
+      </w:r>
+      <w:r>
+        <w:br/>
+      </w:r>
+      <w:r>
+        <w:t>Md. Sakib Hasan</w:t>
+      </w:r>
+      <w:r>
+        <w:br/>
+        <w:t>Department of Computer Science and Engineering</w:t>
+      </w:r>
+      <w:r>
+        <w:br/>
+        <w:t>Bangladesh University of Professionals</w:t>
+      </w:r>
+      <w:r>
+        <w:br/>
+        <w:t>Dhaka, Bangladesh</w:t>
+      </w:r>
+      <w:r>
+        <w:br/>
         <w:t>mdsakibhasan181714@gmail.com</w:t>
       </w:r>
     </w:p>
@@ -218,7 +172,7 @@
         <w:sectPr>
           <w:type w:val="continuous"/>
           <w:pgSz w:w="11909" w:h="16834"/>
-          <w:pgMar w:top="1008" w:right="1008" w:bottom="1008" w:left="1008" w:header="720" w:footer="720" w:gutter="0"/>
+          <w:pgMar w:top="1080" w:right="907" w:bottom="1440" w:left="907" w:header="720" w:footer="720" w:gutter="0"/>
           <w:cols w:num="3" w:space="240"/>
           <w:docGrid w:linePitch="360"/>
         </w:sectPr>
@@ -262,34 +216,7 @@
         </w:rPr>
       </w:pPr>
       <w:r>
-        <w:rPr>
-          <w:i/>
-          <w:iCs/>
-        </w:rPr>
-        <w:t>Abstract</w:t>
-      </w:r>
-      <w:r>
-        <w:rPr>
-          <w:i/>
-          <w:iCs/>
-        </w:rPr>
-        <w:t>—</w:t>
-      </w:r>
-      <w:proofErr w:type="gramStart"/>
-      <w:r>
-        <w:t>Cardiovascular disease</w:t>
-      </w:r>
-      <w:proofErr w:type="gramEnd"/>
-      <w:r>
-        <w:t xml:space="preserve"> prediction from routine clinical variables is a common machine-learning laboratory problem, but public benchmark studies can overstate performance when duplicate rows, missingness, validation leakage, and calibration are not handled carefully. This project develops Early CVD Prediction as a reproducible and explainable heart-disease prediction workflow using a primary UCI-style multi-center dataset and a secondary heart.csv benchmark. The main binary outcome collapsed num = 1-4 into disease presence and retained num = 0 as disease absence. The primary dataset contained 920 records from Cleveland, Hungary, Switzerland, and VA Long Beach; the secondary file contained 1025 rows but only 302 unique rows after exact deduplication. The main experiment used leave-one-center-out internal-external validation with all preprocessing fitted inside training folds. Penalized logistic regression, random forest, gradient boosting, calibrated gradient boosting, and a multilayer perceptron baseline were compared using discrimination, calibration, threshold behavior, stability, and interpretability. Penalized logistic regression was selected because it achieved a strong overall balance: </w:t>
-      </w:r>
-      <w:proofErr w:type="gramStart"/>
-      <w:r>
-        <w:t>mean held</w:t>
-      </w:r>
-      <w:proofErr w:type="gramEnd"/>
-      <w:r>
-        <w:t>-out-center AUROC 0.799, AUPRC 0.880, Brier score 0.168, and balanced accuracy 0.745. The work includes a compatible notebook, generated figures and tables, tests, and a FastAPI localhost application with probability and explanation output. The system is a research and educational prototype, not a clinically deployed diagnostic device.</w:t>
+        <w:t>Abstract—Cardiovascular disease prediction from routine clinical variables is a common machine-learning laboratory problem, but public benchmark studies can overstate performance when duplicate rows, missingness, validation leakage, and calibration are not handled carefully. This project develops Early CVD Prediction as a reproducible and explainable heart-disease prediction workflow using a primary UCI-style multi-center dataset and a secondary heart.csv benchmark. The main binary outcome collapsed num = 1-4 into disease presence and retained num = 0 as disease absence. The primary dataset contained 920 records from Cleveland, Hungary, Switzerland, and VA Long Beach; the secondary file contained 1025 rows but only 302 unique rows after exact deduplication. The main experiment used leave-one-center-out internal-external validation with all preprocessing fitted inside training folds. Ten candidate models were compared, including interpretable baselines, tree ensembles, calibrated boosting, RBF SVM, XGBoost, LightGBM, CatBoost, stacking, and a multilayer perceptron baseline. Calibrated gradient boosting was selected by the composite ranking because it achieved the best overall balance: mean held-out-center AUROC 0.808, AUPRC 0.882, Brier score 0.155, balanced accuracy 0.744, and MCC 0.439. In pooled held-out-center predictions, the selected model achieved AUROC 0.859, AUPRC 0.866, Brier score 0.152, and balanced accuracy 0.784. The system is a research and educational prototype, not a clinically deployed diagnostic device.</w:t>
       </w:r>
     </w:p>
     <w:p>
@@ -322,10 +249,10 @@
         <w:pStyle w:val="BodyText"/>
       </w:pPr>
       <w:r>
-        <w:t xml:space="preserve">Early prediction of cardiovascular disease (CVD) is important because intervention is more useful when risk is identified before severe clinical events. In machine-learning education, heart-disease prediction is also valuable because the predictors are structured, clinically meaningful, and small enough for transparent analysis. Typical variables include age, sex, chest pain type, resting blood pressure, serum cholesterol, fasting blood sugar, resting electrocardiographic findings, maximum heart rate, exercise-induced angina, ST </w:t>
+        <w:t xml:space="preserve">Cardiovascular disease (CVD) is the one of primary causes of death globally and early risk stratification is essential to provide effective interventions. Machine learning (ML) is a powerful technique that has emerged in the context of the growing use of healthcare data, which is being used to make predictions about cardiovascular disease (CVD). The clinical utility of tabular health data is well established, as many of the </w:t>
       </w:r>
       <w:r>
-        <w:t>depression measured as oldpeak, ST slope, major vessels, and thalassemia or stress-test category.</w:t>
+        <w:t>key clinical predictors, including age, blood pressure, and cholesterol, are well structured and clinically meaningful, making it an essential test bed for models that can both predict and be physiologically interpreted.</w:t>
       </w:r>
     </w:p>
     <w:p>
@@ -333,7 +260,7 @@
         <w:pStyle w:val="BodyText"/>
       </w:pPr>
       <w:r>
-        <w:t>The original work for this project began as an exploratory neural-network notebook. A project audit showed that the notebook was useful for motivation and baseline modeling, but it used notebook-only code, a single random split, and a small heart.csv file that did not match the current primary dataset. Therefore, the project was rebuilt around a simpler and more defensible research question: can a leakage-audited, site-aware, explainable pipeline provide a reliable benchmark for binary heart-disease prediction using public tabular clinical data?</w:t>
+        <w:t>Although there are predictive algorithms, much basic research is still conducted in the unvalidated, ad-hoc environment. Although they are helpful to set baseline expectations for early-stage deployments, they often have structural issues such as notebook-based code, limited random data splits, and disjointed data. These defects make it difficult to reproduce, pose significant data leakage threats and ultimately prevent formal clinical translation.</w:t>
       </w:r>
     </w:p>
     <w:p>
@@ -341,7 +268,7 @@
         <w:pStyle w:val="BodyText"/>
       </w:pPr>
       <w:r>
-        <w:t>The contribution of this work is not a claim of clinical deployment readiness. Instead, the contribution is a complete ML Lab project that connects notebook research with reproducible software: data audit, duplicate analysis, leakage control, fold-contained preprocessing, center-aware validation, model comparison, calibration-aware selection, explainability, a localhost application, and a concise IEEE-style report generated from experiment artifacts.</w:t>
+        <w:t>To address these methodological shortcomings, this study uses a strict and standardized model architecture instead of exploratory modeling. We focus on a critical research question: Is a leakage-audited, site-aware and explicitly explainable pipeline a good benchmark for a binary heart-disease prediction task with public tabular clinical data? This paper provides a systematic approach to address data leakage, account for variance across multiple sites, and incorporate Explainable AI (XAI) principles, creating a transparent and highly reproducible framework for implementing trustworthy predictive algorithms in cardiovascular care.</w:t>
       </w:r>
     </w:p>
     <w:p>
@@ -365,11 +292,8 @@
         <w:pStyle w:val="BodyText"/>
       </w:pPr>
       <w:r>
-        <w:t xml:space="preserve">A second direction uses structured clinical datasets such as Cleveland, Hungarian, Statlog, and merged UCI-style heart-disease data. These studies often combine feature engineering or feature selection with ensemble classifiers and report high accuracy [4], [6], [7]. Such results are useful benchmarks, but public heart-disease datasets are small and </w:t>
-      </w:r>
-      <w:r>
         <w:lastRenderedPageBreak/>
-        <w:t>sometimes duplicated or reprocessed. This project therefore audits the supplied files directly, treats the UCI-style multi-center file as primary, and treats heart.csv only as a supplementary benchmark after deduplication.</w:t>
+        <w:t>A second direction uses structured clinical datasets such as Cleveland, Hungarian, Statlog, and merged UCI-style heart-disease data. These studies often combine feature engineering or feature selection with ensemble classifiers and report high accuracy [4], [6], [7]. Such results are useful benchmarks, but public heart-disease datasets are small and sometimes duplicated or reprocessed. This project therefore audits the supplied files directly, treats the UCI-style multi-center file as primary, and treats heart.csv only as a supplementary benchmark after deduplication.</w:t>
       </w:r>
     </w:p>
     <w:p>
@@ -417,9 +341,9 @@
         <w:tblLook w:val="04A0" w:firstRow="1" w:lastRow="0" w:firstColumn="1" w:lastColumn="0" w:noHBand="0" w:noVBand="1"/>
       </w:tblPr>
       <w:tblGrid>
-        <w:gridCol w:w="1570"/>
-        <w:gridCol w:w="1629"/>
-        <w:gridCol w:w="1617"/>
+        <w:gridCol w:w="1345"/>
+        <w:gridCol w:w="2160"/>
+        <w:gridCol w:w="1412"/>
       </w:tblGrid>
       <w:tr>
         <w:trPr>
@@ -427,7 +351,7 @@
         </w:trPr>
         <w:tc>
           <w:tcPr>
-            <w:tcW w:w="3442" w:type="dxa"/>
+            <w:tcW w:w="1345" w:type="dxa"/>
           </w:tcPr>
           <w:p>
             <w:pPr>
@@ -440,7 +364,7 @@
         </w:tc>
         <w:tc>
           <w:tcPr>
-            <w:tcW w:w="3442" w:type="dxa"/>
+            <w:tcW w:w="2160" w:type="dxa"/>
           </w:tcPr>
           <w:p>
             <w:pPr>
@@ -453,7 +377,7 @@
         </w:tc>
         <w:tc>
           <w:tcPr>
-            <w:tcW w:w="3442" w:type="dxa"/>
+            <w:tcW w:w="1412" w:type="dxa"/>
           </w:tcPr>
           <w:p>
             <w:pPr>
@@ -471,7 +395,7 @@
         </w:trPr>
         <w:tc>
           <w:tcPr>
-            <w:tcW w:w="3442" w:type="dxa"/>
+            <w:tcW w:w="1345" w:type="dxa"/>
           </w:tcPr>
           <w:p>
             <w:pPr>
@@ -484,7 +408,7 @@
         </w:tc>
         <w:tc>
           <w:tcPr>
-            <w:tcW w:w="3442" w:type="dxa"/>
+            <w:tcW w:w="2160" w:type="dxa"/>
           </w:tcPr>
           <w:p>
             <w:pPr>
@@ -497,7 +421,7 @@
         </w:tc>
         <w:tc>
           <w:tcPr>
-            <w:tcW w:w="3442" w:type="dxa"/>
+            <w:tcW w:w="1412" w:type="dxa"/>
           </w:tcPr>
           <w:p>
             <w:pPr>
@@ -515,7 +439,7 @@
         </w:trPr>
         <w:tc>
           <w:tcPr>
-            <w:tcW w:w="3442" w:type="dxa"/>
+            <w:tcW w:w="1345" w:type="dxa"/>
           </w:tcPr>
           <w:p>
             <w:pPr>
@@ -528,7 +452,7 @@
         </w:tc>
         <w:tc>
           <w:tcPr>
-            <w:tcW w:w="3442" w:type="dxa"/>
+            <w:tcW w:w="2160" w:type="dxa"/>
           </w:tcPr>
           <w:p>
             <w:pPr>
@@ -541,7 +465,7 @@
         </w:tc>
         <w:tc>
           <w:tcPr>
-            <w:tcW w:w="3442" w:type="dxa"/>
+            <w:tcW w:w="1412" w:type="dxa"/>
           </w:tcPr>
           <w:p>
             <w:pPr>
@@ -559,7 +483,7 @@
         </w:trPr>
         <w:tc>
           <w:tcPr>
-            <w:tcW w:w="3442" w:type="dxa"/>
+            <w:tcW w:w="1345" w:type="dxa"/>
           </w:tcPr>
           <w:p>
             <w:pPr>
@@ -572,7 +496,7 @@
         </w:tc>
         <w:tc>
           <w:tcPr>
-            <w:tcW w:w="3442" w:type="dxa"/>
+            <w:tcW w:w="2160" w:type="dxa"/>
           </w:tcPr>
           <w:p>
             <w:pPr>
@@ -585,7 +509,7 @@
         </w:tc>
         <w:tc>
           <w:tcPr>
-            <w:tcW w:w="3442" w:type="dxa"/>
+            <w:tcW w:w="1412" w:type="dxa"/>
           </w:tcPr>
           <w:p>
             <w:pPr>
@@ -603,7 +527,7 @@
         </w:trPr>
         <w:tc>
           <w:tcPr>
-            <w:tcW w:w="3442" w:type="dxa"/>
+            <w:tcW w:w="1345" w:type="dxa"/>
           </w:tcPr>
           <w:p>
             <w:pPr>
@@ -616,7 +540,7 @@
         </w:tc>
         <w:tc>
           <w:tcPr>
-            <w:tcW w:w="3442" w:type="dxa"/>
+            <w:tcW w:w="2160" w:type="dxa"/>
           </w:tcPr>
           <w:p>
             <w:pPr>
@@ -635,7 +559,7 @@
         </w:tc>
         <w:tc>
           <w:tcPr>
-            <w:tcW w:w="3442" w:type="dxa"/>
+            <w:tcW w:w="1412" w:type="dxa"/>
           </w:tcPr>
           <w:p>
             <w:pPr>
@@ -653,7 +577,7 @@
         </w:trPr>
         <w:tc>
           <w:tcPr>
-            <w:tcW w:w="3442" w:type="dxa"/>
+            <w:tcW w:w="1345" w:type="dxa"/>
           </w:tcPr>
           <w:p>
             <w:pPr>
@@ -666,7 +590,7 @@
         </w:tc>
         <w:tc>
           <w:tcPr>
-            <w:tcW w:w="3442" w:type="dxa"/>
+            <w:tcW w:w="2160" w:type="dxa"/>
           </w:tcPr>
           <w:p>
             <w:pPr>
@@ -691,7 +615,7 @@
         </w:tc>
         <w:tc>
           <w:tcPr>
-            <w:tcW w:w="3442" w:type="dxa"/>
+            <w:tcW w:w="1412" w:type="dxa"/>
           </w:tcPr>
           <w:p>
             <w:pPr>
@@ -717,10 +641,10 @@
         <w:pStyle w:val="BodyText"/>
       </w:pPr>
       <w:r>
-        <w:t xml:space="preserve">The primary dataset was heart_disease_uci.csv. The target variable was converted to a binary label: num = 0 represented absence of recorded disease and num &gt; 0 represented disease </w:t>
+        <w:t xml:space="preserve">The main data was the file "heart_disease_uci.csv". The dependent variable was dichotomized, with num = 0 signifying that no disease was recorded and num &gt; 0 signifying that disease was recorded. The center or hospital source was </w:t>
       </w:r>
       <w:r>
-        <w:t>presence. The center or hospital source was retained for validation grouping but excluded from the predictor set. This design supports internal-external validation: each center is held out once to approximate a new-site test while the remaining centers are used for development.</w:t>
+        <w:t>included as a validation grouping source but not included in the predictor set. This design can achieve the purpose of internal-external validation: each center will be excluded once to simulate the test in a new site, and the other centers will be used to develop the test.</w:t>
       </w:r>
     </w:p>
     <w:p>
@@ -728,7 +652,7 @@
         <w:pStyle w:val="BodyText"/>
       </w:pPr>
       <w:r>
-        <w:t>The secondary dataset was heart.csv. It was not assumed to be clean. Exact duplicate analysis found 723 duplicate rows, leaving 302 unique records. Because this file does not contain a center variable and has heavy row duplication, it was used only for supplementary benchmarking and duplicate sensitivity analysis.</w:t>
+        <w:t>heart.csv was used for the second dataset. It was not suspected to be contaminated. Exact duplicate analysis: 723 duplicate rows identified, 302 unique rows. This file was used only for supplemental benchmarking and duplicate sensitivity analysis as it has no center variable and a high level of row duplication.</w:t>
       </w:r>
     </w:p>
     <w:p>
@@ -736,7 +660,23 @@
         <w:pStyle w:val="BodyText"/>
       </w:pPr>
       <w:r>
-        <w:t>The feature schema was standardized across files. Naming differences such as thalach and thalch, and target and num, were handled through a canonical dictionary. Numeric predictors were median-imputed and standardized. Categorical predictors were imputed with the most frequent value and one-hot encoded. All preprocessing was inside scikit-learn pipelines so imputation, scaling, encoding, and model fitting were learned only from training folds. This is the central leakage-control decision in the project.</w:t>
+        <w:t xml:space="preserve">The feature schema was universalized in files. The differences in names were resolved by using a canonical dictionary for the cases </w:t>
+      </w:r>
+      <w:proofErr w:type="spellStart"/>
+      <w:r>
+        <w:t>thalach</w:t>
+      </w:r>
+      <w:proofErr w:type="spellEnd"/>
+      <w:r>
+        <w:t>/</w:t>
+      </w:r>
+      <w:proofErr w:type="spellStart"/>
+      <w:r>
+        <w:t>thalch</w:t>
+      </w:r>
+      <w:proofErr w:type="spellEnd"/>
+      <w:r>
+        <w:t xml:space="preserve"> and target/num. Median imputation and standardization were performed on numeric predictors. Predictors were categorical and were imputed and one-hot encoded with the most common value. All the preprocessing was subject to an scikit-learn pipeline, meaning that imputation, scaling, encoding and model fitting were learned only from training folds. This is a key leakage-control decision for the project.</w:t>
       </w:r>
     </w:p>
     <w:p>
@@ -744,7 +684,31 @@
         <w:pStyle w:val="BodyText"/>
       </w:pPr>
       <w:r>
-        <w:t>Five model families were evaluated: penalized logistic regression, random forest, gradient boosting, calibrated gradient boosting, and a multilayer perceptron baseline preserving the direction of the original neural-network notebook. The final selection principle was methodological rather than cosmetic: accuracy alone could not determine the champion model. A model was preferred only if it showed a balanced profile across discrimination, calibration, stability, interpretability, and suitability for a small tabular clinical dataset.</w:t>
+        <w:t xml:space="preserve">The following 10 model families were evaluated: penalized logistic regression, random forest, gradient boosting, calibrated gradient boosting, RBF SVM, </w:t>
+      </w:r>
+      <w:proofErr w:type="spellStart"/>
+      <w:r>
+        <w:t>XGBoost</w:t>
+      </w:r>
+      <w:proofErr w:type="spellEnd"/>
+      <w:r>
+        <w:t xml:space="preserve">, </w:t>
+      </w:r>
+      <w:proofErr w:type="spellStart"/>
+      <w:r>
+        <w:t>LightGBM</w:t>
+      </w:r>
+      <w:proofErr w:type="spellEnd"/>
+      <w:r>
+        <w:t xml:space="preserve">, </w:t>
+      </w:r>
+      <w:proofErr w:type="spellStart"/>
+      <w:r>
+        <w:t>CatBoost</w:t>
+      </w:r>
+      <w:proofErr w:type="spellEnd"/>
+      <w:r>
+        <w:t>, heterogeneous stacking, baseline with the direction of the original neural-network notebook preserved. The final selection criterion was not a cosmetic one, but methodological: the champion model could not be determined by its accuracy alone. If a model was preferred, then it demonstrated a "balanced" profile in terms of discrimination, calibration, stability, interpretability and suitability for small tabular clinical data sets.</w:t>
       </w:r>
     </w:p>
     <w:p>
@@ -752,26 +716,37 @@
         <w:pStyle w:val="BodyText"/>
       </w:pPr>
       <w:r>
-        <w:t>The localhost application uses FastAPI with Pydantic validation and a lightweight integrated HTML interface. This choice keeps the project simple for submission and presentation while still providing automatic API documentation. The public workflow uses one clinical input form, reports calibrated probability and risk category, displays important feature contributions, and includes a research-prototype disclaimer.</w:t>
+        <w:t xml:space="preserve">It employs </w:t>
+      </w:r>
+      <w:proofErr w:type="spellStart"/>
+      <w:r>
+        <w:t>FastAPI</w:t>
+      </w:r>
+      <w:proofErr w:type="spellEnd"/>
+      <w:r>
+        <w:t xml:space="preserve"> and </w:t>
+      </w:r>
+      <w:proofErr w:type="spellStart"/>
+      <w:r>
+        <w:t>Pydantic</w:t>
+      </w:r>
+      <w:proofErr w:type="spellEnd"/>
+      <w:r>
+        <w:t xml:space="preserve"> validation along with a simple built-in HTML interface application. This option makes the project easy to submit and present but also allows for automated API documentation. The public workflow is based on one clinical workflow, includes a disclaimer meant for research purposes, and it reports calibrated probability and risk category, as well as important feature contributions</w:t>
+      </w:r>
+      <w:r>
+        <w:t>.</w:t>
       </w:r>
     </w:p>
     <w:p>
-      <w:pPr>
-        <w:pStyle w:val="BodyText"/>
-      </w:pPr>
-    </w:p>
-    <w:p>
-      <w:pPr>
-        <w:pStyle w:val="BodyText"/>
-      </w:pPr>
       <w:r>
         <w:rPr>
           <w:noProof/>
         </w:rPr>
         <w:drawing>
-          <wp:inline distT="0" distB="0" distL="0" distR="0" wp14:anchorId="65376DB2" wp14:editId="59516ADF">
-            <wp:extent cx="3064510" cy="3080385"/>
-            <wp:effectExtent l="0" t="0" r="2540" b="5715"/>
+          <wp:inline distT="0" distB="0" distL="0" distR="0" wp14:anchorId="65376DB2" wp14:editId="4D3FB4F7">
+            <wp:extent cx="3064510" cy="3007217"/>
+            <wp:effectExtent l="0" t="0" r="2540" b="3175"/>
             <wp:docPr id="443915588" name="Picture 2"/>
             <wp:cNvGraphicFramePr>
               <a:graphicFrameLocks xmlns:a="http://schemas.openxmlformats.org/drawingml/2006/main" noChangeAspect="1"/>
@@ -792,7 +767,7 @@
                   <pic:spPr>
                     <a:xfrm>
                       <a:off x="0" y="0"/>
-                      <a:ext cx="3064510" cy="3080385"/>
+                      <a:ext cx="3067022" cy="3009682"/>
                     </a:xfrm>
                     <a:prstGeom prst="rect">
                       <a:avLst/>
@@ -824,7 +799,7 @@
     </w:p>
     <w:tbl>
       <w:tblPr>
-        <w:tblW w:w="0" w:type="auto"/>
+        <w:tblW w:w="5042" w:type="dxa"/>
         <w:jc w:val="center"/>
         <w:tblBorders>
           <w:top w:val="single" w:sz="4" w:space="0" w:color="999999"/>
@@ -838,12 +813,12 @@
         <w:tblLook w:val="04A0" w:firstRow="1" w:lastRow="0" w:firstColumn="1" w:lastColumn="0" w:noHBand="0" w:noVBand="1"/>
       </w:tblPr>
       <w:tblGrid>
-        <w:gridCol w:w="828"/>
+        <w:gridCol w:w="805"/>
         <w:gridCol w:w="990"/>
         <w:gridCol w:w="630"/>
         <w:gridCol w:w="900"/>
-        <w:gridCol w:w="990"/>
-        <w:gridCol w:w="704"/>
+        <w:gridCol w:w="900"/>
+        <w:gridCol w:w="817"/>
       </w:tblGrid>
       <w:tr>
         <w:trPr>
@@ -851,7 +826,7 @@
         </w:trPr>
         <w:tc>
           <w:tcPr>
-            <w:tcW w:w="828" w:type="dxa"/>
+            <w:tcW w:w="805" w:type="dxa"/>
           </w:tcPr>
           <w:p>
             <w:pPr>
@@ -903,7 +878,7 @@
         </w:tc>
         <w:tc>
           <w:tcPr>
-            <w:tcW w:w="990" w:type="dxa"/>
+            <w:tcW w:w="900" w:type="dxa"/>
           </w:tcPr>
           <w:p>
             <w:pPr>
@@ -916,7 +891,7 @@
         </w:tc>
         <w:tc>
           <w:tcPr>
-            <w:tcW w:w="704" w:type="dxa"/>
+            <w:tcW w:w="817" w:type="dxa"/>
           </w:tcPr>
           <w:p>
             <w:pPr>
@@ -934,7 +909,7 @@
         </w:trPr>
         <w:tc>
           <w:tcPr>
-            <w:tcW w:w="828" w:type="dxa"/>
+            <w:tcW w:w="805" w:type="dxa"/>
           </w:tcPr>
           <w:p>
             <w:pPr>
@@ -986,7 +961,7 @@
         </w:tc>
         <w:tc>
           <w:tcPr>
-            <w:tcW w:w="990" w:type="dxa"/>
+            <w:tcW w:w="900" w:type="dxa"/>
           </w:tcPr>
           <w:p>
             <w:pPr>
@@ -999,7 +974,7 @@
         </w:tc>
         <w:tc>
           <w:tcPr>
-            <w:tcW w:w="704" w:type="dxa"/>
+            <w:tcW w:w="817" w:type="dxa"/>
           </w:tcPr>
           <w:p>
             <w:pPr>
@@ -1017,7 +992,7 @@
         </w:trPr>
         <w:tc>
           <w:tcPr>
-            <w:tcW w:w="828" w:type="dxa"/>
+            <w:tcW w:w="805" w:type="dxa"/>
           </w:tcPr>
           <w:p>
             <w:pPr>
@@ -1069,7 +1044,7 @@
         </w:tc>
         <w:tc>
           <w:tcPr>
-            <w:tcW w:w="990" w:type="dxa"/>
+            <w:tcW w:w="900" w:type="dxa"/>
           </w:tcPr>
           <w:p>
             <w:pPr>
@@ -1082,7 +1057,7 @@
         </w:tc>
         <w:tc>
           <w:tcPr>
-            <w:tcW w:w="704" w:type="dxa"/>
+            <w:tcW w:w="817" w:type="dxa"/>
           </w:tcPr>
           <w:p>
             <w:pPr>
@@ -1118,9 +1093,9 @@
         <w:tblLook w:val="04A0" w:firstRow="1" w:lastRow="0" w:firstColumn="1" w:lastColumn="0" w:noHBand="0" w:noVBand="1"/>
       </w:tblPr>
       <w:tblGrid>
-        <w:gridCol w:w="1634"/>
-        <w:gridCol w:w="1591"/>
-        <w:gridCol w:w="1591"/>
+        <w:gridCol w:w="1667"/>
+        <w:gridCol w:w="1625"/>
+        <w:gridCol w:w="1625"/>
       </w:tblGrid>
       <w:tr>
         <w:trPr>
@@ -1540,7 +1515,7 @@
         <w:pStyle w:val="BodyText"/>
       </w:pPr>
       <w:r>
-        <w:t>Metrics included AUROC, AUPRC, accuracy, balanced accuracy, sensitivity, specificity, precision or positive predictive value, negative predictive value, F1 score, Matthews correlation coefficient, Brier score, calibration intercept, calibration slope, confusion matrix, and threshold analysis. Bootstrap confidence intervals were calculated for key pooled held-out predictions. Generated artifacts include ROC, precision-recall, calibration, decision-curve, confusion-matrix, missingness, distribution, feature-importance, and SHAP-style figures.</w:t>
+        <w:t>Metrics included AUROC, AUPRC, accuracy, balanced accuracy, sensitivity, specificity, precision or positive predictive value, negative predictive value, F1 score, Matthews correlation coefficient, Brier score, calibration intercept, calibration slope, confusion matrix, and threshold analysis. Bootstrap confidence intervals were calculated for key pooled held-out predictions. Generated artifacts include ROC, precision-recall, calibration, decision-curve, threshold-sensitivity, probability-distribution, confusion-matrix, learning-curve, statistical-test, missingness, distribution, feature-importance, and SHAP-style figures.</w:t>
       </w:r>
     </w:p>
     <w:p>
@@ -1564,7 +1539,7 @@
         <w:pStyle w:val="BodyText"/>
       </w:pPr>
       <w:r>
-        <w:t>The data audit showed that the primary dataset is small and heterogeneous but useful for a site-aware laboratory study. Cleveland and Hungary contain more balanced disease distributions, whereas Switzerland and VA Long Beach have higher disease prevalence. This center imbalance is exactly why a random split would be a weak main result: randomization could mix site-specific patterns into both training and test data.</w:t>
+        <w:t>Data audit revealed that the main data is small in size and heterogeneous in nature but it can be utilized for site aware study in laboratory. The disease prevalence is higher in Switzerland and VA Long Beach, and more balanced in Cleveland and Hungary. It is precisely because of this site imbalance that a random split would be a poor primary result: site specific patterns could be mixed together in the training and test sets.</w:t>
       </w:r>
     </w:p>
     <w:p>
@@ -1572,7 +1547,55 @@
         <w:pStyle w:val="BodyText"/>
       </w:pPr>
       <w:r>
-        <w:t>Missingness was clinically and methodologically important. The most incomplete variables were ca (66.4% missing), thal (52.8%), slope (33.6%), fbs (9.8%), oldpeak (6.7%), trestbps (6.4%), exang (6.0%), and thalach (6.0%). Since these missing values can be center-dependent, imputation was deliberately performed inside each training fold.</w:t>
+        <w:t xml:space="preserve">Clinically and methodologically, missingness was important. The most incomplete variables were ca (66.4% missing), </w:t>
+      </w:r>
+      <w:proofErr w:type="spellStart"/>
+      <w:r>
+        <w:t>thal</w:t>
+      </w:r>
+      <w:proofErr w:type="spellEnd"/>
+      <w:r>
+        <w:t xml:space="preserve"> (52.8%), slope (33.6%), </w:t>
+      </w:r>
+      <w:proofErr w:type="spellStart"/>
+      <w:r>
+        <w:t>fbs</w:t>
+      </w:r>
+      <w:proofErr w:type="spellEnd"/>
+      <w:r>
+        <w:t xml:space="preserve"> (9.8%), </w:t>
+      </w:r>
+      <w:proofErr w:type="spellStart"/>
+      <w:r>
+        <w:t>oldpeak</w:t>
+      </w:r>
+      <w:proofErr w:type="spellEnd"/>
+      <w:r>
+        <w:t xml:space="preserve"> (6.7%), </w:t>
+      </w:r>
+      <w:proofErr w:type="spellStart"/>
+      <w:r>
+        <w:t>trestbps</w:t>
+      </w:r>
+      <w:proofErr w:type="spellEnd"/>
+      <w:r>
+        <w:t xml:space="preserve"> (6.4%), </w:t>
+      </w:r>
+      <w:proofErr w:type="spellStart"/>
+      <w:r>
+        <w:t>exang</w:t>
+      </w:r>
+      <w:proofErr w:type="spellEnd"/>
+      <w:r>
+        <w:t xml:space="preserve"> (6.0%), and </w:t>
+      </w:r>
+      <w:proofErr w:type="spellStart"/>
+      <w:r>
+        <w:t>thalach</w:t>
+      </w:r>
+      <w:proofErr w:type="spellEnd"/>
+      <w:r>
+        <w:t xml:space="preserve"> (6.0%). These missing values might be “center-dependent”, so specific care was taken to impute the values within each fold for training.</w:t>
       </w:r>
     </w:p>
     <w:p>
@@ -1580,10 +1603,7 @@
         <w:pStyle w:val="BodyText"/>
       </w:pPr>
       <w:r>
-        <w:t xml:space="preserve">The primary model comparison did not support choosing the neural network as the final model. Calibrated gradient </w:t>
-      </w:r>
-      <w:r>
-        <w:t>boosting had the highest mean AUROC, but penalized logistic regression achieved the best overall compromise after considering AUPRC, Brier score, balanced accuracy, MCC, calibration behavior, and interpretability. This is consistent with the practical lesson that small tabular clinical datasets do not automatically benefit from deeper models.</w:t>
+        <w:t>There was no strong evidence in the primary model comparison for selecting the neural network model. RBF SVM showed the best mean AUROC and AUPRC values, while it showed a poor specificity and a good balanced accuracy value at the chosen threshold. Using discrimination, Brier score, F1, MCC, calibration slope, center stability and interpretability as criteria, calibrated gradient boosting was the top performer and ranked best in the composite scores. This is in line with the practical lesson that it is not always possible to get more from a deeper model when the data is limited.</w:t>
       </w:r>
     </w:p>
     <w:p>
@@ -1591,7 +1611,7 @@
         <w:pStyle w:val="BodyText"/>
       </w:pPr>
       <w:r>
-        <w:t>For pooled held-out-center predictions, the selected logistic regression model achieved AUROC 0.855, AUPRC 0.864, Brier score 0.159, and balanced accuracy 0.785. At threshold 0.50, sensitivity was 0.729 and specificity was 0.842. Lowering the threshold to 0.30 increased sensitivity but reduced specificity; raising it to 0.70 did the opposite. Therefore, the application reports a probability and risk category rather than claiming a universal diagnostic threshold.</w:t>
+        <w:t>The AUROC, AUPRC, Brier score, and balanced accuracy of the model selected after calibration using gradient boosting were 0.859, 0.866, 0.152, and 0.784 respectively for the task of prediction for pooled held-out centers. Sensitivity at threshold value 0.50 was 0.806 and the specificity was 0.762. A decrease of the threshold from 0.30 will increase sensitivity at the cost of decreasing specificity, and vice versa. Thus, the application does not state a diagnostic threshold but reports probability and risk categories instead.</w:t>
       </w:r>
     </w:p>
     <w:p>
@@ -1599,7 +1619,7 @@
         <w:pStyle w:val="BodyText"/>
       </w:pPr>
       <w:r>
-        <w:t>Center-wise results showed important generalizability differences. Performance was strongest for Cleveland and Hungary, lower for Switzerland and VA Long Beach, and calibration was not uniform across sites. These results are scientifically useful because they show where the public dataset is fragile. The project therefore presents the model as a benchmark and decision-support prototype for education, not as a clinical device.</w:t>
+        <w:t>There was a significant generalizability difference between center-wise results. Calibration did not occur evenly across sites, and performance was highest for the Cleveland and Hungary sites and lower for the Switzerland and VA Long Beach sites. The findings are scientifically valuable since they indicate the weakness of the public dataset. The project consequently proposes the model as a benchmark and prototype for decision support or education, but not as a clinical device.</w:t>
       </w:r>
     </w:p>
     <w:p>
@@ -1607,13 +1627,24 @@
         <w:pStyle w:val="BodyText"/>
       </w:pPr>
       <w:r>
-        <w:t>The explanation analysis identified chest pain type, sex, exercise-induced angina, thal category, ST slope, oldpeak, cholesterol, and fasting blood sugar as influential variables. These are plausible for a heart-disease benchmark, but the interpretation remains associational. The explanation layer is meant to answer why the model produced a prediction for the entered profile in terms of learned patterns, not to replace clinical judgment.</w:t>
+        <w:t xml:space="preserve">The explanation analysis revealed that the following variables, chest pain type, cholesterol, </w:t>
       </w:r>
-    </w:p>
-    <w:p>
-      <w:pPr>
-        <w:pStyle w:val="BodyText"/>
-      </w:pPr>
+      <w:proofErr w:type="spellStart"/>
+      <w:r>
+        <w:t>oldpeak</w:t>
+      </w:r>
+      <w:proofErr w:type="spellEnd"/>
+      <w:r>
+        <w:t xml:space="preserve">, exercise-induced angina, sex, age, </w:t>
+      </w:r>
+      <w:proofErr w:type="spellStart"/>
+      <w:r>
+        <w:t>thal</w:t>
+      </w:r>
+      <w:proofErr w:type="spellEnd"/>
+      <w:r>
+        <w:t xml:space="preserve"> category, and maximum heart rate were influential. These seem reasonable for a heart-disease benchmark, but are still association based. The purpose of the explanation layer is not to take the place of clinical judgment but to explain why the model has predicted the entered profile, based on learned patterns.</w:t>
+      </w:r>
     </w:p>
     <w:p>
       <w:pPr>
@@ -1625,7 +1656,7 @@
     </w:p>
     <w:tbl>
       <w:tblPr>
-        <w:tblW w:w="0" w:type="auto"/>
+        <w:tblW w:w="5003" w:type="dxa"/>
         <w:jc w:val="center"/>
         <w:tblBorders>
           <w:top w:val="single" w:sz="4" w:space="0" w:color="999999"/>
@@ -1638,12 +1669,12 @@
         <w:tblLook w:val="04A0" w:firstRow="1" w:lastRow="0" w:firstColumn="1" w:lastColumn="0" w:noHBand="0" w:noVBand="1"/>
       </w:tblPr>
       <w:tblGrid>
-        <w:gridCol w:w="964"/>
-        <w:gridCol w:w="893"/>
-        <w:gridCol w:w="869"/>
-        <w:gridCol w:w="693"/>
-        <w:gridCol w:w="688"/>
-        <w:gridCol w:w="709"/>
+        <w:gridCol w:w="1105"/>
+        <w:gridCol w:w="950"/>
+        <w:gridCol w:w="916"/>
+        <w:gridCol w:w="672"/>
+        <w:gridCol w:w="666"/>
+        <w:gridCol w:w="694"/>
       </w:tblGrid>
       <w:tr>
         <w:trPr>
@@ -1651,78 +1682,78 @@
         </w:trPr>
         <w:tc>
           <w:tcPr>
-            <w:tcW w:w="1721" w:type="dxa"/>
-          </w:tcPr>
-          <w:p>
-            <w:pPr>
-              <w:pStyle w:val="tablecolhead"/>
-            </w:pPr>
-            <w:r>
+            <w:tcW w:w="1105" w:type="dxa"/>
+          </w:tcPr>
+          <w:p>
+            <w:r>
+              <w:rPr>
+                <w:b/>
+              </w:rPr>
               <w:t>Model</w:t>
             </w:r>
           </w:p>
         </w:tc>
         <w:tc>
           <w:tcPr>
-            <w:tcW w:w="1721" w:type="dxa"/>
-          </w:tcPr>
-          <w:p>
-            <w:pPr>
-              <w:pStyle w:val="tablecolhead"/>
-            </w:pPr>
-            <w:r>
+            <w:tcW w:w="950" w:type="dxa"/>
+          </w:tcPr>
+          <w:p>
+            <w:r>
+              <w:rPr>
+                <w:b/>
+              </w:rPr>
               <w:t>AUROC</w:t>
             </w:r>
           </w:p>
         </w:tc>
         <w:tc>
           <w:tcPr>
-            <w:tcW w:w="1721" w:type="dxa"/>
-          </w:tcPr>
-          <w:p>
-            <w:pPr>
-              <w:pStyle w:val="tablecolhead"/>
-            </w:pPr>
-            <w:r>
+            <w:tcW w:w="916" w:type="dxa"/>
+          </w:tcPr>
+          <w:p>
+            <w:r>
+              <w:rPr>
+                <w:b/>
+              </w:rPr>
               <w:t>AUPRC</w:t>
             </w:r>
           </w:p>
         </w:tc>
         <w:tc>
           <w:tcPr>
-            <w:tcW w:w="1721" w:type="dxa"/>
-          </w:tcPr>
-          <w:p>
-            <w:pPr>
-              <w:pStyle w:val="tablecolhead"/>
-            </w:pPr>
-            <w:r>
+            <w:tcW w:w="672" w:type="dxa"/>
+          </w:tcPr>
+          <w:p>
+            <w:r>
+              <w:rPr>
+                <w:b/>
+              </w:rPr>
               <w:t>Brier</w:t>
             </w:r>
           </w:p>
         </w:tc>
         <w:tc>
           <w:tcPr>
-            <w:tcW w:w="1721" w:type="dxa"/>
-          </w:tcPr>
-          <w:p>
-            <w:pPr>
-              <w:pStyle w:val="tablecolhead"/>
-            </w:pPr>
-            <w:r>
+            <w:tcW w:w="666" w:type="dxa"/>
+          </w:tcPr>
+          <w:p>
+            <w:r>
+              <w:rPr>
+                <w:b/>
+              </w:rPr>
               <w:t>Bal. Acc.</w:t>
             </w:r>
           </w:p>
         </w:tc>
         <w:tc>
           <w:tcPr>
-            <w:tcW w:w="1721" w:type="dxa"/>
-          </w:tcPr>
-          <w:p>
-            <w:pPr>
-              <w:pStyle w:val="tablecolhead"/>
-            </w:pPr>
-            <w:r>
+            <w:tcW w:w="694" w:type="dxa"/>
+          </w:tcPr>
+          <w:p>
+            <w:r>
+              <w:rPr>
+                <w:b/>
+              </w:rPr>
               <w:t>MCC</w:t>
             </w:r>
           </w:p>
@@ -1734,79 +1765,61 @@
         </w:trPr>
         <w:tc>
           <w:tcPr>
-            <w:tcW w:w="1721" w:type="dxa"/>
-          </w:tcPr>
-          <w:p>
-            <w:pPr>
-              <w:pStyle w:val="tablecopy"/>
-            </w:pPr>
-            <w:r>
-              <w:t>Penalized logistic regression</w:t>
-            </w:r>
-          </w:p>
-        </w:tc>
-        <w:tc>
-          <w:tcPr>
-            <w:tcW w:w="1721" w:type="dxa"/>
-          </w:tcPr>
-          <w:p>
-            <w:pPr>
-              <w:pStyle w:val="tablecopy"/>
-            </w:pPr>
-            <w:r>
-              <w:t>0.799</w:t>
-            </w:r>
-          </w:p>
-        </w:tc>
-        <w:tc>
-          <w:tcPr>
-            <w:tcW w:w="1721" w:type="dxa"/>
-          </w:tcPr>
-          <w:p>
-            <w:pPr>
-              <w:pStyle w:val="tablecopy"/>
-            </w:pPr>
-            <w:r>
-              <w:t>0.880</w:t>
-            </w:r>
-          </w:p>
-        </w:tc>
-        <w:tc>
-          <w:tcPr>
-            <w:tcW w:w="1721" w:type="dxa"/>
-          </w:tcPr>
-          <w:p>
-            <w:pPr>
-              <w:pStyle w:val="tablecopy"/>
-            </w:pPr>
-            <w:r>
-              <w:t>0.168</w:t>
-            </w:r>
-          </w:p>
-        </w:tc>
-        <w:tc>
-          <w:tcPr>
-            <w:tcW w:w="1721" w:type="dxa"/>
-          </w:tcPr>
-          <w:p>
-            <w:pPr>
-              <w:pStyle w:val="tablecopy"/>
-            </w:pPr>
-            <w:r>
-              <w:t>0.745</w:t>
-            </w:r>
-          </w:p>
-        </w:tc>
-        <w:tc>
-          <w:tcPr>
-            <w:tcW w:w="1721" w:type="dxa"/>
-          </w:tcPr>
-          <w:p>
-            <w:pPr>
-              <w:pStyle w:val="tablecopy"/>
-            </w:pPr>
-            <w:r>
-              <w:t>0.441</w:t>
+            <w:tcW w:w="1105" w:type="dxa"/>
+          </w:tcPr>
+          <w:p>
+            <w:r>
+              <w:t>Calibrated gradient boosting</w:t>
+            </w:r>
+          </w:p>
+        </w:tc>
+        <w:tc>
+          <w:tcPr>
+            <w:tcW w:w="950" w:type="dxa"/>
+          </w:tcPr>
+          <w:p>
+            <w:r>
+              <w:t>0.808</w:t>
+            </w:r>
+          </w:p>
+        </w:tc>
+        <w:tc>
+          <w:tcPr>
+            <w:tcW w:w="916" w:type="dxa"/>
+          </w:tcPr>
+          <w:p>
+            <w:r>
+              <w:t>0.882</w:t>
+            </w:r>
+          </w:p>
+        </w:tc>
+        <w:tc>
+          <w:tcPr>
+            <w:tcW w:w="672" w:type="dxa"/>
+          </w:tcPr>
+          <w:p>
+            <w:r>
+              <w:t>0.155</w:t>
+            </w:r>
+          </w:p>
+        </w:tc>
+        <w:tc>
+          <w:tcPr>
+            <w:tcW w:w="666" w:type="dxa"/>
+          </w:tcPr>
+          <w:p>
+            <w:r>
+              <w:t>0.744</w:t>
+            </w:r>
+          </w:p>
+        </w:tc>
+        <w:tc>
+          <w:tcPr>
+            <w:tcW w:w="694" w:type="dxa"/>
+          </w:tcPr>
+          <w:p>
+            <w:r>
+              <w:t>0.439</w:t>
             </w:r>
           </w:p>
         </w:tc>
@@ -1817,79 +1830,61 @@
         </w:trPr>
         <w:tc>
           <w:tcPr>
-            <w:tcW w:w="1721" w:type="dxa"/>
-          </w:tcPr>
-          <w:p>
-            <w:pPr>
-              <w:pStyle w:val="tablecopy"/>
-            </w:pPr>
-            <w:r>
-              <w:t>Calibrated gradient boosting</w:t>
-            </w:r>
-          </w:p>
-        </w:tc>
-        <w:tc>
-          <w:tcPr>
-            <w:tcW w:w="1721" w:type="dxa"/>
-          </w:tcPr>
-          <w:p>
-            <w:pPr>
-              <w:pStyle w:val="tablecopy"/>
-            </w:pPr>
-            <w:r>
-              <w:t>0.809</w:t>
-            </w:r>
-          </w:p>
-        </w:tc>
-        <w:tc>
-          <w:tcPr>
-            <w:tcW w:w="1721" w:type="dxa"/>
-          </w:tcPr>
-          <w:p>
-            <w:pPr>
-              <w:pStyle w:val="tablecopy"/>
-            </w:pPr>
-            <w:r>
-              <w:t>0.877</w:t>
-            </w:r>
-          </w:p>
-        </w:tc>
-        <w:tc>
-          <w:tcPr>
-            <w:tcW w:w="1721" w:type="dxa"/>
-          </w:tcPr>
-          <w:p>
-            <w:pPr>
-              <w:pStyle w:val="tablecopy"/>
-            </w:pPr>
-            <w:r>
-              <w:t>0.174</w:t>
-            </w:r>
-          </w:p>
-        </w:tc>
-        <w:tc>
-          <w:tcPr>
-            <w:tcW w:w="1721" w:type="dxa"/>
-          </w:tcPr>
-          <w:p>
-            <w:pPr>
-              <w:pStyle w:val="tablecopy"/>
-            </w:pPr>
-            <w:r>
-              <w:t>0.714</w:t>
-            </w:r>
-          </w:p>
-        </w:tc>
-        <w:tc>
-          <w:tcPr>
-            <w:tcW w:w="1721" w:type="dxa"/>
-          </w:tcPr>
-          <w:p>
-            <w:pPr>
-              <w:pStyle w:val="tablecopy"/>
-            </w:pPr>
-            <w:r>
-              <w:t>0.385</w:t>
+            <w:tcW w:w="1105" w:type="dxa"/>
+          </w:tcPr>
+          <w:p>
+            <w:r>
+              <w:t>RBF SVM</w:t>
+            </w:r>
+          </w:p>
+        </w:tc>
+        <w:tc>
+          <w:tcPr>
+            <w:tcW w:w="950" w:type="dxa"/>
+          </w:tcPr>
+          <w:p>
+            <w:r>
+              <w:t>0.813</w:t>
+            </w:r>
+          </w:p>
+        </w:tc>
+        <w:tc>
+          <w:tcPr>
+            <w:tcW w:w="916" w:type="dxa"/>
+          </w:tcPr>
+          <w:p>
+            <w:r>
+              <w:t>0.883</w:t>
+            </w:r>
+          </w:p>
+        </w:tc>
+        <w:tc>
+          <w:tcPr>
+            <w:tcW w:w="672" w:type="dxa"/>
+          </w:tcPr>
+          <w:p>
+            <w:r>
+              <w:t>0.162</w:t>
+            </w:r>
+          </w:p>
+        </w:tc>
+        <w:tc>
+          <w:tcPr>
+            <w:tcW w:w="666" w:type="dxa"/>
+          </w:tcPr>
+          <w:p>
+            <w:r>
+              <w:t>0.678</w:t>
+            </w:r>
+          </w:p>
+        </w:tc>
+        <w:tc>
+          <w:tcPr>
+            <w:tcW w:w="694" w:type="dxa"/>
+          </w:tcPr>
+          <w:p>
+            <w:r>
+              <w:t>0.392</w:t>
             </w:r>
           </w:p>
         </w:tc>
@@ -1900,12 +1895,9 @@
         </w:trPr>
         <w:tc>
           <w:tcPr>
-            <w:tcW w:w="1721" w:type="dxa"/>
-          </w:tcPr>
-          <w:p>
-            <w:pPr>
-              <w:pStyle w:val="tablecopy"/>
-            </w:pPr>
+            <w:tcW w:w="1105" w:type="dxa"/>
+          </w:tcPr>
+          <w:p>
             <w:r>
               <w:t>Random forest</w:t>
             </w:r>
@@ -1913,66 +1905,51 @@
         </w:tc>
         <w:tc>
           <w:tcPr>
-            <w:tcW w:w="1721" w:type="dxa"/>
-          </w:tcPr>
-          <w:p>
-            <w:pPr>
-              <w:pStyle w:val="tablecopy"/>
-            </w:pPr>
-            <w:r>
-              <w:t>0.800</w:t>
-            </w:r>
-          </w:p>
-        </w:tc>
-        <w:tc>
-          <w:tcPr>
-            <w:tcW w:w="1721" w:type="dxa"/>
-          </w:tcPr>
-          <w:p>
-            <w:pPr>
-              <w:pStyle w:val="tablecopy"/>
-            </w:pPr>
-            <w:r>
-              <w:t>0.873</w:t>
-            </w:r>
-          </w:p>
-        </w:tc>
-        <w:tc>
-          <w:tcPr>
-            <w:tcW w:w="1721" w:type="dxa"/>
-          </w:tcPr>
-          <w:p>
-            <w:pPr>
-              <w:pStyle w:val="tablecopy"/>
-            </w:pPr>
-            <w:r>
-              <w:t>0.170</w:t>
-            </w:r>
-          </w:p>
-        </w:tc>
-        <w:tc>
-          <w:tcPr>
-            <w:tcW w:w="1721" w:type="dxa"/>
-          </w:tcPr>
-          <w:p>
-            <w:pPr>
-              <w:pStyle w:val="tablecopy"/>
-            </w:pPr>
-            <w:r>
-              <w:t>0.716</w:t>
-            </w:r>
-          </w:p>
-        </w:tc>
-        <w:tc>
-          <w:tcPr>
-            <w:tcW w:w="1721" w:type="dxa"/>
-          </w:tcPr>
-          <w:p>
-            <w:pPr>
-              <w:pStyle w:val="tablecopy"/>
-            </w:pPr>
-            <w:r>
-              <w:t>0.387</w:t>
+            <w:tcW w:w="950" w:type="dxa"/>
+          </w:tcPr>
+          <w:p>
+            <w:r>
+              <w:t>0.803</w:t>
+            </w:r>
+          </w:p>
+        </w:tc>
+        <w:tc>
+          <w:tcPr>
+            <w:tcW w:w="916" w:type="dxa"/>
+          </w:tcPr>
+          <w:p>
+            <w:r>
+              <w:t>0.875</w:t>
+            </w:r>
+          </w:p>
+        </w:tc>
+        <w:tc>
+          <w:tcPr>
+            <w:tcW w:w="672" w:type="dxa"/>
+          </w:tcPr>
+          <w:p>
+            <w:r>
+              <w:t>0.168</w:t>
+            </w:r>
+          </w:p>
+        </w:tc>
+        <w:tc>
+          <w:tcPr>
+            <w:tcW w:w="666" w:type="dxa"/>
+          </w:tcPr>
+          <w:p>
+            <w:r>
+              <w:t>0.729</w:t>
+            </w:r>
+          </w:p>
+        </w:tc>
+        <w:tc>
+          <w:tcPr>
+            <w:tcW w:w="694" w:type="dxa"/>
+          </w:tcPr>
+          <w:p>
+            <w:r>
+              <w:t>0.409</w:t>
             </w:r>
           </w:p>
         </w:tc>
@@ -1983,51 +1960,39 @@
         </w:trPr>
         <w:tc>
           <w:tcPr>
-            <w:tcW w:w="1721" w:type="dxa"/>
-          </w:tcPr>
-          <w:p>
-            <w:pPr>
-              <w:pStyle w:val="tablecopy"/>
-            </w:pPr>
-            <w:r>
-              <w:t>Gradient boosting</w:t>
-            </w:r>
-          </w:p>
-        </w:tc>
-        <w:tc>
-          <w:tcPr>
-            <w:tcW w:w="1721" w:type="dxa"/>
-          </w:tcPr>
-          <w:p>
-            <w:pPr>
-              <w:pStyle w:val="tablecopy"/>
-            </w:pPr>
-            <w:r>
-              <w:t>0.793</w:t>
-            </w:r>
-          </w:p>
-        </w:tc>
-        <w:tc>
-          <w:tcPr>
-            <w:tcW w:w="1721" w:type="dxa"/>
-          </w:tcPr>
-          <w:p>
-            <w:pPr>
-              <w:pStyle w:val="tablecopy"/>
-            </w:pPr>
-            <w:r>
-              <w:t>0.861</w:t>
-            </w:r>
-          </w:p>
-        </w:tc>
-        <w:tc>
-          <w:tcPr>
-            <w:tcW w:w="1721" w:type="dxa"/>
-          </w:tcPr>
-          <w:p>
-            <w:pPr>
-              <w:pStyle w:val="tablecopy"/>
-            </w:pPr>
+            <w:tcW w:w="1105" w:type="dxa"/>
+          </w:tcPr>
+          <w:p>
+            <w:r>
+              <w:t>Penalized logistic regression</w:t>
+            </w:r>
+          </w:p>
+        </w:tc>
+        <w:tc>
+          <w:tcPr>
+            <w:tcW w:w="950" w:type="dxa"/>
+          </w:tcPr>
+          <w:p>
+            <w:r>
+              <w:t>0.780</w:t>
+            </w:r>
+          </w:p>
+        </w:tc>
+        <w:tc>
+          <w:tcPr>
+            <w:tcW w:w="916" w:type="dxa"/>
+          </w:tcPr>
+          <w:p>
+            <w:r>
+              <w:t>0.871</w:t>
+            </w:r>
+          </w:p>
+        </w:tc>
+        <w:tc>
+          <w:tcPr>
+            <w:tcW w:w="672" w:type="dxa"/>
+          </w:tcPr>
+          <w:p>
             <w:r>
               <w:t>0.180</w:t>
             </w:r>
@@ -2035,27 +2000,21 @@
         </w:tc>
         <w:tc>
           <w:tcPr>
-            <w:tcW w:w="1721" w:type="dxa"/>
-          </w:tcPr>
-          <w:p>
-            <w:pPr>
-              <w:pStyle w:val="tablecopy"/>
-            </w:pPr>
-            <w:r>
-              <w:t>0.732</w:t>
-            </w:r>
-          </w:p>
-        </w:tc>
-        <w:tc>
-          <w:tcPr>
-            <w:tcW w:w="1721" w:type="dxa"/>
-          </w:tcPr>
-          <w:p>
-            <w:pPr>
-              <w:pStyle w:val="tablecopy"/>
-            </w:pPr>
-            <w:r>
-              <w:t>0.410</w:t>
+            <w:tcW w:w="666" w:type="dxa"/>
+          </w:tcPr>
+          <w:p>
+            <w:r>
+              <w:t>0.734</w:t>
+            </w:r>
+          </w:p>
+        </w:tc>
+        <w:tc>
+          <w:tcPr>
+            <w:tcW w:w="694" w:type="dxa"/>
+          </w:tcPr>
+          <w:p>
+            <w:r>
+              <w:t>0.421</w:t>
             </w:r>
           </w:p>
         </w:tc>
@@ -2066,12 +2025,334 @@
         </w:trPr>
         <w:tc>
           <w:tcPr>
-            <w:tcW w:w="1721" w:type="dxa"/>
-          </w:tcPr>
-          <w:p>
-            <w:pPr>
-              <w:pStyle w:val="tablecopy"/>
-            </w:pPr>
+            <w:tcW w:w="1105" w:type="dxa"/>
+          </w:tcPr>
+          <w:p>
+            <w:r>
+              <w:t>Stacking ensemble</w:t>
+            </w:r>
+          </w:p>
+        </w:tc>
+        <w:tc>
+          <w:tcPr>
+            <w:tcW w:w="950" w:type="dxa"/>
+          </w:tcPr>
+          <w:p>
+            <w:r>
+              <w:t>0.786</w:t>
+            </w:r>
+          </w:p>
+        </w:tc>
+        <w:tc>
+          <w:tcPr>
+            <w:tcW w:w="916" w:type="dxa"/>
+          </w:tcPr>
+          <w:p>
+            <w:r>
+              <w:t>0.863</w:t>
+            </w:r>
+          </w:p>
+        </w:tc>
+        <w:tc>
+          <w:tcPr>
+            <w:tcW w:w="672" w:type="dxa"/>
+          </w:tcPr>
+          <w:p>
+            <w:r>
+              <w:t>0.176</w:t>
+            </w:r>
+          </w:p>
+        </w:tc>
+        <w:tc>
+          <w:tcPr>
+            <w:tcW w:w="666" w:type="dxa"/>
+          </w:tcPr>
+          <w:p>
+            <w:r>
+              <w:t>0.736</w:t>
+            </w:r>
+          </w:p>
+        </w:tc>
+        <w:tc>
+          <w:tcPr>
+            <w:tcW w:w="694" w:type="dxa"/>
+          </w:tcPr>
+          <w:p>
+            <w:r>
+              <w:t>0.414</w:t>
+            </w:r>
+          </w:p>
+        </w:tc>
+      </w:tr>
+      <w:tr>
+        <w:trPr>
+          <w:jc w:val="center"/>
+        </w:trPr>
+        <w:tc>
+          <w:tcPr>
+            <w:tcW w:w="1105" w:type="dxa"/>
+          </w:tcPr>
+          <w:p>
+            <w:r>
+              <w:t>CatBoost</w:t>
+            </w:r>
+          </w:p>
+        </w:tc>
+        <w:tc>
+          <w:tcPr>
+            <w:tcW w:w="950" w:type="dxa"/>
+          </w:tcPr>
+          <w:p>
+            <w:r>
+              <w:t>0.792</w:t>
+            </w:r>
+          </w:p>
+        </w:tc>
+        <w:tc>
+          <w:tcPr>
+            <w:tcW w:w="916" w:type="dxa"/>
+          </w:tcPr>
+          <w:p>
+            <w:r>
+              <w:t>0.871</w:t>
+            </w:r>
+          </w:p>
+        </w:tc>
+        <w:tc>
+          <w:tcPr>
+            <w:tcW w:w="672" w:type="dxa"/>
+          </w:tcPr>
+          <w:p>
+            <w:r>
+              <w:t>0.176</w:t>
+            </w:r>
+          </w:p>
+        </w:tc>
+        <w:tc>
+          <w:tcPr>
+            <w:tcW w:w="666" w:type="dxa"/>
+          </w:tcPr>
+          <w:p>
+            <w:r>
+              <w:t>0.719</w:t>
+            </w:r>
+          </w:p>
+        </w:tc>
+        <w:tc>
+          <w:tcPr>
+            <w:tcW w:w="694" w:type="dxa"/>
+          </w:tcPr>
+          <w:p>
+            <w:r>
+              <w:t>0.393</w:t>
+            </w:r>
+          </w:p>
+        </w:tc>
+      </w:tr>
+      <w:tr>
+        <w:trPr>
+          <w:jc w:val="center"/>
+        </w:trPr>
+        <w:tc>
+          <w:tcPr>
+            <w:tcW w:w="1105" w:type="dxa"/>
+          </w:tcPr>
+          <w:p>
+            <w:r>
+              <w:t>Gradient boosting</w:t>
+            </w:r>
+          </w:p>
+        </w:tc>
+        <w:tc>
+          <w:tcPr>
+            <w:tcW w:w="950" w:type="dxa"/>
+          </w:tcPr>
+          <w:p>
+            <w:r>
+              <w:t>0.794</w:t>
+            </w:r>
+          </w:p>
+        </w:tc>
+        <w:tc>
+          <w:tcPr>
+            <w:tcW w:w="916" w:type="dxa"/>
+          </w:tcPr>
+          <w:p>
+            <w:r>
+              <w:t>0.864</w:t>
+            </w:r>
+          </w:p>
+        </w:tc>
+        <w:tc>
+          <w:tcPr>
+            <w:tcW w:w="672" w:type="dxa"/>
+          </w:tcPr>
+          <w:p>
+            <w:r>
+              <w:t>0.185</w:t>
+            </w:r>
+          </w:p>
+        </w:tc>
+        <w:tc>
+          <w:tcPr>
+            <w:tcW w:w="666" w:type="dxa"/>
+          </w:tcPr>
+          <w:p>
+            <w:r>
+              <w:t>0.735</w:t>
+            </w:r>
+          </w:p>
+        </w:tc>
+        <w:tc>
+          <w:tcPr>
+            <w:tcW w:w="694" w:type="dxa"/>
+          </w:tcPr>
+          <w:p>
+            <w:r>
+              <w:t>0.404</w:t>
+            </w:r>
+          </w:p>
+        </w:tc>
+      </w:tr>
+      <w:tr>
+        <w:trPr>
+          <w:jc w:val="center"/>
+        </w:trPr>
+        <w:tc>
+          <w:tcPr>
+            <w:tcW w:w="1105" w:type="dxa"/>
+          </w:tcPr>
+          <w:p>
+            <w:r>
+              <w:t>XGBoost</w:t>
+            </w:r>
+          </w:p>
+        </w:tc>
+        <w:tc>
+          <w:tcPr>
+            <w:tcW w:w="950" w:type="dxa"/>
+          </w:tcPr>
+          <w:p>
+            <w:r>
+              <w:t>0.792</w:t>
+            </w:r>
+          </w:p>
+        </w:tc>
+        <w:tc>
+          <w:tcPr>
+            <w:tcW w:w="916" w:type="dxa"/>
+          </w:tcPr>
+          <w:p>
+            <w:r>
+              <w:t>0.871</w:t>
+            </w:r>
+          </w:p>
+        </w:tc>
+        <w:tc>
+          <w:tcPr>
+            <w:tcW w:w="672" w:type="dxa"/>
+          </w:tcPr>
+          <w:p>
+            <w:r>
+              <w:t>0.184</w:t>
+            </w:r>
+          </w:p>
+        </w:tc>
+        <w:tc>
+          <w:tcPr>
+            <w:tcW w:w="666" w:type="dxa"/>
+          </w:tcPr>
+          <w:p>
+            <w:r>
+              <w:t>0.694</w:t>
+            </w:r>
+          </w:p>
+        </w:tc>
+        <w:tc>
+          <w:tcPr>
+            <w:tcW w:w="694" w:type="dxa"/>
+          </w:tcPr>
+          <w:p>
+            <w:r>
+              <w:t>0.361</w:t>
+            </w:r>
+          </w:p>
+        </w:tc>
+      </w:tr>
+      <w:tr>
+        <w:trPr>
+          <w:jc w:val="center"/>
+        </w:trPr>
+        <w:tc>
+          <w:tcPr>
+            <w:tcW w:w="1105" w:type="dxa"/>
+          </w:tcPr>
+          <w:p>
+            <w:r>
+              <w:t>LightGBM</w:t>
+            </w:r>
+          </w:p>
+        </w:tc>
+        <w:tc>
+          <w:tcPr>
+            <w:tcW w:w="950" w:type="dxa"/>
+          </w:tcPr>
+          <w:p>
+            <w:r>
+              <w:t>0.772</w:t>
+            </w:r>
+          </w:p>
+        </w:tc>
+        <w:tc>
+          <w:tcPr>
+            <w:tcW w:w="916" w:type="dxa"/>
+          </w:tcPr>
+          <w:p>
+            <w:r>
+              <w:t>0.863</w:t>
+            </w:r>
+          </w:p>
+        </w:tc>
+        <w:tc>
+          <w:tcPr>
+            <w:tcW w:w="672" w:type="dxa"/>
+          </w:tcPr>
+          <w:p>
+            <w:r>
+              <w:t>0.182</w:t>
+            </w:r>
+          </w:p>
+        </w:tc>
+        <w:tc>
+          <w:tcPr>
+            <w:tcW w:w="666" w:type="dxa"/>
+          </w:tcPr>
+          <w:p>
+            <w:r>
+              <w:t>0.699</w:t>
+            </w:r>
+          </w:p>
+        </w:tc>
+        <w:tc>
+          <w:tcPr>
+            <w:tcW w:w="694" w:type="dxa"/>
+          </w:tcPr>
+          <w:p>
+            <w:r>
+              <w:t>0.370</w:t>
+            </w:r>
+          </w:p>
+        </w:tc>
+      </w:tr>
+      <w:tr>
+        <w:trPr>
+          <w:jc w:val="center"/>
+        </w:trPr>
+        <w:tc>
+          <w:tcPr>
+            <w:tcW w:w="1105" w:type="dxa"/>
+          </w:tcPr>
+          <w:p>
             <w:r>
               <w:t>MLP notebook baseline</w:t>
             </w:r>
@@ -2079,66 +2360,51 @@
         </w:tc>
         <w:tc>
           <w:tcPr>
-            <w:tcW w:w="1721" w:type="dxa"/>
-          </w:tcPr>
-          <w:p>
-            <w:pPr>
-              <w:pStyle w:val="tablecopy"/>
-            </w:pPr>
-            <w:r>
-              <w:t>0.779</w:t>
-            </w:r>
-          </w:p>
-        </w:tc>
-        <w:tc>
-          <w:tcPr>
-            <w:tcW w:w="1721" w:type="dxa"/>
-          </w:tcPr>
-          <w:p>
-            <w:pPr>
-              <w:pStyle w:val="tablecopy"/>
-            </w:pPr>
-            <w:r>
-              <w:t>0.858</w:t>
-            </w:r>
-          </w:p>
-        </w:tc>
-        <w:tc>
-          <w:tcPr>
-            <w:tcW w:w="1721" w:type="dxa"/>
-          </w:tcPr>
-          <w:p>
-            <w:pPr>
-              <w:pStyle w:val="tablecopy"/>
-            </w:pPr>
-            <w:r>
-              <w:t>0.187</w:t>
-            </w:r>
-          </w:p>
-        </w:tc>
-        <w:tc>
-          <w:tcPr>
-            <w:tcW w:w="1721" w:type="dxa"/>
-          </w:tcPr>
-          <w:p>
-            <w:pPr>
-              <w:pStyle w:val="tablecopy"/>
-            </w:pPr>
-            <w:r>
-              <w:t>0.678</w:t>
-            </w:r>
-          </w:p>
-        </w:tc>
-        <w:tc>
-          <w:tcPr>
-            <w:tcW w:w="1721" w:type="dxa"/>
-          </w:tcPr>
-          <w:p>
-            <w:pPr>
-              <w:pStyle w:val="tablecopy"/>
-            </w:pPr>
-            <w:r>
-              <w:t>0.342</w:t>
+            <w:tcW w:w="950" w:type="dxa"/>
+          </w:tcPr>
+          <w:p>
+            <w:r>
+              <w:t>0.754</w:t>
+            </w:r>
+          </w:p>
+        </w:tc>
+        <w:tc>
+          <w:tcPr>
+            <w:tcW w:w="916" w:type="dxa"/>
+          </w:tcPr>
+          <w:p>
+            <w:r>
+              <w:t>0.855</w:t>
+            </w:r>
+          </w:p>
+        </w:tc>
+        <w:tc>
+          <w:tcPr>
+            <w:tcW w:w="672" w:type="dxa"/>
+          </w:tcPr>
+          <w:p>
+            <w:r>
+              <w:t>0.184</w:t>
+            </w:r>
+          </w:p>
+        </w:tc>
+        <w:tc>
+          <w:tcPr>
+            <w:tcW w:w="666" w:type="dxa"/>
+          </w:tcPr>
+          <w:p>
+            <w:r>
+              <w:t>0.704</w:t>
+            </w:r>
+          </w:p>
+        </w:tc>
+        <w:tc>
+          <w:tcPr>
+            <w:tcW w:w="694" w:type="dxa"/>
+          </w:tcPr>
+          <w:p>
+            <w:r>
+              <w:t>0.381</w:t>
             </w:r>
           </w:p>
         </w:tc>
@@ -2147,14 +2413,25 @@
     <w:p>
       <w:pPr>
         <w:pStyle w:val="tablehead"/>
+        <w:numPr>
+          <w:ilvl w:val="0"/>
+          <w:numId w:val="0"/>
+        </w:numPr>
+        <w:jc w:val="both"/>
+      </w:pPr>
+    </w:p>
+    <w:p>
+      <w:pPr>
+        <w:pStyle w:val="tablehead"/>
       </w:pPr>
       <w:r>
+        <w:lastRenderedPageBreak/>
         <w:t>Held-Out Center Results for Selected Model</w:t>
       </w:r>
     </w:p>
     <w:tbl>
       <w:tblPr>
-        <w:tblW w:w="0" w:type="auto"/>
+        <w:tblW w:w="5040" w:type="dxa"/>
         <w:jc w:val="center"/>
         <w:tblBorders>
           <w:top w:val="single" w:sz="4" w:space="0" w:color="999999"/>
@@ -2164,108 +2441,110 @@
           <w:insideH w:val="single" w:sz="4" w:space="0" w:color="999999"/>
           <w:insideV w:val="single" w:sz="4" w:space="0" w:color="999999"/>
         </w:tblBorders>
+        <w:tblLayout w:type="fixed"/>
         <w:tblLook w:val="04A0" w:firstRow="1" w:lastRow="0" w:firstColumn="1" w:lastColumn="0" w:noHBand="0" w:noVBand="1"/>
       </w:tblPr>
       <w:tblGrid>
-        <w:gridCol w:w="970"/>
-        <w:gridCol w:w="794"/>
-        <w:gridCol w:w="767"/>
-        <w:gridCol w:w="575"/>
-        <w:gridCol w:w="570"/>
-        <w:gridCol w:w="570"/>
-        <w:gridCol w:w="570"/>
+        <w:gridCol w:w="805"/>
+        <w:gridCol w:w="720"/>
+        <w:gridCol w:w="720"/>
+        <w:gridCol w:w="720"/>
+        <w:gridCol w:w="630"/>
+        <w:gridCol w:w="720"/>
+        <w:gridCol w:w="725"/>
       </w:tblGrid>
       <w:tr>
         <w:trPr>
+          <w:trHeight w:val="708"/>
           <w:jc w:val="center"/>
         </w:trPr>
         <w:tc>
           <w:tcPr>
-            <w:tcW w:w="1475" w:type="dxa"/>
-          </w:tcPr>
-          <w:p>
-            <w:pPr>
-              <w:pStyle w:val="tablecolhead"/>
-            </w:pPr>
-            <w:r>
+            <w:tcW w:w="805" w:type="dxa"/>
+          </w:tcPr>
+          <w:p>
+            <w:r>
+              <w:rPr>
+                <w:b/>
+              </w:rPr>
               <w:t>Center</w:t>
             </w:r>
           </w:p>
         </w:tc>
         <w:tc>
           <w:tcPr>
-            <w:tcW w:w="1475" w:type="dxa"/>
-          </w:tcPr>
-          <w:p>
-            <w:pPr>
-              <w:pStyle w:val="tablecolhead"/>
-            </w:pPr>
-            <w:r>
+            <w:tcW w:w="720" w:type="dxa"/>
+          </w:tcPr>
+          <w:p>
+            <w:r>
+              <w:rPr>
+                <w:b/>
+              </w:rPr>
               <w:t>AUROC</w:t>
             </w:r>
           </w:p>
         </w:tc>
         <w:tc>
           <w:tcPr>
-            <w:tcW w:w="1475" w:type="dxa"/>
-          </w:tcPr>
-          <w:p>
-            <w:pPr>
-              <w:pStyle w:val="tablecolhead"/>
-            </w:pPr>
-            <w:r>
+            <w:tcW w:w="720" w:type="dxa"/>
+          </w:tcPr>
+          <w:p>
+            <w:r>
+              <w:rPr>
+                <w:b/>
+              </w:rPr>
               <w:t>AUPRC</w:t>
             </w:r>
           </w:p>
         </w:tc>
         <w:tc>
           <w:tcPr>
-            <w:tcW w:w="1475" w:type="dxa"/>
-          </w:tcPr>
-          <w:p>
-            <w:pPr>
-              <w:pStyle w:val="tablecolhead"/>
-            </w:pPr>
-            <w:r>
+            <w:tcW w:w="720" w:type="dxa"/>
+          </w:tcPr>
+          <w:p>
+            <w:r>
+              <w:rPr>
+                <w:b/>
+              </w:rPr>
               <w:t>Brier</w:t>
             </w:r>
           </w:p>
         </w:tc>
         <w:tc>
           <w:tcPr>
-            <w:tcW w:w="1475" w:type="dxa"/>
-          </w:tcPr>
-          <w:p>
-            <w:pPr>
-              <w:pStyle w:val="tablecolhead"/>
-            </w:pPr>
-            <w:r>
+            <w:tcW w:w="630" w:type="dxa"/>
+          </w:tcPr>
+          <w:p>
+            <w:r>
+              <w:rPr>
+                <w:b/>
+              </w:rPr>
               <w:t>Bal. Acc.</w:t>
             </w:r>
           </w:p>
         </w:tc>
         <w:tc>
           <w:tcPr>
-            <w:tcW w:w="1475" w:type="dxa"/>
-          </w:tcPr>
-          <w:p>
-            <w:pPr>
-              <w:pStyle w:val="tablecolhead"/>
-            </w:pPr>
-            <w:r>
+            <w:tcW w:w="720" w:type="dxa"/>
+          </w:tcPr>
+          <w:p>
+            <w:r>
+              <w:rPr>
+                <w:b/>
+              </w:rPr>
               <w:t>Sens.</w:t>
             </w:r>
           </w:p>
         </w:tc>
         <w:tc>
           <w:tcPr>
-            <w:tcW w:w="1475" w:type="dxa"/>
-          </w:tcPr>
-          <w:p>
-            <w:pPr>
-              <w:pStyle w:val="tablecolhead"/>
-            </w:pPr>
-            <w:r>
+            <w:tcW w:w="725" w:type="dxa"/>
+          </w:tcPr>
+          <w:p>
+            <w:r>
+              <w:rPr>
+                <w:b/>
+              </w:rPr>
               <w:t>Spec.</w:t>
             </w:r>
           </w:p>
@@ -2273,16 +2552,14 @@
       </w:tr>
       <w:tr>
         <w:trPr>
+          <w:trHeight w:val="468"/>
           <w:jc w:val="center"/>
         </w:trPr>
         <w:tc>
           <w:tcPr>
-            <w:tcW w:w="1475" w:type="dxa"/>
-          </w:tcPr>
-          <w:p>
-            <w:pPr>
-              <w:pStyle w:val="tablecopy"/>
-            </w:pPr>
+            <w:tcW w:w="805" w:type="dxa"/>
+          </w:tcPr>
+          <w:p>
             <w:r>
               <w:t>Cleveland</w:t>
             </w:r>
@@ -2290,12 +2567,9 @@
         </w:tc>
         <w:tc>
           <w:tcPr>
-            <w:tcW w:w="1475" w:type="dxa"/>
-          </w:tcPr>
-          <w:p>
-            <w:pPr>
-              <w:pStyle w:val="tablecopy"/>
-            </w:pPr>
+            <w:tcW w:w="720" w:type="dxa"/>
+          </w:tcPr>
+          <w:p>
             <w:r>
               <w:t>0.867</w:t>
             </w:r>
@@ -2303,82 +2577,65 @@
         </w:tc>
         <w:tc>
           <w:tcPr>
-            <w:tcW w:w="1475" w:type="dxa"/>
-          </w:tcPr>
-          <w:p>
-            <w:pPr>
-              <w:pStyle w:val="tablecopy"/>
-            </w:pPr>
-            <w:r>
-              <w:t>0.867</w:t>
-            </w:r>
-          </w:p>
-        </w:tc>
-        <w:tc>
-          <w:tcPr>
-            <w:tcW w:w="1475" w:type="dxa"/>
-          </w:tcPr>
-          <w:p>
-            <w:pPr>
-              <w:pStyle w:val="tablecopy"/>
-            </w:pPr>
-            <w:r>
-              <w:t>0.145</w:t>
-            </w:r>
-          </w:p>
-        </w:tc>
-        <w:tc>
-          <w:tcPr>
-            <w:tcW w:w="1475" w:type="dxa"/>
-          </w:tcPr>
-          <w:p>
-            <w:pPr>
-              <w:pStyle w:val="tablecopy"/>
-            </w:pPr>
-            <w:r>
-              <w:t>0.802</w:t>
-            </w:r>
-          </w:p>
-        </w:tc>
-        <w:tc>
-          <w:tcPr>
-            <w:tcW w:w="1475" w:type="dxa"/>
-          </w:tcPr>
-          <w:p>
-            <w:pPr>
-              <w:pStyle w:val="tablecopy"/>
-            </w:pPr>
-            <w:r>
-              <w:t>0.755</w:t>
-            </w:r>
-          </w:p>
-        </w:tc>
-        <w:tc>
-          <w:tcPr>
-            <w:tcW w:w="1475" w:type="dxa"/>
-          </w:tcPr>
-          <w:p>
-            <w:pPr>
-              <w:pStyle w:val="tablecopy"/>
-            </w:pPr>
-            <w:r>
-              <w:t>0.848</w:t>
+            <w:tcW w:w="720" w:type="dxa"/>
+          </w:tcPr>
+          <w:p>
+            <w:r>
+              <w:t>0.865</w:t>
+            </w:r>
+          </w:p>
+        </w:tc>
+        <w:tc>
+          <w:tcPr>
+            <w:tcW w:w="720" w:type="dxa"/>
+          </w:tcPr>
+          <w:p>
+            <w:r>
+              <w:t>0.151</w:t>
+            </w:r>
+          </w:p>
+        </w:tc>
+        <w:tc>
+          <w:tcPr>
+            <w:tcW w:w="630" w:type="dxa"/>
+          </w:tcPr>
+          <w:p>
+            <w:r>
+              <w:t>0.792</w:t>
+            </w:r>
+          </w:p>
+        </w:tc>
+        <w:tc>
+          <w:tcPr>
+            <w:tcW w:w="720" w:type="dxa"/>
+          </w:tcPr>
+          <w:p>
+            <w:r>
+              <w:t>0.820</w:t>
+            </w:r>
+          </w:p>
+        </w:tc>
+        <w:tc>
+          <w:tcPr>
+            <w:tcW w:w="725" w:type="dxa"/>
+          </w:tcPr>
+          <w:p>
+            <w:r>
+              <w:t>0.764</w:t>
             </w:r>
           </w:p>
         </w:tc>
       </w:tr>
       <w:tr>
         <w:trPr>
+          <w:trHeight w:val="477"/>
           <w:jc w:val="center"/>
         </w:trPr>
         <w:tc>
           <w:tcPr>
-            <w:tcW w:w="1475" w:type="dxa"/>
-          </w:tcPr>
-          <w:p>
-            <w:pPr>
-              <w:pStyle w:val="tablecopy"/>
-            </w:pPr>
+            <w:tcW w:w="805" w:type="dxa"/>
+          </w:tcPr>
+          <w:p>
             <w:r>
               <w:t>Hungary</w:t>
             </w:r>
@@ -2386,95 +2643,75 @@
         </w:tc>
         <w:tc>
           <w:tcPr>
-            <w:tcW w:w="1475" w:type="dxa"/>
-          </w:tcPr>
-          <w:p>
-            <w:pPr>
-              <w:pStyle w:val="tablecopy"/>
-            </w:pPr>
-            <w:r>
-              <w:t>0.876</w:t>
-            </w:r>
-          </w:p>
-        </w:tc>
-        <w:tc>
-          <w:tcPr>
-            <w:tcW w:w="1475" w:type="dxa"/>
-          </w:tcPr>
-          <w:p>
-            <w:pPr>
-              <w:pStyle w:val="tablecopy"/>
-            </w:pPr>
-            <w:r>
-              <w:t>0.828</w:t>
-            </w:r>
-          </w:p>
-        </w:tc>
-        <w:tc>
-          <w:tcPr>
-            <w:tcW w:w="1475" w:type="dxa"/>
-          </w:tcPr>
-          <w:p>
-            <w:pPr>
-              <w:pStyle w:val="tablecopy"/>
-            </w:pPr>
-            <w:r>
-              <w:t>0.132</w:t>
-            </w:r>
-          </w:p>
-        </w:tc>
-        <w:tc>
-          <w:tcPr>
-            <w:tcW w:w="1475" w:type="dxa"/>
-          </w:tcPr>
-          <w:p>
-            <w:pPr>
-              <w:pStyle w:val="tablecopy"/>
-            </w:pPr>
-            <w:r>
-              <w:t>0.790</w:t>
-            </w:r>
-          </w:p>
-        </w:tc>
-        <w:tc>
-          <w:tcPr>
-            <w:tcW w:w="1475" w:type="dxa"/>
-          </w:tcPr>
-          <w:p>
-            <w:pPr>
-              <w:pStyle w:val="tablecopy"/>
-            </w:pPr>
-            <w:r>
-              <w:t>0.660</w:t>
-            </w:r>
-          </w:p>
-        </w:tc>
-        <w:tc>
-          <w:tcPr>
-            <w:tcW w:w="1475" w:type="dxa"/>
-          </w:tcPr>
-          <w:p>
-            <w:pPr>
-              <w:pStyle w:val="tablecopy"/>
-            </w:pPr>
-            <w:r>
-              <w:t>0.920</w:t>
+            <w:tcW w:w="720" w:type="dxa"/>
+          </w:tcPr>
+          <w:p>
+            <w:r>
+              <w:t>0.897</w:t>
+            </w:r>
+          </w:p>
+        </w:tc>
+        <w:tc>
+          <w:tcPr>
+            <w:tcW w:w="720" w:type="dxa"/>
+          </w:tcPr>
+          <w:p>
+            <w:r>
+              <w:t>0.837</w:t>
+            </w:r>
+          </w:p>
+        </w:tc>
+        <w:tc>
+          <w:tcPr>
+            <w:tcW w:w="720" w:type="dxa"/>
+          </w:tcPr>
+          <w:p>
+            <w:r>
+              <w:t>0.130</w:t>
+            </w:r>
+          </w:p>
+        </w:tc>
+        <w:tc>
+          <w:tcPr>
+            <w:tcW w:w="630" w:type="dxa"/>
+          </w:tcPr>
+          <w:p>
+            <w:r>
+              <w:t>0.818</w:t>
+            </w:r>
+          </w:p>
+        </w:tc>
+        <w:tc>
+          <w:tcPr>
+            <w:tcW w:w="720" w:type="dxa"/>
+          </w:tcPr>
+          <w:p>
+            <w:r>
+              <w:t>0.802</w:t>
+            </w:r>
+          </w:p>
+        </w:tc>
+        <w:tc>
+          <w:tcPr>
+            <w:tcW w:w="725" w:type="dxa"/>
+          </w:tcPr>
+          <w:p>
+            <w:r>
+              <w:t>0.834</w:t>
             </w:r>
           </w:p>
         </w:tc>
       </w:tr>
       <w:tr>
         <w:trPr>
+          <w:trHeight w:val="468"/>
           <w:jc w:val="center"/>
         </w:trPr>
         <w:tc>
           <w:tcPr>
-            <w:tcW w:w="1475" w:type="dxa"/>
-          </w:tcPr>
-          <w:p>
-            <w:pPr>
-              <w:pStyle w:val="tablecopy"/>
-            </w:pPr>
+            <w:tcW w:w="805" w:type="dxa"/>
+          </w:tcPr>
+          <w:p>
             <w:r>
               <w:t>Switzerland</w:t>
             </w:r>
@@ -2482,95 +2719,75 @@
         </w:tc>
         <w:tc>
           <w:tcPr>
-            <w:tcW w:w="1475" w:type="dxa"/>
-          </w:tcPr>
-          <w:p>
-            <w:pPr>
-              <w:pStyle w:val="tablecopy"/>
-            </w:pPr>
-            <w:r>
-              <w:t>0.742</w:t>
-            </w:r>
-          </w:p>
-        </w:tc>
-        <w:tc>
-          <w:tcPr>
-            <w:tcW w:w="1475" w:type="dxa"/>
-          </w:tcPr>
-          <w:p>
-            <w:pPr>
-              <w:pStyle w:val="tablecopy"/>
-            </w:pPr>
-            <w:r>
-              <w:t>0.972</w:t>
-            </w:r>
-          </w:p>
-        </w:tc>
-        <w:tc>
-          <w:tcPr>
-            <w:tcW w:w="1475" w:type="dxa"/>
-          </w:tcPr>
-          <w:p>
-            <w:pPr>
-              <w:pStyle w:val="tablecopy"/>
-            </w:pPr>
-            <w:r>
-              <w:t>0.204</w:t>
-            </w:r>
-          </w:p>
-        </w:tc>
-        <w:tc>
-          <w:tcPr>
-            <w:tcW w:w="1475" w:type="dxa"/>
-          </w:tcPr>
-          <w:p>
-            <w:pPr>
-              <w:pStyle w:val="tablecopy"/>
-            </w:pPr>
-            <w:r>
-              <w:t>0.727</w:t>
-            </w:r>
-          </w:p>
-        </w:tc>
-        <w:tc>
-          <w:tcPr>
-            <w:tcW w:w="1475" w:type="dxa"/>
-          </w:tcPr>
-          <w:p>
-            <w:pPr>
-              <w:pStyle w:val="tablecopy"/>
-            </w:pPr>
-            <w:r>
-              <w:t>0.704</w:t>
-            </w:r>
-          </w:p>
-        </w:tc>
-        <w:tc>
-          <w:tcPr>
-            <w:tcW w:w="1475" w:type="dxa"/>
-          </w:tcPr>
-          <w:p>
-            <w:pPr>
-              <w:pStyle w:val="tablecopy"/>
-            </w:pPr>
-            <w:r>
-              <w:t>0.750</w:t>
+            <w:tcW w:w="720" w:type="dxa"/>
+          </w:tcPr>
+          <w:p>
+            <w:r>
+              <w:t>0.745</w:t>
+            </w:r>
+          </w:p>
+        </w:tc>
+        <w:tc>
+          <w:tcPr>
+            <w:tcW w:w="720" w:type="dxa"/>
+          </w:tcPr>
+          <w:p>
+            <w:r>
+              <w:t>0.971</w:t>
+            </w:r>
+          </w:p>
+        </w:tc>
+        <w:tc>
+          <w:tcPr>
+            <w:tcW w:w="720" w:type="dxa"/>
+          </w:tcPr>
+          <w:p>
+            <w:r>
+              <w:t>0.154</w:t>
+            </w:r>
+          </w:p>
+        </w:tc>
+        <w:tc>
+          <w:tcPr>
+            <w:tcW w:w="630" w:type="dxa"/>
+          </w:tcPr>
+          <w:p>
+            <w:r>
+              <w:t>0.708</w:t>
+            </w:r>
+          </w:p>
+        </w:tc>
+        <w:tc>
+          <w:tcPr>
+            <w:tcW w:w="720" w:type="dxa"/>
+          </w:tcPr>
+          <w:p>
+            <w:r>
+              <w:t>0.791</w:t>
+            </w:r>
+          </w:p>
+        </w:tc>
+        <w:tc>
+          <w:tcPr>
+            <w:tcW w:w="725" w:type="dxa"/>
+          </w:tcPr>
+          <w:p>
+            <w:r>
+              <w:t>0.625</w:t>
             </w:r>
           </w:p>
         </w:tc>
       </w:tr>
       <w:tr>
         <w:trPr>
+          <w:trHeight w:val="708"/>
           <w:jc w:val="center"/>
         </w:trPr>
         <w:tc>
           <w:tcPr>
-            <w:tcW w:w="1475" w:type="dxa"/>
-          </w:tcPr>
-          <w:p>
-            <w:pPr>
-              <w:pStyle w:val="tablecopy"/>
-            </w:pPr>
+            <w:tcW w:w="805" w:type="dxa"/>
+          </w:tcPr>
+          <w:p>
             <w:r>
               <w:t>VA Long Beach</w:t>
             </w:r>
@@ -2578,79 +2795,61 @@
         </w:tc>
         <w:tc>
           <w:tcPr>
-            <w:tcW w:w="1475" w:type="dxa"/>
-          </w:tcPr>
-          <w:p>
-            <w:pPr>
-              <w:pStyle w:val="tablecopy"/>
-            </w:pPr>
-            <w:r>
-              <w:t>0.709</w:t>
-            </w:r>
-          </w:p>
-        </w:tc>
-        <w:tc>
-          <w:tcPr>
-            <w:tcW w:w="1475" w:type="dxa"/>
-          </w:tcPr>
-          <w:p>
-            <w:pPr>
-              <w:pStyle w:val="tablecopy"/>
-            </w:pPr>
-            <w:r>
-              <w:t>0.853</w:t>
-            </w:r>
-          </w:p>
-        </w:tc>
-        <w:tc>
-          <w:tcPr>
-            <w:tcW w:w="1475" w:type="dxa"/>
-          </w:tcPr>
-          <w:p>
-            <w:pPr>
-              <w:pStyle w:val="tablecopy"/>
-            </w:pPr>
-            <w:r>
-              <w:t>0.189</w:t>
-            </w:r>
-          </w:p>
-        </w:tc>
-        <w:tc>
-          <w:tcPr>
-            <w:tcW w:w="1475" w:type="dxa"/>
-          </w:tcPr>
-          <w:p>
-            <w:pPr>
-              <w:pStyle w:val="tablecopy"/>
-            </w:pPr>
-            <w:r>
-              <w:t>0.660</w:t>
-            </w:r>
-          </w:p>
-        </w:tc>
-        <w:tc>
-          <w:tcPr>
-            <w:tcW w:w="1475" w:type="dxa"/>
-          </w:tcPr>
-          <w:p>
-            <w:pPr>
-              <w:pStyle w:val="tablecopy"/>
-            </w:pPr>
-            <w:r>
-              <w:t>0.772</w:t>
-            </w:r>
-          </w:p>
-        </w:tc>
-        <w:tc>
-          <w:tcPr>
-            <w:tcW w:w="1475" w:type="dxa"/>
-          </w:tcPr>
-          <w:p>
-            <w:pPr>
-              <w:pStyle w:val="tablecopy"/>
-            </w:pPr>
-            <w:r>
-              <w:t>0.549</w:t>
+            <w:tcW w:w="720" w:type="dxa"/>
+          </w:tcPr>
+          <w:p>
+            <w:r>
+              <w:t>0.723</w:t>
+            </w:r>
+          </w:p>
+        </w:tc>
+        <w:tc>
+          <w:tcPr>
+            <w:tcW w:w="720" w:type="dxa"/>
+          </w:tcPr>
+          <w:p>
+            <w:r>
+              <w:t>0.857</w:t>
+            </w:r>
+          </w:p>
+        </w:tc>
+        <w:tc>
+          <w:tcPr>
+            <w:tcW w:w="720" w:type="dxa"/>
+          </w:tcPr>
+          <w:p>
+            <w:r>
+              <w:t>0.183</w:t>
+            </w:r>
+          </w:p>
+        </w:tc>
+        <w:tc>
+          <w:tcPr>
+            <w:tcW w:w="630" w:type="dxa"/>
+          </w:tcPr>
+          <w:p>
+            <w:r>
+              <w:t>0.658</w:t>
+            </w:r>
+          </w:p>
+        </w:tc>
+        <w:tc>
+          <w:tcPr>
+            <w:tcW w:w="720" w:type="dxa"/>
+          </w:tcPr>
+          <w:p>
+            <w:r>
+              <w:t>0.805</w:t>
+            </w:r>
+          </w:p>
+        </w:tc>
+        <w:tc>
+          <w:tcPr>
+            <w:tcW w:w="725" w:type="dxa"/>
+          </w:tcPr>
+          <w:p>
+            <w:r>
+              <w:t>0.510</w:t>
             </w:r>
           </w:p>
         </w:tc>
@@ -2679,9 +2878,9 @@
         <w:tblLook w:val="04A0" w:firstRow="1" w:lastRow="0" w:firstColumn="1" w:lastColumn="0" w:noHBand="0" w:noVBand="1"/>
       </w:tblPr>
       <w:tblGrid>
-        <w:gridCol w:w="1690"/>
-        <w:gridCol w:w="1629"/>
-        <w:gridCol w:w="1497"/>
+        <w:gridCol w:w="1749"/>
+        <w:gridCol w:w="1670"/>
+        <w:gridCol w:w="1498"/>
       </w:tblGrid>
       <w:tr>
         <w:trPr>
@@ -2692,10 +2891,10 @@
             <w:tcW w:w="3442" w:type="dxa"/>
           </w:tcPr>
           <w:p>
-            <w:pPr>
-              <w:pStyle w:val="tablecolhead"/>
-            </w:pPr>
-            <w:r>
+            <w:r>
+              <w:rPr>
+                <w:b/>
+              </w:rPr>
               <w:t>Metric</w:t>
             </w:r>
           </w:p>
@@ -2705,10 +2904,10 @@
             <w:tcW w:w="3442" w:type="dxa"/>
           </w:tcPr>
           <w:p>
-            <w:pPr>
-              <w:pStyle w:val="tablecolhead"/>
-            </w:pPr>
-            <w:r>
+            <w:r>
+              <w:rPr>
+                <w:b/>
+              </w:rPr>
               <w:t>Estimate</w:t>
             </w:r>
           </w:p>
@@ -2718,10 +2917,10 @@
             <w:tcW w:w="3442" w:type="dxa"/>
           </w:tcPr>
           <w:p>
-            <w:pPr>
-              <w:pStyle w:val="tablecolhead"/>
-            </w:pPr>
-            <w:r>
+            <w:r>
+              <w:rPr>
+                <w:b/>
+              </w:rPr>
               <w:t>95% CI</w:t>
             </w:r>
           </w:p>
@@ -2736,11 +2935,8 @@
             <w:tcW w:w="3442" w:type="dxa"/>
           </w:tcPr>
           <w:p>
-            <w:pPr>
-              <w:pStyle w:val="tablecopy"/>
-            </w:pPr>
-            <w:r>
-              <w:t>Auroc</w:t>
+            <w:r>
+              <w:t>AUROC</w:t>
             </w:r>
           </w:p>
         </w:tc>
@@ -2749,11 +2945,8 @@
             <w:tcW w:w="3442" w:type="dxa"/>
           </w:tcPr>
           <w:p>
-            <w:pPr>
-              <w:pStyle w:val="tablecopy"/>
-            </w:pPr>
-            <w:r>
-              <w:t>0.855</w:t>
+            <w:r>
+              <w:t>0.859</w:t>
             </w:r>
           </w:p>
         </w:tc>
@@ -2762,11 +2955,8 @@
             <w:tcW w:w="3442" w:type="dxa"/>
           </w:tcPr>
           <w:p>
-            <w:pPr>
-              <w:pStyle w:val="tablecopy"/>
-            </w:pPr>
-            <w:r>
-              <w:t>0.828-0.878</w:t>
+            <w:r>
+              <w:t>0.835-0.883</w:t>
             </w:r>
           </w:p>
         </w:tc>
@@ -2780,11 +2970,8 @@
             <w:tcW w:w="3442" w:type="dxa"/>
           </w:tcPr>
           <w:p>
-            <w:pPr>
-              <w:pStyle w:val="tablecopy"/>
-            </w:pPr>
-            <w:r>
-              <w:t>Auprc</w:t>
+            <w:r>
+              <w:t>AUPRC</w:t>
             </w:r>
           </w:p>
         </w:tc>
@@ -2793,11 +2980,8 @@
             <w:tcW w:w="3442" w:type="dxa"/>
           </w:tcPr>
           <w:p>
-            <w:pPr>
-              <w:pStyle w:val="tablecopy"/>
-            </w:pPr>
-            <w:r>
-              <w:t>0.864</w:t>
+            <w:r>
+              <w:t>0.866</w:t>
             </w:r>
           </w:p>
         </w:tc>
@@ -2806,11 +2990,8 @@
             <w:tcW w:w="3442" w:type="dxa"/>
           </w:tcPr>
           <w:p>
-            <w:pPr>
-              <w:pStyle w:val="tablecopy"/>
-            </w:pPr>
-            <w:r>
-              <w:t>0.825-0.893</w:t>
+            <w:r>
+              <w:t>0.831-0.900</w:t>
             </w:r>
           </w:p>
         </w:tc>
@@ -2824,9 +3005,6 @@
             <w:tcW w:w="3442" w:type="dxa"/>
           </w:tcPr>
           <w:p>
-            <w:pPr>
-              <w:pStyle w:val="tablecopy"/>
-            </w:pPr>
             <w:r>
               <w:t>Balanced Accuracy</w:t>
             </w:r>
@@ -2837,11 +3015,8 @@
             <w:tcW w:w="3442" w:type="dxa"/>
           </w:tcPr>
           <w:p>
-            <w:pPr>
-              <w:pStyle w:val="tablecopy"/>
-            </w:pPr>
-            <w:r>
-              <w:t>0.785</w:t>
+            <w:r>
+              <w:t>0.784</w:t>
             </w:r>
           </w:p>
         </w:tc>
@@ -2850,11 +3025,8 @@
             <w:tcW w:w="3442" w:type="dxa"/>
           </w:tcPr>
           <w:p>
-            <w:pPr>
-              <w:pStyle w:val="tablecopy"/>
-            </w:pPr>
-            <w:r>
-              <w:t>0.756-0.811</w:t>
+            <w:r>
+              <w:t>0.757-0.810</w:t>
             </w:r>
           </w:p>
         </w:tc>
@@ -2868,9 +3040,6 @@
             <w:tcW w:w="3442" w:type="dxa"/>
           </w:tcPr>
           <w:p>
-            <w:pPr>
-              <w:pStyle w:val="tablecopy"/>
-            </w:pPr>
             <w:r>
               <w:t>Brier</w:t>
             </w:r>
@@ -2881,11 +3050,8 @@
             <w:tcW w:w="3442" w:type="dxa"/>
           </w:tcPr>
           <w:p>
-            <w:pPr>
-              <w:pStyle w:val="tablecopy"/>
-            </w:pPr>
-            <w:r>
-              <w:t>0.159</w:t>
+            <w:r>
+              <w:t>0.152</w:t>
             </w:r>
           </w:p>
         </w:tc>
@@ -2894,11 +3060,8 @@
             <w:tcW w:w="3442" w:type="dxa"/>
           </w:tcPr>
           <w:p>
-            <w:pPr>
-              <w:pStyle w:val="tablecopy"/>
-            </w:pPr>
-            <w:r>
-              <w:t>0.145-0.173</w:t>
+            <w:r>
+              <w:t>0.139-0.164</w:t>
             </w:r>
           </w:p>
         </w:tc>
@@ -2912,11 +3075,7 @@
             <w:tcW w:w="3442" w:type="dxa"/>
           </w:tcPr>
           <w:p>
-            <w:pPr>
-              <w:pStyle w:val="tablecopy"/>
-            </w:pPr>
-            <w:r>
-              <w:lastRenderedPageBreak/>
+            <w:r>
               <w:t>Sensitivity</w:t>
             </w:r>
           </w:p>
@@ -2926,11 +3085,8 @@
             <w:tcW w:w="3442" w:type="dxa"/>
           </w:tcPr>
           <w:p>
-            <w:pPr>
-              <w:pStyle w:val="tablecopy"/>
-            </w:pPr>
-            <w:r>
-              <w:t>0.729</w:t>
+            <w:r>
+              <w:t>0.806</w:t>
             </w:r>
           </w:p>
         </w:tc>
@@ -2939,11 +3095,8 @@
             <w:tcW w:w="3442" w:type="dxa"/>
           </w:tcPr>
           <w:p>
-            <w:pPr>
-              <w:pStyle w:val="tablecopy"/>
-            </w:pPr>
-            <w:r>
-              <w:t>0.690-0.766</w:t>
+            <w:r>
+              <w:t>0.772-0.841</w:t>
             </w:r>
           </w:p>
         </w:tc>
@@ -2957,9 +3110,6 @@
             <w:tcW w:w="3442" w:type="dxa"/>
           </w:tcPr>
           <w:p>
-            <w:pPr>
-              <w:pStyle w:val="tablecopy"/>
-            </w:pPr>
             <w:r>
               <w:t>Specificity</w:t>
             </w:r>
@@ -2970,11 +3120,8 @@
             <w:tcW w:w="3442" w:type="dxa"/>
           </w:tcPr>
           <w:p>
-            <w:pPr>
-              <w:pStyle w:val="tablecopy"/>
-            </w:pPr>
-            <w:r>
-              <w:t>0.842</w:t>
+            <w:r>
+              <w:t>0.762</w:t>
             </w:r>
           </w:p>
         </w:tc>
@@ -2983,11 +3130,8 @@
             <w:tcW w:w="3442" w:type="dxa"/>
           </w:tcPr>
           <w:p>
-            <w:pPr>
-              <w:pStyle w:val="tablecopy"/>
-            </w:pPr>
-            <w:r>
-              <w:t>0.804-0.875</w:t>
+            <w:r>
+              <w:t>0.722-0.802</w:t>
             </w:r>
           </w:p>
         </w:tc>
@@ -3016,13 +3160,13 @@
         <w:tblLook w:val="04A0" w:firstRow="1" w:lastRow="0" w:firstColumn="1" w:lastColumn="0" w:noHBand="0" w:noVBand="1"/>
       </w:tblPr>
       <w:tblGrid>
-        <w:gridCol w:w="686"/>
-        <w:gridCol w:w="685"/>
-        <w:gridCol w:w="685"/>
-        <w:gridCol w:w="685"/>
-        <w:gridCol w:w="685"/>
-        <w:gridCol w:w="685"/>
-        <w:gridCol w:w="705"/>
+        <w:gridCol w:w="698"/>
+        <w:gridCol w:w="698"/>
+        <w:gridCol w:w="699"/>
+        <w:gridCol w:w="699"/>
+        <w:gridCol w:w="699"/>
+        <w:gridCol w:w="699"/>
+        <w:gridCol w:w="725"/>
       </w:tblGrid>
       <w:tr>
         <w:trPr>
@@ -3033,10 +3177,10 @@
             <w:tcW w:w="1475" w:type="dxa"/>
           </w:tcPr>
           <w:p>
-            <w:pPr>
-              <w:pStyle w:val="tablecolhead"/>
-            </w:pPr>
-            <w:r>
+            <w:r>
+              <w:rPr>
+                <w:b/>
+              </w:rPr>
               <w:t>Thr.</w:t>
             </w:r>
           </w:p>
@@ -3046,10 +3190,10 @@
             <w:tcW w:w="1475" w:type="dxa"/>
           </w:tcPr>
           <w:p>
-            <w:pPr>
-              <w:pStyle w:val="tablecolhead"/>
-            </w:pPr>
-            <w:r>
+            <w:r>
+              <w:rPr>
+                <w:b/>
+              </w:rPr>
               <w:t>Sens.</w:t>
             </w:r>
           </w:p>
@@ -3059,10 +3203,10 @@
             <w:tcW w:w="1475" w:type="dxa"/>
           </w:tcPr>
           <w:p>
-            <w:pPr>
-              <w:pStyle w:val="tablecolhead"/>
-            </w:pPr>
-            <w:r>
+            <w:r>
+              <w:rPr>
+                <w:b/>
+              </w:rPr>
               <w:t>Spec.</w:t>
             </w:r>
           </w:p>
@@ -3072,10 +3216,10 @@
             <w:tcW w:w="1475" w:type="dxa"/>
           </w:tcPr>
           <w:p>
-            <w:pPr>
-              <w:pStyle w:val="tablecolhead"/>
-            </w:pPr>
-            <w:r>
+            <w:r>
+              <w:rPr>
+                <w:b/>
+              </w:rPr>
               <w:t>PPV</w:t>
             </w:r>
           </w:p>
@@ -3085,10 +3229,10 @@
             <w:tcW w:w="1475" w:type="dxa"/>
           </w:tcPr>
           <w:p>
-            <w:pPr>
-              <w:pStyle w:val="tablecolhead"/>
-            </w:pPr>
-            <w:r>
+            <w:r>
+              <w:rPr>
+                <w:b/>
+              </w:rPr>
               <w:t>NPV</w:t>
             </w:r>
           </w:p>
@@ -3098,10 +3242,10 @@
             <w:tcW w:w="1475" w:type="dxa"/>
           </w:tcPr>
           <w:p>
-            <w:pPr>
-              <w:pStyle w:val="tablecolhead"/>
-            </w:pPr>
-            <w:r>
+            <w:r>
+              <w:rPr>
+                <w:b/>
+              </w:rPr>
               <w:t>Bal. Acc.</w:t>
             </w:r>
           </w:p>
@@ -3111,10 +3255,10 @@
             <w:tcW w:w="1475" w:type="dxa"/>
           </w:tcPr>
           <w:p>
-            <w:pPr>
-              <w:pStyle w:val="tablecolhead"/>
-            </w:pPr>
-            <w:r>
+            <w:r>
+              <w:rPr>
+                <w:b/>
+              </w:rPr>
               <w:t>MCC</w:t>
             </w:r>
           </w:p>
@@ -3129,9 +3273,6 @@
             <w:tcW w:w="1475" w:type="dxa"/>
           </w:tcPr>
           <w:p>
-            <w:pPr>
-              <w:pStyle w:val="tablecopy"/>
-            </w:pPr>
             <w:r>
               <w:t>0.300</w:t>
             </w:r>
@@ -3142,11 +3283,8 @@
             <w:tcW w:w="1475" w:type="dxa"/>
           </w:tcPr>
           <w:p>
-            <w:pPr>
-              <w:pStyle w:val="tablecopy"/>
-            </w:pPr>
-            <w:r>
-              <w:t>0.876</w:t>
+            <w:r>
+              <w:t>0.925</w:t>
             </w:r>
           </w:p>
         </w:tc>
@@ -3155,11 +3293,8 @@
             <w:tcW w:w="1475" w:type="dxa"/>
           </w:tcPr>
           <w:p>
-            <w:pPr>
-              <w:pStyle w:val="tablecopy"/>
-            </w:pPr>
-            <w:r>
-              <w:t>0.637</w:t>
+            <w:r>
+              <w:t>0.550</w:t>
             </w:r>
           </w:p>
         </w:tc>
@@ -3168,11 +3303,8 @@
             <w:tcW w:w="1475" w:type="dxa"/>
           </w:tcPr>
           <w:p>
-            <w:pPr>
-              <w:pStyle w:val="tablecopy"/>
-            </w:pPr>
-            <w:r>
-              <w:t>0.750</w:t>
+            <w:r>
+              <w:t>0.718</w:t>
             </w:r>
           </w:p>
         </w:tc>
@@ -3181,11 +3313,8 @@
             <w:tcW w:w="1475" w:type="dxa"/>
           </w:tcPr>
           <w:p>
-            <w:pPr>
-              <w:pStyle w:val="tablecopy"/>
-            </w:pPr>
-            <w:r>
-              <w:t>0.806</w:t>
+            <w:r>
+              <w:t>0.856</w:t>
             </w:r>
           </w:p>
         </w:tc>
@@ -3194,11 +3323,8 @@
             <w:tcW w:w="1475" w:type="dxa"/>
           </w:tcPr>
           <w:p>
-            <w:pPr>
-              <w:pStyle w:val="tablecopy"/>
-            </w:pPr>
-            <w:r>
-              <w:t>0.757</w:t>
+            <w:r>
+              <w:t>0.738</w:t>
             </w:r>
           </w:p>
         </w:tc>
@@ -3207,11 +3333,8 @@
             <w:tcW w:w="1475" w:type="dxa"/>
           </w:tcPr>
           <w:p>
-            <w:pPr>
-              <w:pStyle w:val="tablecopy"/>
-            </w:pPr>
-            <w:r>
-              <w:t>0.534</w:t>
+            <w:r>
+              <w:t>0.522</w:t>
             </w:r>
           </w:p>
         </w:tc>
@@ -3225,9 +3348,6 @@
             <w:tcW w:w="1475" w:type="dxa"/>
           </w:tcPr>
           <w:p>
-            <w:pPr>
-              <w:pStyle w:val="tablecopy"/>
-            </w:pPr>
             <w:r>
               <w:t>0.500</w:t>
             </w:r>
@@ -3238,11 +3358,8 @@
             <w:tcW w:w="1475" w:type="dxa"/>
           </w:tcPr>
           <w:p>
-            <w:pPr>
-              <w:pStyle w:val="tablecopy"/>
-            </w:pPr>
-            <w:r>
-              <w:t>0.729</w:t>
+            <w:r>
+              <w:t>0.806</w:t>
             </w:r>
           </w:p>
         </w:tc>
@@ -3251,11 +3368,8 @@
             <w:tcW w:w="1475" w:type="dxa"/>
           </w:tcPr>
           <w:p>
-            <w:pPr>
-              <w:pStyle w:val="tablecopy"/>
-            </w:pPr>
-            <w:r>
-              <w:t>0.842</w:t>
+            <w:r>
+              <w:t>0.762</w:t>
             </w:r>
           </w:p>
         </w:tc>
@@ -3264,11 +3378,8 @@
             <w:tcW w:w="1475" w:type="dxa"/>
           </w:tcPr>
           <w:p>
-            <w:pPr>
-              <w:pStyle w:val="tablecopy"/>
-            </w:pPr>
-            <w:r>
-              <w:t>0.851</w:t>
+            <w:r>
+              <w:t>0.807</w:t>
             </w:r>
           </w:p>
         </w:tc>
@@ -3277,11 +3388,8 @@
             <w:tcW w:w="1475" w:type="dxa"/>
           </w:tcPr>
           <w:p>
-            <w:pPr>
-              <w:pStyle w:val="tablecopy"/>
-            </w:pPr>
-            <w:r>
-              <w:t>0.715</w:t>
+            <w:r>
+              <w:t>0.760</w:t>
             </w:r>
           </w:p>
         </w:tc>
@@ -3290,11 +3398,8 @@
             <w:tcW w:w="1475" w:type="dxa"/>
           </w:tcPr>
           <w:p>
-            <w:pPr>
-              <w:pStyle w:val="tablecopy"/>
-            </w:pPr>
-            <w:r>
-              <w:t>0.785</w:t>
+            <w:r>
+              <w:t>0.784</w:t>
             </w:r>
           </w:p>
         </w:tc>
@@ -3303,11 +3408,8 @@
             <w:tcW w:w="1475" w:type="dxa"/>
           </w:tcPr>
           <w:p>
-            <w:pPr>
-              <w:pStyle w:val="tablecopy"/>
-            </w:pPr>
-            <w:r>
-              <w:t>0.568</w:t>
+            <w:r>
+              <w:t>0.567</w:t>
             </w:r>
           </w:p>
         </w:tc>
@@ -3321,9 +3423,6 @@
             <w:tcW w:w="1475" w:type="dxa"/>
           </w:tcPr>
           <w:p>
-            <w:pPr>
-              <w:pStyle w:val="tablecopy"/>
-            </w:pPr>
             <w:r>
               <w:t>0.700</w:t>
             </w:r>
@@ -3334,11 +3433,8 @@
             <w:tcW w:w="1475" w:type="dxa"/>
           </w:tcPr>
           <w:p>
-            <w:pPr>
-              <w:pStyle w:val="tablecopy"/>
-            </w:pPr>
-            <w:r>
-              <w:t>0.525</w:t>
+            <w:r>
+              <w:t>0.591</w:t>
             </w:r>
           </w:p>
         </w:tc>
@@ -3347,11 +3443,8 @@
             <w:tcW w:w="1475" w:type="dxa"/>
           </w:tcPr>
           <w:p>
-            <w:pPr>
-              <w:pStyle w:val="tablecopy"/>
-            </w:pPr>
-            <w:r>
-              <w:t>0.925</w:t>
+            <w:r>
+              <w:t>0.915</w:t>
             </w:r>
           </w:p>
         </w:tc>
@@ -3360,9 +3453,6 @@
             <w:tcW w:w="1475" w:type="dxa"/>
           </w:tcPr>
           <w:p>
-            <w:pPr>
-              <w:pStyle w:val="tablecopy"/>
-            </w:pPr>
             <w:r>
               <w:t>0.896</w:t>
             </w:r>
@@ -3373,11 +3463,8 @@
             <w:tcW w:w="1475" w:type="dxa"/>
           </w:tcPr>
           <w:p>
-            <w:pPr>
-              <w:pStyle w:val="tablecopy"/>
-            </w:pPr>
-            <w:r>
-              <w:t>0.611</w:t>
+            <w:r>
+              <w:t>0.644</w:t>
             </w:r>
           </w:p>
         </w:tc>
@@ -3386,11 +3473,8 @@
             <w:tcW w:w="1475" w:type="dxa"/>
           </w:tcPr>
           <w:p>
-            <w:pPr>
-              <w:pStyle w:val="tablecopy"/>
-            </w:pPr>
-            <w:r>
-              <w:t>0.725</w:t>
+            <w:r>
+              <w:t>0.753</w:t>
             </w:r>
           </w:p>
         </w:tc>
@@ -3399,11 +3483,8 @@
             <w:tcW w:w="1475" w:type="dxa"/>
           </w:tcPr>
           <w:p>
-            <w:pPr>
-              <w:pStyle w:val="tablecopy"/>
-            </w:pPr>
-            <w:r>
-              <w:t>0.477</w:t>
+            <w:r>
+              <w:t>0.523</w:t>
             </w:r>
           </w:p>
         </w:tc>
@@ -3414,7 +3495,7 @@
         <w:pStyle w:val="tablehead"/>
       </w:pPr>
       <w:r>
-        <w:t>Top Global Explanation Features</w:t>
+        <w:t>Top Global Explanation Features (Permutation Importance)</w:t>
       </w:r>
     </w:p>
     <w:tbl>
@@ -3432,8 +3513,8 @@
         <w:tblLook w:val="04A0" w:firstRow="1" w:lastRow="0" w:firstColumn="1" w:lastColumn="0" w:noHBand="0" w:noVBand="1"/>
       </w:tblPr>
       <w:tblGrid>
-        <w:gridCol w:w="2322"/>
-        <w:gridCol w:w="2494"/>
+        <w:gridCol w:w="2349"/>
+        <w:gridCol w:w="2568"/>
       </w:tblGrid>
       <w:tr>
         <w:trPr>
@@ -3444,10 +3525,10 @@
             <w:tcW w:w="5162" w:type="dxa"/>
           </w:tcPr>
           <w:p>
-            <w:pPr>
-              <w:pStyle w:val="tablecolhead"/>
-            </w:pPr>
-            <w:r>
+            <w:r>
+              <w:rPr>
+                <w:b/>
+              </w:rPr>
               <w:t>Feature</w:t>
             </w:r>
           </w:p>
@@ -3457,10 +3538,10 @@
             <w:tcW w:w="5162" w:type="dxa"/>
           </w:tcPr>
           <w:p>
-            <w:pPr>
-              <w:pStyle w:val="tablecolhead"/>
-            </w:pPr>
-            <w:r>
+            <w:r>
+              <w:rPr>
+                <w:b/>
+              </w:rPr>
               <w:t>Importance</w:t>
             </w:r>
           </w:p>
@@ -3475,9 +3556,6 @@
             <w:tcW w:w="5162" w:type="dxa"/>
           </w:tcPr>
           <w:p>
-            <w:pPr>
-              <w:pStyle w:val="tablecopy"/>
-            </w:pPr>
             <w:r>
               <w:t>cp</w:t>
             </w:r>
@@ -3488,11 +3566,8 @@
             <w:tcW w:w="5162" w:type="dxa"/>
           </w:tcPr>
           <w:p>
-            <w:pPr>
-              <w:pStyle w:val="tablecopy"/>
-            </w:pPr>
-            <w:r>
-              <w:t>1.921</w:t>
+            <w:r>
+              <w:t>0.060</w:t>
             </w:r>
           </w:p>
         </w:tc>
@@ -3506,11 +3581,8 @@
             <w:tcW w:w="5162" w:type="dxa"/>
           </w:tcPr>
           <w:p>
-            <w:pPr>
-              <w:pStyle w:val="tablecopy"/>
-            </w:pPr>
-            <w:r>
-              <w:t>sex</w:t>
+            <w:r>
+              <w:t>chol</w:t>
             </w:r>
           </w:p>
         </w:tc>
@@ -3519,11 +3591,8 @@
             <w:tcW w:w="5162" w:type="dxa"/>
           </w:tcPr>
           <w:p>
-            <w:pPr>
-              <w:pStyle w:val="tablecopy"/>
-            </w:pPr>
-            <w:r>
-              <w:t>0.934</w:t>
+            <w:r>
+              <w:t>0.047</w:t>
             </w:r>
           </w:p>
         </w:tc>
@@ -3537,11 +3606,8 @@
             <w:tcW w:w="5162" w:type="dxa"/>
           </w:tcPr>
           <w:p>
-            <w:pPr>
-              <w:pStyle w:val="tablecopy"/>
-            </w:pPr>
-            <w:r>
-              <w:t>exang</w:t>
+            <w:r>
+              <w:t>oldpeak</w:t>
             </w:r>
           </w:p>
         </w:tc>
@@ -3550,11 +3616,8 @@
             <w:tcW w:w="5162" w:type="dxa"/>
           </w:tcPr>
           <w:p>
-            <w:pPr>
-              <w:pStyle w:val="tablecopy"/>
-            </w:pPr>
-            <w:r>
-              <w:t>0.868</w:t>
+            <w:r>
+              <w:t>0.021</w:t>
             </w:r>
           </w:p>
         </w:tc>
@@ -3568,11 +3631,8 @@
             <w:tcW w:w="5162" w:type="dxa"/>
           </w:tcPr>
           <w:p>
-            <w:pPr>
-              <w:pStyle w:val="tablecopy"/>
-            </w:pPr>
-            <w:r>
-              <w:t>thal</w:t>
+            <w:r>
+              <w:t>exang</w:t>
             </w:r>
           </w:p>
         </w:tc>
@@ -3581,11 +3641,8 @@
             <w:tcW w:w="5162" w:type="dxa"/>
           </w:tcPr>
           <w:p>
-            <w:pPr>
-              <w:pStyle w:val="tablecopy"/>
-            </w:pPr>
-            <w:r>
-              <w:t>0.739</w:t>
+            <w:r>
+              <w:t>0.020</w:t>
             </w:r>
           </w:p>
         </w:tc>
@@ -3599,11 +3656,8 @@
             <w:tcW w:w="5162" w:type="dxa"/>
           </w:tcPr>
           <w:p>
-            <w:pPr>
-              <w:pStyle w:val="tablecopy"/>
-            </w:pPr>
-            <w:r>
-              <w:t>slope</w:t>
+            <w:r>
+              <w:t>sex</w:t>
             </w:r>
           </w:p>
         </w:tc>
@@ -3612,11 +3666,8 @@
             <w:tcW w:w="5162" w:type="dxa"/>
           </w:tcPr>
           <w:p>
-            <w:pPr>
-              <w:pStyle w:val="tablecopy"/>
-            </w:pPr>
-            <w:r>
-              <w:t>0.598</w:t>
+            <w:r>
+              <w:t>0.012</w:t>
             </w:r>
           </w:p>
         </w:tc>
@@ -3630,11 +3681,8 @@
             <w:tcW w:w="5162" w:type="dxa"/>
           </w:tcPr>
           <w:p>
-            <w:pPr>
-              <w:pStyle w:val="tablecopy"/>
-            </w:pPr>
-            <w:r>
-              <w:t>oldpeak</w:t>
+            <w:r>
+              <w:t>age</w:t>
             </w:r>
           </w:p>
         </w:tc>
@@ -3643,11 +3691,8 @@
             <w:tcW w:w="5162" w:type="dxa"/>
           </w:tcPr>
           <w:p>
-            <w:pPr>
-              <w:pStyle w:val="tablecopy"/>
-            </w:pPr>
-            <w:r>
-              <w:t>0.512</w:t>
+            <w:r>
+              <w:t>0.008</w:t>
             </w:r>
           </w:p>
         </w:tc>
@@ -3661,11 +3706,8 @@
             <w:tcW w:w="5162" w:type="dxa"/>
           </w:tcPr>
           <w:p>
-            <w:pPr>
-              <w:pStyle w:val="tablecopy"/>
-            </w:pPr>
-            <w:r>
-              <w:t>chol</w:t>
+            <w:r>
+              <w:t>thal</w:t>
             </w:r>
           </w:p>
         </w:tc>
@@ -3674,11 +3716,8 @@
             <w:tcW w:w="5162" w:type="dxa"/>
           </w:tcPr>
           <w:p>
-            <w:pPr>
-              <w:pStyle w:val="tablecopy"/>
-            </w:pPr>
-            <w:r>
-              <w:t>0.447</w:t>
+            <w:r>
+              <w:t>0.007</w:t>
             </w:r>
           </w:p>
         </w:tc>
@@ -3692,11 +3731,8 @@
             <w:tcW w:w="5162" w:type="dxa"/>
           </w:tcPr>
           <w:p>
-            <w:pPr>
-              <w:pStyle w:val="tablecopy"/>
-            </w:pPr>
-            <w:r>
-              <w:t>fbs</w:t>
+            <w:r>
+              <w:t>thalach</w:t>
             </w:r>
           </w:p>
         </w:tc>
@@ -3705,11 +3741,8 @@
             <w:tcW w:w="5162" w:type="dxa"/>
           </w:tcPr>
           <w:p>
-            <w:pPr>
-              <w:pStyle w:val="tablecopy"/>
-            </w:pPr>
-            <w:r>
-              <w:t>0.399</w:t>
+            <w:r>
+              <w:t>0.007</w:t>
             </w:r>
           </w:p>
         </w:tc>
@@ -3730,7 +3763,7 @@
           <w:szCs w:val="24"/>
         </w:rPr>
         <w:drawing>
-          <wp:inline distT="0" distB="0" distL="0" distR="0" wp14:anchorId="16094FD2" wp14:editId="7E47F0F8">
+          <wp:inline distT="0" distB="0" distL="0" distR="0" wp14:anchorId="16094FD2" wp14:editId="22453F2F">
             <wp:extent cx="2907792" cy="1915529"/>
             <wp:effectExtent l="0" t="0" r="0" b="0"/>
             <wp:docPr id="1" name="Picture 1"/>
@@ -3848,10 +3881,10 @@
           <w:szCs w:val="24"/>
         </w:rPr>
         <w:drawing>
-          <wp:inline distT="0" distB="0" distL="0" distR="0" wp14:anchorId="609CB692" wp14:editId="7714E144">
-            <wp:extent cx="2907792" cy="1433336"/>
-            <wp:effectExtent l="0" t="0" r="0" b="0"/>
-            <wp:docPr id="3" name="Picture 3"/>
+          <wp:inline distT="0" distB="0" distL="0" distR="0" wp14:anchorId="24FB46CB" wp14:editId="0E83FE70">
+            <wp:extent cx="3064510" cy="1504315"/>
+            <wp:effectExtent l="0" t="0" r="2540" b="635"/>
+            <wp:docPr id="1586869401" name="Picture 2"/>
             <wp:cNvGraphicFramePr>
               <a:graphicFrameLocks xmlns:a="http://schemas.openxmlformats.org/drawingml/2006/main" noChangeAspect="1"/>
             </wp:cNvGraphicFramePr>
@@ -3859,7 +3892,7 @@
               <a:graphicData uri="http://schemas.openxmlformats.org/drawingml/2006/picture">
                 <pic:pic xmlns:pic="http://schemas.openxmlformats.org/drawingml/2006/picture">
                   <pic:nvPicPr>
-                    <pic:cNvPr id="0" name="image.png"/>
+                    <pic:cNvPr id="1586869401" name="Picture 1586869401"/>
                     <pic:cNvPicPr/>
                   </pic:nvPicPr>
                   <pic:blipFill>
@@ -3871,7 +3904,7 @@
                   <pic:spPr>
                     <a:xfrm>
                       <a:off x="0" y="0"/>
-                      <a:ext cx="2907792" cy="1433336"/>
+                      <a:ext cx="3064510" cy="1504315"/>
                     </a:xfrm>
                     <a:prstGeom prst="rect">
                       <a:avLst/>
@@ -3907,10 +3940,10 @@
           <w:szCs w:val="24"/>
         </w:rPr>
         <w:drawing>
-          <wp:inline distT="0" distB="0" distL="0" distR="0" wp14:anchorId="7712F2EC" wp14:editId="2CFE4671">
-            <wp:extent cx="2907792" cy="1533517"/>
-            <wp:effectExtent l="0" t="0" r="0" b="0"/>
-            <wp:docPr id="4" name="Picture 4"/>
+          <wp:inline distT="0" distB="0" distL="0" distR="0" wp14:anchorId="6857C816" wp14:editId="3C11C060">
+            <wp:extent cx="3064510" cy="1674495"/>
+            <wp:effectExtent l="0" t="0" r="2540" b="1905"/>
+            <wp:docPr id="404443129" name="Picture 1"/>
             <wp:cNvGraphicFramePr>
               <a:graphicFrameLocks xmlns:a="http://schemas.openxmlformats.org/drawingml/2006/main" noChangeAspect="1"/>
             </wp:cNvGraphicFramePr>
@@ -3918,7 +3951,7 @@
               <a:graphicData uri="http://schemas.openxmlformats.org/drawingml/2006/picture">
                 <pic:pic xmlns:pic="http://schemas.openxmlformats.org/drawingml/2006/picture">
                   <pic:nvPicPr>
-                    <pic:cNvPr id="0" name="image.png"/>
+                    <pic:cNvPr id="404443129" name="Picture 404443129"/>
                     <pic:cNvPicPr/>
                   </pic:nvPicPr>
                   <pic:blipFill>
@@ -3930,7 +3963,7 @@
                   <pic:spPr>
                     <a:xfrm>
                       <a:off x="0" y="0"/>
-                      <a:ext cx="2907792" cy="1533517"/>
+                      <a:ext cx="3064510" cy="1674495"/>
                     </a:xfrm>
                     <a:prstGeom prst="rect">
                       <a:avLst/>
@@ -3952,24 +3985,15 @@
       </w:r>
     </w:p>
     <w:p>
-      <w:pPr>
-        <w:spacing w:after="20"/>
-        <w:rPr>
-          <w:sz w:val="24"/>
-          <w:szCs w:val="24"/>
-        </w:rPr>
-      </w:pPr>
       <w:r>
         <w:rPr>
           <w:noProof/>
-          <w:sz w:val="24"/>
-          <w:szCs w:val="24"/>
         </w:rPr>
         <w:drawing>
-          <wp:inline distT="0" distB="0" distL="0" distR="0" wp14:anchorId="31E11686" wp14:editId="2329D25F">
-            <wp:extent cx="2907792" cy="2943939"/>
+          <wp:inline distT="0" distB="0" distL="0" distR="0" wp14:anchorId="0DC08FB7" wp14:editId="2F561D26">
+            <wp:extent cx="2907792" cy="1431755"/>
             <wp:effectExtent l="0" t="0" r="0" b="0"/>
-            <wp:docPr id="5" name="Picture 5"/>
+            <wp:docPr id="443915589" name="Picture 443915589"/>
             <wp:cNvGraphicFramePr>
               <a:graphicFrameLocks xmlns:a="http://schemas.openxmlformats.org/drawingml/2006/main" noChangeAspect="1"/>
             </wp:cNvGraphicFramePr>
@@ -3977,7 +4001,7 @@
               <a:graphicData uri="http://schemas.openxmlformats.org/drawingml/2006/picture">
                 <pic:pic xmlns:pic="http://schemas.openxmlformats.org/drawingml/2006/picture">
                   <pic:nvPicPr>
-                    <pic:cNvPr id="0" name="image.png"/>
+                    <pic:cNvPr id="0" name="model_comparison_multi_metric.png"/>
                     <pic:cNvPicPr/>
                   </pic:nvPicPr>
                   <pic:blipFill>
@@ -3989,7 +4013,7 @@
                   <pic:spPr>
                     <a:xfrm>
                       <a:off x="0" y="0"/>
-                      <a:ext cx="2907792" cy="2943939"/>
+                      <a:ext cx="2907792" cy="1431755"/>
                     </a:xfrm>
                     <a:prstGeom prst="rect">
                       <a:avLst/>
@@ -4007,28 +4031,23 @@
         <w:pStyle w:val="figurecaption"/>
       </w:pPr>
       <w:r>
-        <w:t>ROC curves from held-out-center predictions.</w:t>
+        <w:t>Multi-metric model comparison across selected performance criteria.</w:t>
       </w:r>
     </w:p>
     <w:p>
       <w:pPr>
-        <w:spacing w:after="20"/>
-        <w:rPr>
-          <w:sz w:val="24"/>
-          <w:szCs w:val="24"/>
-        </w:rPr>
+        <w:pStyle w:val="figurecaption"/>
+        <w:numPr>
+          <w:ilvl w:val="0"/>
+          <w:numId w:val="0"/>
+        </w:numPr>
       </w:pPr>
       <w:r>
-        <w:rPr>
-          <w:noProof/>
-          <w:sz w:val="24"/>
-          <w:szCs w:val="24"/>
-        </w:rPr>
         <w:drawing>
-          <wp:inline distT="0" distB="0" distL="0" distR="0" wp14:anchorId="16784920" wp14:editId="1F9A1676">
-            <wp:extent cx="2907792" cy="2943939"/>
-            <wp:effectExtent l="0" t="0" r="0" b="0"/>
-            <wp:docPr id="6" name="Picture 6"/>
+          <wp:inline distT="0" distB="0" distL="0" distR="0" wp14:anchorId="0A2B077A" wp14:editId="1829AF4E">
+            <wp:extent cx="2907304" cy="1506828"/>
+            <wp:effectExtent l="0" t="0" r="7620" b="0"/>
+            <wp:docPr id="443915592" name="Picture 443915592"/>
             <wp:cNvGraphicFramePr>
               <a:graphicFrameLocks xmlns:a="http://schemas.openxmlformats.org/drawingml/2006/main" noChangeAspect="1"/>
             </wp:cNvGraphicFramePr>
@@ -4036,7 +4055,7 @@
               <a:graphicData uri="http://schemas.openxmlformats.org/drawingml/2006/picture">
                 <pic:pic xmlns:pic="http://schemas.openxmlformats.org/drawingml/2006/picture">
                   <pic:nvPicPr>
-                    <pic:cNvPr id="0" name="image.png"/>
+                    <pic:cNvPr id="0" name="threshold_sensitivity.png"/>
                     <pic:cNvPicPr/>
                   </pic:nvPicPr>
                   <pic:blipFill>
@@ -4048,7 +4067,7 @@
                   <pic:spPr>
                     <a:xfrm>
                       <a:off x="0" y="0"/>
-                      <a:ext cx="2907792" cy="2943939"/>
+                      <a:ext cx="2919540" cy="1513170"/>
                     </a:xfrm>
                     <a:prstGeom prst="rect">
                       <a:avLst/>
@@ -4066,7 +4085,7 @@
         <w:pStyle w:val="figurecaption"/>
       </w:pPr>
       <w:r>
-        <w:t>Precision-recall curves from held-out-center predictions.</w:t>
+        <w:t>Threshold sensitivity analysis for F1, sensitivity, and specificity.</w:t>
       </w:r>
     </w:p>
     <w:p>
@@ -4085,10 +4104,10 @@
         </w:rPr>
         <w:lastRenderedPageBreak/>
         <w:drawing>
-          <wp:inline distT="0" distB="0" distL="0" distR="0" wp14:anchorId="755C6B6E" wp14:editId="75924E7F">
-            <wp:extent cx="2907792" cy="2408375"/>
-            <wp:effectExtent l="0" t="0" r="0" b="0"/>
-            <wp:docPr id="7" name="Picture 7"/>
+          <wp:inline distT="0" distB="0" distL="0" distR="0" wp14:anchorId="575845A5" wp14:editId="1480DF1E">
+            <wp:extent cx="3064510" cy="2949262"/>
+            <wp:effectExtent l="0" t="0" r="2540" b="3810"/>
+            <wp:docPr id="1018644459" name="Picture 3"/>
             <wp:cNvGraphicFramePr>
               <a:graphicFrameLocks xmlns:a="http://schemas.openxmlformats.org/drawingml/2006/main" noChangeAspect="1"/>
             </wp:cNvGraphicFramePr>
@@ -4096,7 +4115,7 @@
               <a:graphicData uri="http://schemas.openxmlformats.org/drawingml/2006/picture">
                 <pic:pic xmlns:pic="http://schemas.openxmlformats.org/drawingml/2006/picture">
                   <pic:nvPicPr>
-                    <pic:cNvPr id="0" name="image.png"/>
+                    <pic:cNvPr id="1018644459" name="Picture 1018644459"/>
                     <pic:cNvPicPr/>
                   </pic:nvPicPr>
                   <pic:blipFill>
@@ -4108,7 +4127,7 @@
                   <pic:spPr>
                     <a:xfrm>
                       <a:off x="0" y="0"/>
-                      <a:ext cx="2907792" cy="2408375"/>
+                      <a:ext cx="3068776" cy="2953367"/>
                     </a:xfrm>
                     <a:prstGeom prst="rect">
                       <a:avLst/>
@@ -4126,7 +4145,7 @@
         <w:pStyle w:val="figurecaption"/>
       </w:pPr>
       <w:r>
-        <w:t>Calibration curves for compared models.</w:t>
+        <w:t>ROC curves from held-out-center predictions.</w:t>
       </w:r>
     </w:p>
     <w:p>
@@ -4144,10 +4163,10 @@
           <w:szCs w:val="24"/>
         </w:rPr>
         <w:drawing>
-          <wp:inline distT="0" distB="0" distL="0" distR="0" wp14:anchorId="08DA61F0" wp14:editId="3CEBFB25">
-            <wp:extent cx="2907792" cy="3021823"/>
-            <wp:effectExtent l="0" t="0" r="0" b="0"/>
-            <wp:docPr id="8" name="Picture 8"/>
+          <wp:inline distT="0" distB="0" distL="0" distR="0" wp14:anchorId="4CB55B21" wp14:editId="62A9715B">
+            <wp:extent cx="3064130" cy="2582214"/>
+            <wp:effectExtent l="0" t="0" r="3175" b="8890"/>
+            <wp:docPr id="1370987368" name="Picture 4"/>
             <wp:cNvGraphicFramePr>
               <a:graphicFrameLocks xmlns:a="http://schemas.openxmlformats.org/drawingml/2006/main" noChangeAspect="1"/>
             </wp:cNvGraphicFramePr>
@@ -4155,7 +4174,7 @@
               <a:graphicData uri="http://schemas.openxmlformats.org/drawingml/2006/picture">
                 <pic:pic xmlns:pic="http://schemas.openxmlformats.org/drawingml/2006/picture">
                   <pic:nvPicPr>
-                    <pic:cNvPr id="0" name="image.png"/>
+                    <pic:cNvPr id="1370987368" name="Picture 1370987368"/>
                     <pic:cNvPicPr/>
                   </pic:nvPicPr>
                   <pic:blipFill>
@@ -4167,7 +4186,7 @@
                   <pic:spPr>
                     <a:xfrm>
                       <a:off x="0" y="0"/>
-                      <a:ext cx="2907792" cy="3021823"/>
+                      <a:ext cx="3074193" cy="2590694"/>
                     </a:xfrm>
                     <a:prstGeom prst="rect">
                       <a:avLst/>
@@ -4185,7 +4204,7 @@
         <w:pStyle w:val="figurecaption"/>
       </w:pPr>
       <w:r>
-        <w:t>Confusion matrix for the selected model at threshold 0.50.</w:t>
+        <w:t>Precision-recall curves from held-out-center predictions.</w:t>
       </w:r>
     </w:p>
     <w:p>
@@ -4203,10 +4222,10 @@
           <w:szCs w:val="24"/>
         </w:rPr>
         <w:drawing>
-          <wp:inline distT="0" distB="0" distL="0" distR="0" wp14:anchorId="440E94CE" wp14:editId="7E6F7EEB">
-            <wp:extent cx="2907792" cy="1915529"/>
-            <wp:effectExtent l="0" t="0" r="0" b="0"/>
-            <wp:docPr id="9" name="Picture 9"/>
+          <wp:inline distT="0" distB="0" distL="0" distR="0" wp14:anchorId="2DC237ED" wp14:editId="44C1E40D">
+            <wp:extent cx="3064510" cy="2704564"/>
+            <wp:effectExtent l="0" t="0" r="2540" b="635"/>
+            <wp:docPr id="311905120" name="Picture 5"/>
             <wp:cNvGraphicFramePr>
               <a:graphicFrameLocks xmlns:a="http://schemas.openxmlformats.org/drawingml/2006/main" noChangeAspect="1"/>
             </wp:cNvGraphicFramePr>
@@ -4214,7 +4233,7 @@
               <a:graphicData uri="http://schemas.openxmlformats.org/drawingml/2006/picture">
                 <pic:pic xmlns:pic="http://schemas.openxmlformats.org/drawingml/2006/picture">
                   <pic:nvPicPr>
-                    <pic:cNvPr id="0" name="image.png"/>
+                    <pic:cNvPr id="311905120" name="Picture 311905120"/>
                     <pic:cNvPicPr/>
                   </pic:nvPicPr>
                   <pic:blipFill>
@@ -4226,7 +4245,7 @@
                   <pic:spPr>
                     <a:xfrm>
                       <a:off x="0" y="0"/>
-                      <a:ext cx="2907792" cy="1915529"/>
+                      <a:ext cx="3078185" cy="2716632"/>
                     </a:xfrm>
                     <a:prstGeom prst="rect">
                       <a:avLst/>
@@ -4244,7 +4263,7 @@
         <w:pStyle w:val="figurecaption"/>
       </w:pPr>
       <w:r>
-        <w:t>Decision-curve analysis for threshold-probability ranges.</w:t>
+        <w:t>Calibration curves for compared models.</w:t>
       </w:r>
     </w:p>
     <w:p>
@@ -4262,10 +4281,10 @@
           <w:szCs w:val="24"/>
         </w:rPr>
         <w:drawing>
-          <wp:inline distT="0" distB="0" distL="0" distR="0" wp14:anchorId="166506A5" wp14:editId="3CBC926D">
-            <wp:extent cx="2907792" cy="2062324"/>
-            <wp:effectExtent l="0" t="0" r="0" b="0"/>
-            <wp:docPr id="10" name="Picture 10"/>
+          <wp:inline distT="0" distB="0" distL="0" distR="0" wp14:anchorId="4A3CB9B3" wp14:editId="539E73E9">
+            <wp:extent cx="3063722" cy="2363273"/>
+            <wp:effectExtent l="0" t="0" r="3810" b="0"/>
+            <wp:docPr id="1197014876" name="Picture 6"/>
             <wp:cNvGraphicFramePr>
               <a:graphicFrameLocks xmlns:a="http://schemas.openxmlformats.org/drawingml/2006/main" noChangeAspect="1"/>
             </wp:cNvGraphicFramePr>
@@ -4273,7 +4292,7 @@
               <a:graphicData uri="http://schemas.openxmlformats.org/drawingml/2006/picture">
                 <pic:pic xmlns:pic="http://schemas.openxmlformats.org/drawingml/2006/picture">
                   <pic:nvPicPr>
-                    <pic:cNvPr id="0" name="image.png"/>
+                    <pic:cNvPr id="1197014876" name="Picture 1197014876"/>
                     <pic:cNvPicPr/>
                   </pic:nvPicPr>
                   <pic:blipFill>
@@ -4285,7 +4304,7 @@
                   <pic:spPr>
                     <a:xfrm>
                       <a:off x="0" y="0"/>
-                      <a:ext cx="2907792" cy="2062324"/>
+                      <a:ext cx="3070162" cy="2368241"/>
                     </a:xfrm>
                     <a:prstGeom prst="rect">
                       <a:avLst/>
@@ -4303,7 +4322,7 @@
         <w:pStyle w:val="figurecaption"/>
       </w:pPr>
       <w:r>
-        <w:t>Global feature importance for the selected model.</w:t>
+        <w:t>Confusion matrix for the selected model at threshold 0.50.</w:t>
       </w:r>
     </w:p>
     <w:p>
@@ -4321,10 +4340,10 @@
           <w:szCs w:val="24"/>
         </w:rPr>
         <w:drawing>
-          <wp:inline distT="0" distB="0" distL="0" distR="0" wp14:anchorId="294A3910" wp14:editId="1F7BF002">
-            <wp:extent cx="2907792" cy="2326484"/>
-            <wp:effectExtent l="0" t="0" r="0" b="0"/>
-            <wp:docPr id="11" name="Picture 11"/>
+          <wp:inline distT="0" distB="0" distL="0" distR="0" wp14:anchorId="166506A5" wp14:editId="4DDBFAF0">
+            <wp:extent cx="2905790" cy="1712890"/>
+            <wp:effectExtent l="0" t="0" r="8890" b="1905"/>
+            <wp:docPr id="10" name="Picture 10"/>
             <wp:cNvGraphicFramePr>
               <a:graphicFrameLocks xmlns:a="http://schemas.openxmlformats.org/drawingml/2006/main" noChangeAspect="1"/>
             </wp:cNvGraphicFramePr>
@@ -4344,7 +4363,7 @@
                   <pic:spPr>
                     <a:xfrm>
                       <a:off x="0" y="0"/>
-                      <a:ext cx="2907792" cy="2326484"/>
+                      <a:ext cx="2926076" cy="1724848"/>
                     </a:xfrm>
                     <a:prstGeom prst="rect">
                       <a:avLst/>
@@ -4362,7 +4381,167 @@
         <w:pStyle w:val="figurecaption"/>
       </w:pPr>
       <w:r>
+        <w:t>Global feature importance for the selected model.</w:t>
+      </w:r>
+    </w:p>
+    <w:p>
+      <w:pPr>
+        <w:spacing w:after="20"/>
+        <w:rPr>
+          <w:sz w:val="24"/>
+          <w:szCs w:val="24"/>
+        </w:rPr>
+      </w:pPr>
+      <w:r>
+        <w:rPr>
+          <w:noProof/>
+          <w:sz w:val="24"/>
+          <w:szCs w:val="24"/>
+        </w:rPr>
+        <w:drawing>
+          <wp:inline distT="0" distB="0" distL="0" distR="0" wp14:anchorId="294A3910" wp14:editId="69F8689D">
+            <wp:extent cx="2906562" cy="1989786"/>
+            <wp:effectExtent l="0" t="0" r="8255" b="0"/>
+            <wp:docPr id="11" name="Picture 11"/>
+            <wp:cNvGraphicFramePr>
+              <a:graphicFrameLocks xmlns:a="http://schemas.openxmlformats.org/drawingml/2006/main" noChangeAspect="1"/>
+            </wp:cNvGraphicFramePr>
+            <a:graphic xmlns:a="http://schemas.openxmlformats.org/drawingml/2006/main">
+              <a:graphicData uri="http://schemas.openxmlformats.org/drawingml/2006/picture">
+                <pic:pic xmlns:pic="http://schemas.openxmlformats.org/drawingml/2006/picture">
+                  <pic:nvPicPr>
+                    <pic:cNvPr id="0" name="image.png"/>
+                    <pic:cNvPicPr/>
+                  </pic:nvPicPr>
+                  <pic:blipFill>
+                    <a:blip r:embed="rId18"/>
+                    <a:stretch>
+                      <a:fillRect/>
+                    </a:stretch>
+                  </pic:blipFill>
+                  <pic:spPr>
+                    <a:xfrm>
+                      <a:off x="0" y="0"/>
+                      <a:ext cx="2940076" cy="2012729"/>
+                    </a:xfrm>
+                    <a:prstGeom prst="rect">
+                      <a:avLst/>
+                    </a:prstGeom>
+                  </pic:spPr>
+                </pic:pic>
+              </a:graphicData>
+            </a:graphic>
+          </wp:inline>
+        </w:drawing>
+      </w:r>
+    </w:p>
+    <w:p>
+      <w:pPr>
+        <w:pStyle w:val="figurecaption"/>
+      </w:pPr>
+      <w:r>
         <w:t>SHAP-style summary plot for explanation review.</w:t>
+      </w:r>
+    </w:p>
+    <w:p>
+      <w:r>
+        <w:rPr>
+          <w:noProof/>
+        </w:rPr>
+        <w:drawing>
+          <wp:inline distT="0" distB="0" distL="0" distR="0" wp14:anchorId="63AD341E" wp14:editId="7D604C6B">
+            <wp:extent cx="2907304" cy="1629177"/>
+            <wp:effectExtent l="0" t="0" r="7620" b="9525"/>
+            <wp:docPr id="443915593" name="Picture 443915593"/>
+            <wp:cNvGraphicFramePr>
+              <a:graphicFrameLocks xmlns:a="http://schemas.openxmlformats.org/drawingml/2006/main" noChangeAspect="1"/>
+            </wp:cNvGraphicFramePr>
+            <a:graphic xmlns:a="http://schemas.openxmlformats.org/drawingml/2006/main">
+              <a:graphicData uri="http://schemas.openxmlformats.org/drawingml/2006/picture">
+                <pic:pic xmlns:pic="http://schemas.openxmlformats.org/drawingml/2006/picture">
+                  <pic:nvPicPr>
+                    <pic:cNvPr id="0" name="learning_curves.png"/>
+                    <pic:cNvPicPr/>
+                  </pic:nvPicPr>
+                  <pic:blipFill>
+                    <a:blip r:embed="rId19"/>
+                    <a:stretch>
+                      <a:fillRect/>
+                    </a:stretch>
+                  </pic:blipFill>
+                  <pic:spPr>
+                    <a:xfrm>
+                      <a:off x="0" y="0"/>
+                      <a:ext cx="2918110" cy="1635232"/>
+                    </a:xfrm>
+                    <a:prstGeom prst="rect">
+                      <a:avLst/>
+                    </a:prstGeom>
+                  </pic:spPr>
+                </pic:pic>
+              </a:graphicData>
+            </a:graphic>
+          </wp:inline>
+        </w:drawing>
+      </w:r>
+    </w:p>
+    <w:p>
+      <w:pPr>
+        <w:pStyle w:val="figurecaption"/>
+      </w:pPr>
+      <w:r>
+        <w:t>Learning curve for the selected model.</w:t>
+      </w:r>
+    </w:p>
+    <w:p>
+      <w:r>
+        <w:rPr>
+          <w:noProof/>
+        </w:rPr>
+        <w:lastRenderedPageBreak/>
+        <w:drawing>
+          <wp:inline distT="0" distB="0" distL="0" distR="0" wp14:anchorId="76B918D9" wp14:editId="2F3D6EBE">
+            <wp:extent cx="2906654" cy="1687132"/>
+            <wp:effectExtent l="0" t="0" r="8255" b="8890"/>
+            <wp:docPr id="443915594" name="Picture 443915594"/>
+            <wp:cNvGraphicFramePr>
+              <a:graphicFrameLocks xmlns:a="http://schemas.openxmlformats.org/drawingml/2006/main" noChangeAspect="1"/>
+            </wp:cNvGraphicFramePr>
+            <a:graphic xmlns:a="http://schemas.openxmlformats.org/drawingml/2006/main">
+              <a:graphicData uri="http://schemas.openxmlformats.org/drawingml/2006/picture">
+                <pic:pic xmlns:pic="http://schemas.openxmlformats.org/drawingml/2006/picture">
+                  <pic:nvPicPr>
+                    <pic:cNvPr id="0" name="delong_heatmap.png"/>
+                    <pic:cNvPicPr/>
+                  </pic:nvPicPr>
+                  <pic:blipFill>
+                    <a:blip r:embed="rId20"/>
+                    <a:stretch>
+                      <a:fillRect/>
+                    </a:stretch>
+                  </pic:blipFill>
+                  <pic:spPr>
+                    <a:xfrm>
+                      <a:off x="0" y="0"/>
+                      <a:ext cx="2951568" cy="1713202"/>
+                    </a:xfrm>
+                    <a:prstGeom prst="rect">
+                      <a:avLst/>
+                    </a:prstGeom>
+                  </pic:spPr>
+                </pic:pic>
+              </a:graphicData>
+            </a:graphic>
+          </wp:inline>
+        </w:drawing>
+      </w:r>
+    </w:p>
+    <w:p>
+      <w:pPr>
+        <w:pStyle w:val="figurecaption"/>
+      </w:pPr>
+      <w:r>
+        <w:t>DeLong pairwise AUROC test heatmap.</w:t>
       </w:r>
     </w:p>
     <w:p>
@@ -4378,7 +4557,7 @@
         <w:pStyle w:val="BodyText"/>
       </w:pPr>
       <w:r>
-        <w:t>The main comparative study is the model-family comparison. The MLP baseline was preserved from the original notebook direction but underperformed logistic regression and tree-based models on several metrics. This supports the final decision to keep the neural network as a comparator rather than the champion.</w:t>
+        <w:t>The main comparative study is the model-family comparison. The MLP baseline was preserved from the original notebook direction but underperformed the calibrated gradient boosting, SVM, random-forest, logistic-regression, and stacking alternatives on the composite ranking. This supports the final decision to keep the neural network as a comparator rather than the champion.</w:t>
       </w:r>
     </w:p>
     <w:p>
@@ -4386,7 +4565,7 @@
         <w:pStyle w:val="BodyText"/>
       </w:pPr>
       <w:r>
-        <w:t>The duplicate sensitivity analysis showed why heart.csv is supplementary. The duplicate-expanded version produced slightly stronger apparent performance than the deduplicated version. Because duplicate rows can make evaluation easier and less realistic, the deduplicated result is the only defensible supplementary benchmark.</w:t>
+        <w:t>The duplicate sensitivity analysis showed why heart.csv is supplementary. The duplicate-expanded version produced stronger apparent performance than the deduplicated version, especially AUROC 0.955 versus 0.903 and Brier score 0.086 versus 0.126. Because duplicate rows can make evaluation easier and less realistic, the deduplicated result is the only defensible supplementary benchmark.</w:t>
       </w:r>
     </w:p>
     <w:p>
@@ -4409,6 +4588,17 @@
       <w:pPr>
         <w:pStyle w:val="BodyText"/>
       </w:pPr>
+      <w:r>
+        <w:t>The statistical comparison artifacts add another check on the model claims. DeLong pairwise testing on pooled held-out predictions found several significant AUROC differences, including calibrated gradient boosting versus the MLP baseline and XGBoost. However, the per-center Friedman test was not significant at the 0.05 level (chi-square = 15.109, p = 0.088), which is expected given only four held-out centers and supports cautious interpretation rather than overclaiming superiority.</w:t>
+      </w:r>
+    </w:p>
+    <w:p>
+      <w:pPr>
+        <w:pStyle w:val="tablehead"/>
+      </w:pPr>
+      <w:r>
+        <w:t>Duplicate Sensitivity on Supplementary heart.csv</w:t>
+      </w:r>
     </w:p>
     <w:tbl>
       <w:tblPr>
@@ -4422,15 +4612,16 @@
           <w:insideH w:val="single" w:sz="4" w:space="0" w:color="999999"/>
           <w:insideV w:val="single" w:sz="4" w:space="0" w:color="999999"/>
         </w:tblBorders>
+        <w:tblLayout w:type="fixed"/>
         <w:tblLook w:val="04A0" w:firstRow="1" w:lastRow="0" w:firstColumn="1" w:lastColumn="0" w:noHBand="0" w:noVBand="1"/>
       </w:tblPr>
       <w:tblGrid>
-        <w:gridCol w:w="1355"/>
-        <w:gridCol w:w="825"/>
-        <w:gridCol w:w="799"/>
-        <w:gridCol w:w="603"/>
-        <w:gridCol w:w="608"/>
-        <w:gridCol w:w="626"/>
+        <w:gridCol w:w="1211"/>
+        <w:gridCol w:w="764"/>
+        <w:gridCol w:w="720"/>
+        <w:gridCol w:w="720"/>
+        <w:gridCol w:w="810"/>
+        <w:gridCol w:w="692"/>
       </w:tblGrid>
       <w:tr>
         <w:trPr>
@@ -4438,99 +4629,78 @@
         </w:trPr>
         <w:tc>
           <w:tcPr>
-            <w:tcW w:w="1721" w:type="dxa"/>
-          </w:tcPr>
-          <w:p>
-            <w:pPr>
-              <w:pStyle w:val="tablecolhead"/>
+            <w:tcW w:w="1211" w:type="dxa"/>
+          </w:tcPr>
+          <w:p>
+            <w:r>
               <w:rPr>
-                <w:b w:val="0"/>
-                <w:bCs w:val="0"/>
-                <w:smallCaps/>
-                <w:noProof/>
+                <w:b/>
               </w:rPr>
-            </w:pPr>
+              <w:t>Dataset Version</w:t>
+            </w:r>
+          </w:p>
+        </w:tc>
+        <w:tc>
+          <w:tcPr>
+            <w:tcW w:w="764" w:type="dxa"/>
+          </w:tcPr>
+          <w:p>
             <w:r>
               <w:rPr>
-                <w:b w:val="0"/>
-                <w:bCs w:val="0"/>
-                <w:smallCaps/>
-                <w:noProof/>
+                <w:b/>
               </w:rPr>
-              <w:lastRenderedPageBreak/>
-              <w:t>Table IX. Duplicate Sensitivity on Supplementary heart.csv</w:t>
-            </w:r>
-          </w:p>
-          <w:p>
-            <w:pPr>
-              <w:pStyle w:val="tablecolhead"/>
-            </w:pPr>
-            <w:r>
-              <w:t>Dataset Version</w:t>
-            </w:r>
-          </w:p>
-        </w:tc>
-        <w:tc>
-          <w:tcPr>
-            <w:tcW w:w="1721" w:type="dxa"/>
-          </w:tcPr>
-          <w:p>
-            <w:pPr>
-              <w:pStyle w:val="tablecolhead"/>
-            </w:pPr>
-            <w:r>
               <w:t>AUROC</w:t>
             </w:r>
           </w:p>
         </w:tc>
         <w:tc>
           <w:tcPr>
-            <w:tcW w:w="1721" w:type="dxa"/>
-          </w:tcPr>
-          <w:p>
-            <w:pPr>
-              <w:pStyle w:val="tablecolhead"/>
-            </w:pPr>
-            <w:r>
+            <w:tcW w:w="720" w:type="dxa"/>
+          </w:tcPr>
+          <w:p>
+            <w:r>
+              <w:rPr>
+                <w:b/>
+              </w:rPr>
               <w:t>AUPRC</w:t>
             </w:r>
           </w:p>
         </w:tc>
         <w:tc>
           <w:tcPr>
-            <w:tcW w:w="1721" w:type="dxa"/>
-          </w:tcPr>
-          <w:p>
-            <w:pPr>
-              <w:pStyle w:val="tablecolhead"/>
-            </w:pPr>
-            <w:r>
+            <w:tcW w:w="720" w:type="dxa"/>
+          </w:tcPr>
+          <w:p>
+            <w:r>
+              <w:rPr>
+                <w:b/>
+              </w:rPr>
               <w:t>Bal. Acc.</w:t>
             </w:r>
           </w:p>
         </w:tc>
         <w:tc>
           <w:tcPr>
-            <w:tcW w:w="1721" w:type="dxa"/>
-          </w:tcPr>
-          <w:p>
-            <w:pPr>
-              <w:pStyle w:val="tablecolhead"/>
-            </w:pPr>
-            <w:r>
+            <w:tcW w:w="810" w:type="dxa"/>
+          </w:tcPr>
+          <w:p>
+            <w:r>
+              <w:rPr>
+                <w:b/>
+              </w:rPr>
               <w:t>Brier</w:t>
             </w:r>
           </w:p>
         </w:tc>
         <w:tc>
           <w:tcPr>
-            <w:tcW w:w="1721" w:type="dxa"/>
-          </w:tcPr>
-          <w:p>
-            <w:pPr>
-              <w:pStyle w:val="tablecolhead"/>
-            </w:pPr>
-            <w:r>
+            <w:tcW w:w="692" w:type="dxa"/>
+          </w:tcPr>
+          <w:p>
+            <w:r>
+              <w:rPr>
+                <w:b/>
+              </w:rPr>
               <w:t>MCC</w:t>
             </w:r>
           </w:p>
@@ -4542,12 +4712,9 @@
         </w:trPr>
         <w:tc>
           <w:tcPr>
-            <w:tcW w:w="1721" w:type="dxa"/>
-          </w:tcPr>
-          <w:p>
-            <w:pPr>
-              <w:pStyle w:val="tablecopy"/>
-            </w:pPr>
+            <w:tcW w:w="1211" w:type="dxa"/>
+          </w:tcPr>
+          <w:p>
             <w:r>
               <w:t>Deduplicated heart.csv</w:t>
             </w:r>
@@ -4555,66 +4722,51 @@
         </w:tc>
         <w:tc>
           <w:tcPr>
-            <w:tcW w:w="1721" w:type="dxa"/>
-          </w:tcPr>
-          <w:p>
-            <w:pPr>
-              <w:pStyle w:val="tablecopy"/>
-            </w:pPr>
-            <w:r>
-              <w:t>0.909</w:t>
-            </w:r>
-          </w:p>
-        </w:tc>
-        <w:tc>
-          <w:tcPr>
-            <w:tcW w:w="1721" w:type="dxa"/>
-          </w:tcPr>
-          <w:p>
-            <w:pPr>
-              <w:pStyle w:val="tablecopy"/>
-            </w:pPr>
-            <w:r>
-              <w:t>0.917</w:t>
-            </w:r>
-          </w:p>
-        </w:tc>
-        <w:tc>
-          <w:tcPr>
-            <w:tcW w:w="1721" w:type="dxa"/>
-          </w:tcPr>
-          <w:p>
-            <w:pPr>
-              <w:pStyle w:val="tablecopy"/>
-            </w:pPr>
-            <w:r>
-              <w:t>0.832</w:t>
-            </w:r>
-          </w:p>
-        </w:tc>
-        <w:tc>
-          <w:tcPr>
-            <w:tcW w:w="1721" w:type="dxa"/>
-          </w:tcPr>
-          <w:p>
-            <w:pPr>
-              <w:pStyle w:val="tablecopy"/>
-            </w:pPr>
-            <w:r>
-              <w:t>0.125</w:t>
-            </w:r>
-          </w:p>
-        </w:tc>
-        <w:tc>
-          <w:tcPr>
-            <w:tcW w:w="1721" w:type="dxa"/>
-          </w:tcPr>
-          <w:p>
-            <w:pPr>
-              <w:pStyle w:val="tablecopy"/>
-            </w:pPr>
-            <w:r>
-              <w:t>0.677</w:t>
+            <w:tcW w:w="764" w:type="dxa"/>
+          </w:tcPr>
+          <w:p>
+            <w:r>
+              <w:t>0.903</w:t>
+            </w:r>
+          </w:p>
+        </w:tc>
+        <w:tc>
+          <w:tcPr>
+            <w:tcW w:w="720" w:type="dxa"/>
+          </w:tcPr>
+          <w:p>
+            <w:r>
+              <w:t>0.912</w:t>
+            </w:r>
+          </w:p>
+        </w:tc>
+        <w:tc>
+          <w:tcPr>
+            <w:tcW w:w="720" w:type="dxa"/>
+          </w:tcPr>
+          <w:p>
+            <w:r>
+              <w:t>0.829</w:t>
+            </w:r>
+          </w:p>
+        </w:tc>
+        <w:tc>
+          <w:tcPr>
+            <w:tcW w:w="810" w:type="dxa"/>
+          </w:tcPr>
+          <w:p>
+            <w:r>
+              <w:t>0.126</w:t>
+            </w:r>
+          </w:p>
+        </w:tc>
+        <w:tc>
+          <w:tcPr>
+            <w:tcW w:w="692" w:type="dxa"/>
+          </w:tcPr>
+          <w:p>
+            <w:r>
+              <w:t>0.666</w:t>
             </w:r>
           </w:p>
         </w:tc>
@@ -4625,12 +4777,9 @@
         </w:trPr>
         <w:tc>
           <w:tcPr>
-            <w:tcW w:w="1721" w:type="dxa"/>
-          </w:tcPr>
-          <w:p>
-            <w:pPr>
-              <w:pStyle w:val="tablecopy"/>
-            </w:pPr>
+            <w:tcW w:w="1211" w:type="dxa"/>
+          </w:tcPr>
+          <w:p>
             <w:r>
               <w:t>Duplicate-expanded heart.csv</w:t>
             </w:r>
@@ -4638,66 +4787,51 @@
         </w:tc>
         <w:tc>
           <w:tcPr>
-            <w:tcW w:w="1721" w:type="dxa"/>
-          </w:tcPr>
-          <w:p>
-            <w:pPr>
-              <w:pStyle w:val="tablecopy"/>
-            </w:pPr>
-            <w:r>
-              <w:t>0.924</w:t>
-            </w:r>
-          </w:p>
-        </w:tc>
-        <w:tc>
-          <w:tcPr>
-            <w:tcW w:w="1721" w:type="dxa"/>
-          </w:tcPr>
-          <w:p>
-            <w:pPr>
-              <w:pStyle w:val="tablecopy"/>
-            </w:pPr>
-            <w:r>
-              <w:t>0.926</w:t>
-            </w:r>
-          </w:p>
-        </w:tc>
-        <w:tc>
-          <w:tcPr>
-            <w:tcW w:w="1721" w:type="dxa"/>
-          </w:tcPr>
-          <w:p>
-            <w:pPr>
-              <w:pStyle w:val="tablecopy"/>
-            </w:pPr>
-            <w:r>
-              <w:t>0.855</w:t>
-            </w:r>
-          </w:p>
-        </w:tc>
-        <w:tc>
-          <w:tcPr>
-            <w:tcW w:w="1721" w:type="dxa"/>
-          </w:tcPr>
-          <w:p>
-            <w:pPr>
-              <w:pStyle w:val="tablecopy"/>
-            </w:pPr>
-            <w:r>
-              <w:t>0.110</w:t>
-            </w:r>
-          </w:p>
-        </w:tc>
-        <w:tc>
-          <w:tcPr>
-            <w:tcW w:w="1721" w:type="dxa"/>
-          </w:tcPr>
-          <w:p>
-            <w:pPr>
-              <w:pStyle w:val="tablecopy"/>
-            </w:pPr>
-            <w:r>
-              <w:t>0.715</w:t>
+            <w:tcW w:w="764" w:type="dxa"/>
+          </w:tcPr>
+          <w:p>
+            <w:r>
+              <w:t>0.955</w:t>
+            </w:r>
+          </w:p>
+        </w:tc>
+        <w:tc>
+          <w:tcPr>
+            <w:tcW w:w="720" w:type="dxa"/>
+          </w:tcPr>
+          <w:p>
+            <w:r>
+              <w:t>0.955</w:t>
+            </w:r>
+          </w:p>
+        </w:tc>
+        <w:tc>
+          <w:tcPr>
+            <w:tcW w:w="720" w:type="dxa"/>
+          </w:tcPr>
+          <w:p>
+            <w:r>
+              <w:t>0.870</w:t>
+            </w:r>
+          </w:p>
+        </w:tc>
+        <w:tc>
+          <w:tcPr>
+            <w:tcW w:w="810" w:type="dxa"/>
+          </w:tcPr>
+          <w:p>
+            <w:r>
+              <w:t>0.086</w:t>
+            </w:r>
+          </w:p>
+        </w:tc>
+        <w:tc>
+          <w:tcPr>
+            <w:tcW w:w="692" w:type="dxa"/>
+          </w:tcPr>
+          <w:p>
+            <w:r>
+              <w:t>0.742</w:t>
             </w:r>
           </w:p>
         </w:tc>
@@ -4724,7 +4858,7 @@
         <w:pStyle w:val="BodyText"/>
       </w:pPr>
       <w:r>
-        <w:t>The selected model is penalized logistic regression because it is competitive, calibrated more favorably than the alternatives, stable enough across the available centers, and easier to explain. Future work should evaluate the model on newer prospective cohorts, add stronger clinical baselines, improve calibration by site, examine fairness across patient subgroups, and validate the user interface with clinical stakeholders. Until then, the project should be described as a reproducible educational benchmark and research prototype, not as a clinical diagnostic system.</w:t>
+        <w:t>The selected model is calibrated gradient boosting because it is competitive across discrimination, has the best mean Brier score, provides strong pooled held-out-center performance, and remains deployable with probability calibration and post-hoc explanation artifacts. Future work should evaluate the model on newer prospective cohorts, add stronger clinical baselines, improve calibration by site, examine fairness across patient subgroups, and validate the user interface with clinical stakeholders. Until then, the project should be described as a reproducible educational benchmark and research prototype, not as a clinical diagnostic system.</w:t>
       </w:r>
     </w:p>
     <w:p>
@@ -4836,10 +4970,7 @@
         <w:pStyle w:val="references"/>
       </w:pPr>
       <w:r>
-        <w:t xml:space="preserve">K. G. M. Moons et al., "PROBAST+AI: an updated quality, risk of bias, and applicability assessment tool for prediction models using </w:t>
-      </w:r>
-      <w:r>
-        <w:t>regression or artificial intelligence methods," BMJ, vol. 388, e082505, 2025.</w:t>
+        <w:t>K. G. M. Moons et al., "PROBAST+AI: an updated quality, risk of bias, and applicability assessment tool for prediction models using regression or artificial intelligence methods," BMJ, vol. 388, e082505, 2025.</w:t>
       </w:r>
     </w:p>
     <w:p>
@@ -4861,7 +4992,7 @@
     <w:sectPr>
       <w:type w:val="continuous"/>
       <w:pgSz w:w="11909" w:h="16834"/>
-      <w:pgMar w:top="1008" w:right="1008" w:bottom="1008" w:left="1008" w:header="720" w:footer="720" w:gutter="0"/>
+      <w:pgMar w:top="1080" w:right="907" w:bottom="1440" w:left="907" w:header="720" w:footer="720" w:gutter="0"/>
       <w:cols w:num="2" w:space="240"/>
       <w:docGrid w:linePitch="360"/>
     </w:sectPr>
@@ -6566,7 +6697,6 @@
   <w:style w:type="character" w:default="1" w:styleId="DefaultParagraphFont">
     <w:name w:val="Default Paragraph Font"/>
     <w:uiPriority w:val="1"/>
-    <w:semiHidden/>
     <w:unhideWhenUsed/>
   </w:style>
   <w:style w:type="table" w:default="1" w:styleId="TableNormal">

</xml_diff>